<commit_message>
[Update] Word 2.1.1 - 2.1.4 - 2.2.2
</commit_message>
<xml_diff>
--- a/Nhom07_BaoCao.docx
+++ b/Nhom07_BaoCao.docx
@@ -2104,6 +2104,7 @@
       <w:bookmarkStart w:id="3" w:name="_Toc225587120"/>
       <w:bookmarkStart w:id="4" w:name="_Toc225588751"/>
       <w:r>
+        <w:lastRenderedPageBreak/>
         <w:t>LỜI MỞ ĐẦU</w:t>
       </w:r>
       <w:bookmarkEnd w:id="3"/>
@@ -2138,6 +2139,7 @@
       </w:pPr>
       <w:bookmarkStart w:id="5" w:name="_Toc225588752"/>
       <w:r>
+        <w:lastRenderedPageBreak/>
         <w:t>CHƯƠNG 1: GIỚI THIỆU ĐỀ TÀI</w:t>
       </w:r>
       <w:bookmarkEnd w:id="5"/>
@@ -2284,7 +2286,14 @@
         <w:rPr>
           <w:lang w:val="vi-VN"/>
         </w:rPr>
-        <w:t>Thứ hai, thiết lập cơ chế quản lý thu chi minh bạch: Thay vì quản lý bằng trí nhớ vốn nhiều sai số, ứng dụng sẽ cung cấp các báo cáo trực quan, giúp cá nhân nắm rõ tỷ trọng giữa thu nhập và chi tiêu. Sự rõ ràng này không chỉ giúp tối ưu hóa số dư khả dụng mà còn tạo tiền đề cho việc thiết lập các mục tiêu tài chính dài hạn như tiết kiệm, đầu tư hay dự phòng rủi ro.</w:t>
+        <w:t xml:space="preserve">Thứ hai, thiết lập cơ chế quản lý thu chi minh bạch: Thay vì quản lý bằng trí nhớ vốn nhiều sai số, ứng dụng sẽ cung cấp các báo cáo trực quan, giúp cá nhân nắm rõ tỷ trọng giữa thu nhập và chi tiêu. Sự rõ ràng này không chỉ giúp tối ưu hóa </w:t>
+      </w:r>
+      <w:r>
+        <w:rPr>
+          <w:lang w:val="vi-VN"/>
+        </w:rPr>
+        <w:lastRenderedPageBreak/>
+        <w:t>số dư khả dụng mà còn tạo tiền đề cho việc thiết lập các mục tiêu tài chính dài hạn như tiết kiệm, đầu tư hay dự phòng rủi ro.</w:t>
       </w:r>
     </w:p>
     <w:p>
@@ -2374,6 +2383,7 @@
         <w:pStyle w:val="Heading2"/>
       </w:pPr>
       <w:r>
+        <w:lastRenderedPageBreak/>
         <w:t>1.3</w:t>
       </w:r>
       <w:r>
@@ -2437,246 +2447,900 @@
     <w:p>
       <w:pPr>
         <w:pStyle w:val="Heading3"/>
-        <w:rPr>
-          <w:b w:val="0"/>
+      </w:pPr>
+      <w:r>
+        <w:t>2</w:t>
+      </w:r>
+      <w:r>
+        <w:t>.1</w:t>
+      </w:r>
+      <w:r>
+        <w:t>.1</w:t>
+      </w:r>
+      <w:r>
+        <w:t xml:space="preserve">. </w:t>
+      </w:r>
+      <w:r>
+        <w:t>Trang tổng quan</w:t>
+      </w:r>
+    </w:p>
+    <w:p>
+      <w:pPr>
+        <w:ind w:firstLine="284"/>
+        <w:rPr>
+          <w:lang w:val="vi-VN"/>
+        </w:rPr>
+      </w:pPr>
+      <w:r>
+        <w:rPr>
+          <w:lang w:val="vi-VN"/>
+        </w:rPr>
+        <w:t>Module này đóng vai trò là trung tâm tổng hợp, cung cấp cái nhìn toàn cảnh về tình hình tài chính của người dùng.</w:t>
+      </w:r>
+    </w:p>
+    <w:p>
+      <w:pPr>
+        <w:numPr>
+          <w:ilvl w:val="0"/>
+          <w:numId w:val="5"/>
+        </w:numPr>
+        <w:tabs>
+          <w:tab w:val="clear" w:pos="720"/>
+        </w:tabs>
+        <w:ind w:left="567" w:hanging="207"/>
+        <w:rPr>
+          <w:lang w:val="vi-VN"/>
+        </w:rPr>
+      </w:pPr>
+      <w:r>
+        <w:rPr>
+          <w:b/>
           <w:bCs/>
-        </w:rPr>
-      </w:pPr>
-      <w:r>
-        <w:rPr>
-          <w:b w:val="0"/>
+          <w:lang w:val="vi-VN"/>
+        </w:rPr>
+        <w:t>Thống kê chi tiêu tháng:</w:t>
+      </w:r>
+      <w:r>
+        <w:rPr>
+          <w:lang w:val="vi-VN"/>
+        </w:rPr>
+        <w:t xml:space="preserve"> Hiển thị tổng số tiền đã chi tiêu trong kỳ (tháng). Đặc biệt, hệ thống cần tính toán và hiển thị tỷ lệ phần trăm thay đổi (tăng hoặc giảm) so với tháng trước để người dùng đánh giá mức độ tiêu dùng.</w:t>
+      </w:r>
+    </w:p>
+    <w:p>
+      <w:pPr>
+        <w:numPr>
+          <w:ilvl w:val="0"/>
+          <w:numId w:val="5"/>
+        </w:numPr>
+        <w:rPr>
+          <w:lang w:val="vi-VN"/>
+        </w:rPr>
+      </w:pPr>
+      <w:r>
+        <w:rPr>
+          <w:b/>
           <w:bCs/>
-        </w:rPr>
+          <w:lang w:val="vi-VN"/>
+        </w:rPr>
+        <w:lastRenderedPageBreak/>
+        <w:t>Thống kê Dòng tiền:</w:t>
+      </w:r>
+      <w:r>
+        <w:rPr>
+          <w:lang w:val="vi-VN"/>
+        </w:rPr>
+        <w:t xml:space="preserve"> Trực quan hóa bức tranh tài chính thông qua một bảng tổng kết bao gồm:</w:t>
+      </w:r>
+    </w:p>
+    <w:p>
+      <w:pPr>
+        <w:numPr>
+          <w:ilvl w:val="1"/>
+          <w:numId w:val="5"/>
+        </w:numPr>
+        <w:tabs>
+          <w:tab w:val="num" w:pos="1440"/>
+        </w:tabs>
+        <w:rPr>
+          <w:lang w:val="vi-VN"/>
+        </w:rPr>
+      </w:pPr>
+      <w:r>
+        <w:rPr>
+          <w:lang w:val="vi-VN"/>
+        </w:rPr>
+        <w:t>Tổng số dư hiện tại (Total Balance).</w:t>
+      </w:r>
+    </w:p>
+    <w:p>
+      <w:pPr>
+        <w:numPr>
+          <w:ilvl w:val="1"/>
+          <w:numId w:val="5"/>
+        </w:numPr>
+        <w:tabs>
+          <w:tab w:val="num" w:pos="1440"/>
+        </w:tabs>
+        <w:rPr>
+          <w:lang w:val="vi-VN"/>
+        </w:rPr>
+      </w:pPr>
+      <w:r>
+        <w:rPr>
+          <w:lang w:val="vi-VN"/>
+        </w:rPr>
+        <w:t>Tổng thu nhập (Income) mang biểu tượng mũi tên đi lên.</w:t>
+      </w:r>
+    </w:p>
+    <w:p>
+      <w:pPr>
+        <w:numPr>
+          <w:ilvl w:val="1"/>
+          <w:numId w:val="5"/>
+        </w:numPr>
+        <w:tabs>
+          <w:tab w:val="num" w:pos="1440"/>
+        </w:tabs>
+        <w:rPr>
+          <w:lang w:val="vi-VN"/>
+        </w:rPr>
+      </w:pPr>
+      <w:r>
+        <w:rPr>
+          <w:lang w:val="vi-VN"/>
+        </w:rPr>
+        <w:t>Tổng chi phí (Expenses) mang biểu tượng mũi tên đi xuống.</w:t>
+      </w:r>
+    </w:p>
+    <w:p>
+      <w:pPr>
+        <w:numPr>
+          <w:ilvl w:val="1"/>
+          <w:numId w:val="5"/>
+        </w:numPr>
+        <w:tabs>
+          <w:tab w:val="num" w:pos="1440"/>
+        </w:tabs>
+        <w:rPr>
+          <w:lang w:val="vi-VN"/>
+        </w:rPr>
+      </w:pPr>
+      <w:r>
+        <w:rPr>
+          <w:lang w:val="vi-VN"/>
+        </w:rPr>
+        <w:t>Số dư ròng (Net Balance) sau khi đối trừ thu và chi.</w:t>
+      </w:r>
+    </w:p>
+    <w:p>
+      <w:pPr>
+        <w:numPr>
+          <w:ilvl w:val="0"/>
+          <w:numId w:val="5"/>
+        </w:numPr>
+        <w:rPr>
+          <w:lang w:val="vi-VN"/>
+        </w:rPr>
+      </w:pPr>
+      <w:r>
+        <w:rPr>
+          <w:b/>
+          <w:bCs/>
+          <w:lang w:val="vi-VN"/>
+        </w:rPr>
+        <w:t>Giao dịch gần nhất:</w:t>
+      </w:r>
+      <w:r>
+        <w:rPr>
+          <w:lang w:val="vi-VN"/>
+        </w:rPr>
+        <w:t xml:space="preserve"> Hiển thị danh sách các giao dịch mới phát sinh để người dùng kiểm tra nhanh. Mỗi bản ghi giao dịch cần hiển thị:</w:t>
+      </w:r>
+    </w:p>
+    <w:p>
+      <w:pPr>
+        <w:numPr>
+          <w:ilvl w:val="1"/>
+          <w:numId w:val="5"/>
+        </w:numPr>
+        <w:tabs>
+          <w:tab w:val="num" w:pos="1440"/>
+        </w:tabs>
+        <w:rPr>
+          <w:lang w:val="vi-VN"/>
+        </w:rPr>
+      </w:pPr>
+      <w:r>
+        <w:rPr>
+          <w:lang w:val="vi-VN"/>
+        </w:rPr>
+        <w:t>Ghi chú mục đích giao dịch (ví dụ: Ăn trưa).</w:t>
+      </w:r>
+    </w:p>
+    <w:p>
+      <w:pPr>
+        <w:numPr>
+          <w:ilvl w:val="1"/>
+          <w:numId w:val="5"/>
+        </w:numPr>
+        <w:tabs>
+          <w:tab w:val="num" w:pos="1440"/>
+        </w:tabs>
+        <w:rPr>
+          <w:lang w:val="vi-VN"/>
+        </w:rPr>
+      </w:pPr>
+      <w:r>
+        <w:rPr>
+          <w:lang w:val="vi-VN"/>
+        </w:rPr>
+        <w:t>Nguồn tiền được sử dụng cho giao dịch (ví dụ: Ví tiền mặt).</w:t>
+      </w:r>
+    </w:p>
+    <w:p>
+      <w:pPr>
+        <w:numPr>
+          <w:ilvl w:val="1"/>
+          <w:numId w:val="5"/>
+        </w:numPr>
+        <w:tabs>
+          <w:tab w:val="num" w:pos="1440"/>
+        </w:tabs>
+        <w:rPr>
+          <w:lang w:val="vi-VN"/>
+        </w:rPr>
+      </w:pPr>
+      <w:r>
+        <w:rPr>
+          <w:lang w:val="vi-VN"/>
+        </w:rPr>
+        <w:t>Số tiền giao dịch.</w:t>
+      </w:r>
+    </w:p>
+    <w:p>
+      <w:pPr>
+        <w:numPr>
+          <w:ilvl w:val="0"/>
+          <w:numId w:val="5"/>
+        </w:numPr>
+        <w:rPr>
+          <w:lang w:val="vi-VN"/>
+        </w:rPr>
+      </w:pPr>
+      <w:r>
+        <w:rPr>
+          <w:b/>
+          <w:bCs/>
+          <w:lang w:val="vi-VN"/>
+        </w:rPr>
+        <w:t>Điều hướng toàn bộ giao dịch:</w:t>
+      </w:r>
+      <w:r>
+        <w:rPr>
+          <w:lang w:val="vi-VN"/>
+        </w:rPr>
+        <w:t xml:space="preserve"> Cung cấp phím tắt "Xem tất cả" để chuyển hướng người dùng sang màn hình xem chi tiết lịch sử toàn bộ các giao dịch</w:t>
+      </w:r>
+    </w:p>
+    <w:p>
+      <w:pPr>
+        <w:pStyle w:val="Heading3"/>
+      </w:pPr>
+      <w:r>
         <w:t>2</w:t>
       </w:r>
       <w:r>
-        <w:rPr>
-          <w:b w:val="0"/>
+        <w:t>.</w:t>
+      </w:r>
+      <w:r>
+        <w:t>1.2</w:t>
+      </w:r>
+      <w:r>
+        <w:t>. Quản lý giao dịch</w:t>
+      </w:r>
+    </w:p>
+    <w:p>
+      <w:pPr>
+        <w:pStyle w:val="Heading3"/>
+      </w:pPr>
+      <w:r>
+        <w:t>2.</w:t>
+      </w:r>
+      <w:r>
+        <w:t>1.3</w:t>
+      </w:r>
+      <w:r>
+        <w:t>. Quản lý ngân sách</w:t>
+      </w:r>
+    </w:p>
+    <w:p>
+      <w:pPr>
+        <w:pStyle w:val="Heading3"/>
+      </w:pPr>
+      <w:r>
+        <w:t>2.</w:t>
+      </w:r>
+      <w:r>
+        <w:t>1.4</w:t>
+      </w:r>
+      <w:r>
+        <w:t>. Quản lý tài khoả</w:t>
+      </w:r>
+      <w:r>
+        <w:t>n</w:t>
+      </w:r>
+    </w:p>
+    <w:p>
+      <w:pPr>
+        <w:rPr>
+          <w:lang w:val="vi-VN"/>
+        </w:rPr>
+      </w:pPr>
+      <w:r>
+        <w:t>M</w:t>
+      </w:r>
+      <w:r>
+        <w:t>odule này cho phép người dùng quản lý các nơi lưu trữ tiền của mình (ví dụ: Ví tiền mặt, Thẻ ngân hàng).</w:t>
+      </w:r>
+    </w:p>
+    <w:p>
+      <w:pPr>
+        <w:pStyle w:val="ListParagraph"/>
+        <w:numPr>
+          <w:ilvl w:val="0"/>
+          <w:numId w:val="13"/>
+        </w:numPr>
+      </w:pPr>
+      <w:r>
+        <w:rPr>
+          <w:rStyle w:val="citation-75"/>
+          <w:rFonts w:asciiTheme="majorHAnsi" w:hAnsiTheme="majorHAnsi" w:cstheme="majorHAnsi"/>
+          <w:b/>
           <w:bCs/>
-        </w:rPr>
-        <w:t>.1</w:t>
-      </w:r>
-      <w:r>
-        <w:rPr>
-          <w:b w:val="0"/>
+          <w:szCs w:val="26"/>
+        </w:rPr>
+        <w:t>Xem Tổng số dư (Total Balance):</w:t>
+      </w:r>
+      <w:r>
+        <w:rPr>
+          <w:rStyle w:val="citation-75"/>
+          <w:rFonts w:asciiTheme="majorHAnsi" w:hAnsiTheme="majorHAnsi" w:cstheme="majorHAnsi"/>
+          <w:szCs w:val="26"/>
+        </w:rPr>
+        <w:t xml:space="preserve"> Hệ thống cần tổng hợp và hiển thị tổng số tiền từ tất cả các nguồn tiền hiện có</w:t>
+      </w:r>
+      <w:r>
+        <w:t xml:space="preserve">. </w:t>
+      </w:r>
+      <w:r>
+        <w:rPr>
+          <w:rStyle w:val="citation-74"/>
+          <w:rFonts w:asciiTheme="majorHAnsi" w:hAnsiTheme="majorHAnsi" w:cstheme="majorHAnsi"/>
+          <w:szCs w:val="26"/>
+        </w:rPr>
+        <w:t>Người dùng có thể sử dụng nút chức năng (biểu tượng con mắt) để ẩn hoặc hiện số dư này, đảm bảo tính riêng tư</w:t>
+      </w:r>
+      <w:r>
+        <w:t>.</w:t>
+      </w:r>
+    </w:p>
+    <w:p>
+      <w:pPr>
+        <w:pStyle w:val="ListParagraph"/>
+        <w:numPr>
+          <w:ilvl w:val="0"/>
+          <w:numId w:val="13"/>
+        </w:numPr>
+      </w:pPr>
+      <w:r>
+        <w:rPr>
+          <w:rStyle w:val="citation-73"/>
+          <w:rFonts w:asciiTheme="majorHAnsi" w:hAnsiTheme="majorHAnsi" w:cstheme="majorHAnsi"/>
+          <w:b/>
           <w:bCs/>
-        </w:rPr>
-        <w:t>.1</w:t>
-      </w:r>
-      <w:r>
-        <w:rPr>
-          <w:b w:val="0"/>
+          <w:szCs w:val="26"/>
+        </w:rPr>
+        <w:t>Danh sách Nguồn tiền:</w:t>
+      </w:r>
+      <w:r>
+        <w:rPr>
+          <w:rStyle w:val="citation-73"/>
+          <w:rFonts w:asciiTheme="majorHAnsi" w:hAnsiTheme="majorHAnsi" w:cstheme="majorHAnsi"/>
+          <w:szCs w:val="26"/>
+        </w:rPr>
+        <w:t xml:space="preserve"> Hệ thống phải hiển thị danh sách các tài khoản dưới dạng danh sách cuộn</w:t>
+      </w:r>
+      <w:r>
+        <w:t>. Đối với mỗi tài khoản, hệ thống cung cấp các thông tin trực quan:</w:t>
+      </w:r>
+    </w:p>
+    <w:p>
+      <w:pPr>
+        <w:pStyle w:val="ListParagraph"/>
+        <w:numPr>
+          <w:ilvl w:val="0"/>
+          <w:numId w:val="14"/>
+        </w:numPr>
+        <w:ind w:left="1418"/>
+      </w:pPr>
+      <w:r>
+        <w:rPr>
+          <w:rStyle w:val="citation-72"/>
+          <w:rFonts w:asciiTheme="majorHAnsi" w:hAnsiTheme="majorHAnsi" w:cstheme="majorHAnsi"/>
+          <w:szCs w:val="26"/>
+        </w:rPr>
+        <w:t>Biểu tượng (Icon) và màu sắc nền nhận diện của tài khoản</w:t>
+      </w:r>
+      <w:r>
+        <w:t>.</w:t>
+      </w:r>
+    </w:p>
+    <w:p>
+      <w:pPr>
+        <w:pStyle w:val="ListParagraph"/>
+        <w:numPr>
+          <w:ilvl w:val="0"/>
+          <w:numId w:val="14"/>
+        </w:numPr>
+        <w:ind w:left="1418"/>
+      </w:pPr>
+      <w:r>
+        <w:rPr>
+          <w:rStyle w:val="citation-71"/>
+          <w:rFonts w:asciiTheme="majorHAnsi" w:hAnsiTheme="majorHAnsi" w:cstheme="majorHAnsi"/>
+          <w:szCs w:val="26"/>
+        </w:rPr>
+        <w:t>Tên tài khoản (Account Name) và Phân loại tài khoản (Account Type)</w:t>
+      </w:r>
+      <w:r>
+        <w:t>.</w:t>
+      </w:r>
+    </w:p>
+    <w:p>
+      <w:pPr>
+        <w:pStyle w:val="ListParagraph"/>
+        <w:numPr>
+          <w:ilvl w:val="0"/>
+          <w:numId w:val="14"/>
+        </w:numPr>
+        <w:ind w:left="1418"/>
+      </w:pPr>
+      <w:r>
+        <w:rPr>
+          <w:rStyle w:val="citation-70"/>
+          <w:rFonts w:asciiTheme="majorHAnsi" w:hAnsiTheme="majorHAnsi" w:cstheme="majorHAnsi"/>
+          <w:szCs w:val="26"/>
+        </w:rPr>
+        <w:t>Số dư hiện tại của tài khoản đó</w:t>
+      </w:r>
+      <w:r>
+        <w:t>.</w:t>
+      </w:r>
+    </w:p>
+    <w:p>
+      <w:pPr>
+        <w:pStyle w:val="ListParagraph"/>
+        <w:numPr>
+          <w:ilvl w:val="0"/>
+          <w:numId w:val="13"/>
+        </w:numPr>
+        <w:rPr>
+          <w:rFonts w:asciiTheme="majorHAnsi" w:hAnsiTheme="majorHAnsi" w:cstheme="majorHAnsi"/>
+        </w:rPr>
+      </w:pPr>
+      <w:r>
+        <w:rPr>
+          <w:rStyle w:val="citation-69"/>
+          <w:rFonts w:asciiTheme="majorHAnsi" w:hAnsiTheme="majorHAnsi" w:cstheme="majorHAnsi"/>
+          <w:b/>
           <w:bCs/>
-        </w:rPr>
-        <w:t xml:space="preserve">. </w:t>
-      </w:r>
-      <w:r>
-        <w:rPr>
-          <w:b w:val="0"/>
+          <w:szCs w:val="26"/>
+        </w:rPr>
+        <w:t>Thêm mới Nguồn tiền:</w:t>
+      </w:r>
+      <w:r>
+        <w:rPr>
+          <w:rStyle w:val="citation-69"/>
+          <w:rFonts w:asciiTheme="majorHAnsi" w:hAnsiTheme="majorHAnsi" w:cstheme="majorHAnsi"/>
+          <w:szCs w:val="26"/>
+        </w:rPr>
+        <w:t xml:space="preserve"> Cung cấp nút thao tác nhanh (nút "+") ở góc màn hình để mở hộp thoại thêm tài khoản mới</w:t>
+      </w:r>
+      <w:r>
+        <w:rPr>
+          <w:rFonts w:asciiTheme="majorHAnsi" w:hAnsiTheme="majorHAnsi" w:cstheme="majorHAnsi"/>
+        </w:rPr>
+        <w:t xml:space="preserve">. Dữ liệu này sẽ được ánh xạ và lưu vào bảng </w:t>
+      </w:r>
+      <w:r>
+        <w:rPr>
+          <w:rStyle w:val="HTMLCode"/>
+          <w:rFonts w:asciiTheme="majorHAnsi" w:eastAsiaTheme="minorHAnsi" w:hAnsiTheme="majorHAnsi" w:cstheme="majorHAnsi"/>
+          <w:sz w:val="26"/>
+          <w:szCs w:val="26"/>
+        </w:rPr>
+        <w:t>NGUONTIEN</w:t>
+      </w:r>
+      <w:r>
+        <w:rPr>
+          <w:rFonts w:asciiTheme="majorHAnsi" w:hAnsiTheme="majorHAnsi" w:cstheme="majorHAnsi"/>
+        </w:rPr>
+        <w:t xml:space="preserve"> trong cơ sở dữ liệu với các trường: Mã nguồn tiền, Tên nguồn tiền và Số dư ban đầu.</w:t>
+      </w:r>
+    </w:p>
+    <w:p>
+      <w:pPr>
+        <w:pStyle w:val="ListParagraph"/>
+        <w:numPr>
+          <w:ilvl w:val="0"/>
+          <w:numId w:val="13"/>
+        </w:numPr>
+        <w:rPr>
+          <w:rStyle w:val="citation-68"/>
+          <w:rFonts w:asciiTheme="majorHAnsi" w:hAnsiTheme="majorHAnsi" w:cstheme="majorHAnsi"/>
+        </w:rPr>
+      </w:pPr>
+      <w:r>
+        <w:rPr>
+          <w:rStyle w:val="citation-68"/>
+          <w:rFonts w:asciiTheme="majorHAnsi" w:hAnsiTheme="majorHAnsi" w:cstheme="majorHAnsi"/>
+          <w:b/>
           <w:bCs/>
-        </w:rPr>
-        <w:t>Trang tổng quan</w:t>
-      </w:r>
+          <w:szCs w:val="26"/>
+        </w:rPr>
+        <w:t>Chỉnh sửa thông tin:</w:t>
+      </w:r>
+      <w:r>
+        <w:rPr>
+          <w:rStyle w:val="citation-68"/>
+          <w:rFonts w:asciiTheme="majorHAnsi" w:hAnsiTheme="majorHAnsi" w:cstheme="majorHAnsi"/>
+          <w:szCs w:val="26"/>
+        </w:rPr>
+        <w:t xml:space="preserve"> Cho phép người dùng nhấp (click) vào một vùng tài khoản bất kỳ trong danh sách để kích hoạt lệnh chỉnh sửa (Edit Account Command) thông tin tài khoản đ</w:t>
+      </w:r>
+      <w:r>
+        <w:rPr>
+          <w:rStyle w:val="citation-68"/>
+          <w:rFonts w:asciiTheme="majorHAnsi" w:eastAsiaTheme="majorEastAsia" w:hAnsiTheme="majorHAnsi" w:cstheme="majorHAnsi"/>
+          <w:szCs w:val="26"/>
+        </w:rPr>
+        <w:t>ó</w:t>
+      </w:r>
+    </w:p>
+    <w:p>
+      <w:pPr>
+        <w:jc w:val="center"/>
+      </w:pPr>
     </w:p>
     <w:p>
       <w:pPr>
         <w:pStyle w:val="Heading3"/>
-        <w:rPr>
-          <w:b w:val="0"/>
-          <w:bCs/>
-        </w:rPr>
-      </w:pPr>
-      <w:r>
-        <w:rPr>
-          <w:b w:val="0"/>
-          <w:bCs/>
-        </w:rPr>
+      </w:pPr>
+      <w:r>
+        <w:t>2.</w:t>
+      </w:r>
+      <w:r>
+        <w:t>1.5</w:t>
+      </w:r>
+      <w:r>
+        <w:t>. Quản lý danh mục</w:t>
+      </w:r>
+    </w:p>
+    <w:p>
+      <w:pPr>
+        <w:pStyle w:val="Heading2"/>
+      </w:pPr>
+      <w:r>
         <w:t>2</w:t>
       </w:r>
       <w:r>
-        <w:rPr>
-          <w:b w:val="0"/>
-          <w:bCs/>
-        </w:rPr>
-        <w:t>.</w:t>
-      </w:r>
-      <w:r>
-        <w:rPr>
-          <w:b w:val="0"/>
-          <w:bCs/>
-        </w:rPr>
-        <w:t>1.2</w:t>
-      </w:r>
-      <w:r>
-        <w:rPr>
-          <w:b w:val="0"/>
-          <w:bCs/>
-        </w:rPr>
-        <w:t>. Quản lý giao dịch</w:t>
+        <w:t>.2. Phân tích yêu cầu phi chức năng</w:t>
       </w:r>
     </w:p>
     <w:p>
       <w:pPr>
         <w:pStyle w:val="Heading3"/>
-        <w:rPr>
-          <w:b w:val="0"/>
-          <w:bCs/>
-        </w:rPr>
-      </w:pPr>
-      <w:r>
-        <w:rPr>
-          <w:b w:val="0"/>
-          <w:bCs/>
-        </w:rPr>
-        <w:t>2.</w:t>
-      </w:r>
-      <w:r>
-        <w:rPr>
-          <w:b w:val="0"/>
-          <w:bCs/>
-        </w:rPr>
-        <w:t>1.3</w:t>
-      </w:r>
-      <w:r>
-        <w:rPr>
-          <w:b w:val="0"/>
-          <w:bCs/>
-        </w:rPr>
-        <w:t>. Quản lý ngân sách</w:t>
+      </w:pPr>
+      <w:r>
+        <w:t>2.2.1. Hiệu năng</w:t>
       </w:r>
     </w:p>
     <w:p>
       <w:pPr>
         <w:pStyle w:val="Heading3"/>
-        <w:rPr>
-          <w:b w:val="0"/>
-          <w:bCs/>
-        </w:rPr>
-      </w:pPr>
-      <w:r>
-        <w:rPr>
-          <w:b w:val="0"/>
-          <w:bCs/>
-        </w:rPr>
-        <w:t>2.</w:t>
-      </w:r>
-      <w:r>
-        <w:rPr>
-          <w:b w:val="0"/>
-          <w:bCs/>
-        </w:rPr>
-        <w:t>1.4</w:t>
-      </w:r>
-      <w:r>
-        <w:rPr>
-          <w:b w:val="0"/>
-          <w:bCs/>
-        </w:rPr>
-        <w:t>. Quản lý tài khoản</w:t>
+      </w:pPr>
+      <w:r>
+        <w:t>2.2.2. Khả dụng và trải nghiệm người dùng</w:t>
+      </w:r>
+    </w:p>
+    <w:p>
+      <w:pPr>
+        <w:pStyle w:val="Heading4"/>
+      </w:pPr>
+      <w:r>
+        <w:t>2.2.2.1. Tính khả dụng</w:t>
+      </w:r>
+    </w:p>
+    <w:p>
+      <w:pPr>
+        <w:ind w:firstLine="284"/>
+        <w:rPr>
+          <w:lang w:val="vi-VN"/>
+        </w:rPr>
+      </w:pPr>
+      <w:r>
+        <w:rPr>
+          <w:lang w:val="vi-VN"/>
+        </w:rPr>
+        <w:t>Ứng dụng được thiết kế tối ưu hóa các thao tác điều hướng và tương tác cơ bản của người dùng. Các tính năng cốt lõi được sắp xếp trực quan trên giao diện giúp giảm thiểu thời gian làm quen và đơn giản hóa việc thực hiện các tác vụ quản lý tài chính hàng ngày.</w:t>
+      </w:r>
+    </w:p>
+    <w:p>
+      <w:pPr>
+        <w:ind w:firstLine="284"/>
+        <w:rPr>
+          <w:lang w:val="vi-VN"/>
+        </w:rPr>
+      </w:pPr>
+      <w:r>
+        <w:rPr>
+          <w:lang w:val="vi-VN"/>
+        </w:rPr>
+        <w:t xml:space="preserve">Tính riêng tư và khả năng truy cập thông tin nhanh chóng được đặt lên hàng đầu. Người dùng có quyền kiểm soát linh hoạt việc hiển thị các dữ liệu nhạy cảm về số dư, </w:t>
+      </w:r>
+      <w:r>
+        <w:rPr>
+          <w:lang w:val="vi-VN"/>
+        </w:rPr>
+        <w:lastRenderedPageBreak/>
+        <w:t>đồng thời hệ thống luôn cung cấp các tín hiệu nhận biết rõ ràng tại những vùng có thể tương tác trên màn hình.</w:t>
+      </w:r>
+    </w:p>
+    <w:p>
+      <w:pPr>
+        <w:numPr>
+          <w:ilvl w:val="0"/>
+          <w:numId w:val="15"/>
+        </w:numPr>
+        <w:ind w:hanging="294"/>
+        <w:rPr>
+          <w:lang w:val="vi-VN"/>
+        </w:rPr>
+      </w:pPr>
+      <w:r>
+        <w:rPr>
+          <w:lang w:val="vi-VN"/>
+        </w:rPr>
+        <w:t>Tích hợp nút thao tác nhanh (dạng Floating Action Button) mang biểu tượng dấu "+" đặt ở góc phải bên dưới màn hình, hỗ trợ người dùng truy cập nhanh vào biểu mẫu thêm nguồn tiền mới.</w:t>
+      </w:r>
+    </w:p>
+    <w:p>
+      <w:pPr>
+        <w:numPr>
+          <w:ilvl w:val="0"/>
+          <w:numId w:val="15"/>
+        </w:numPr>
+        <w:ind w:hanging="294"/>
+        <w:rPr>
+          <w:lang w:val="vi-VN"/>
+        </w:rPr>
+      </w:pPr>
+      <w:r>
+        <w:rPr>
+          <w:lang w:val="vi-VN"/>
+        </w:rPr>
+        <w:t>Hỗ trợ tính năng ẩn/hiện tổng số dư thông qua biểu tượng "</w:t>
+      </w:r>
+      <w:r>
+        <w:rPr>
+          <w:rFonts w:ascii="Segoe UI Symbol" w:hAnsi="Segoe UI Symbol" w:cs="Segoe UI Symbol"/>
+          <w:lang w:val="vi-VN"/>
+        </w:rPr>
+        <w:t>👁</w:t>
+      </w:r>
+      <w:r>
+        <w:rPr>
+          <w:lang w:val="vi-VN"/>
+        </w:rPr>
+        <w:t>", giúp bảo vệ quyền riêng tư của người dùng ở nơi đông người.</w:t>
+      </w:r>
+    </w:p>
+    <w:p>
+      <w:pPr>
+        <w:numPr>
+          <w:ilvl w:val="0"/>
+          <w:numId w:val="15"/>
+        </w:numPr>
+        <w:ind w:hanging="294"/>
+        <w:rPr>
+          <w:lang w:val="vi-VN"/>
+        </w:rPr>
+      </w:pPr>
+      <w:r>
+        <w:rPr>
+          <w:lang w:val="vi-VN"/>
+        </w:rPr>
+        <w:t>Sử dụng con trỏ chuột hình bàn tay (Cursor="Hand") trên các nút bấm và các thẻ danh mục tài khoản để báo hiệu rõ ràng khả năng nhấp chuột và tương tác lệnh.</w:t>
+      </w:r>
+    </w:p>
+    <w:p>
+      <w:pPr>
+        <w:numPr>
+          <w:ilvl w:val="0"/>
+          <w:numId w:val="15"/>
+        </w:numPr>
+        <w:ind w:hanging="294"/>
+        <w:rPr>
+          <w:lang w:val="vi-VN"/>
+        </w:rPr>
+      </w:pPr>
+      <w:r>
+        <w:rPr>
+          <w:lang w:val="vi-VN"/>
+        </w:rPr>
+        <w:t>Các danh sách hiển thị dài được cấu hình cuộn mượt mà với thanh cuộn được ẩn đi (VerticalScrollBarVisibility="Hidden"), giúp tối ưu hóa không gian hiển thị của ứng dụng.</w:t>
+      </w:r>
+    </w:p>
+    <w:p>
+      <w:pPr>
+        <w:numPr>
+          <w:ilvl w:val="0"/>
+          <w:numId w:val="15"/>
+        </w:numPr>
+        <w:ind w:hanging="294"/>
+        <w:rPr>
+          <w:lang w:val="vi-VN"/>
+        </w:rPr>
+      </w:pPr>
+      <w:r>
+        <w:rPr>
+          <w:lang w:val="vi-VN"/>
+        </w:rPr>
+        <w:t>Tích hợp nút chức năng điều hướng "Xem tất cả" để người dùng có thể chuyển hướng nhanh chóng từ bảng điều khiển tổng quan sang danh sách lịch sử giao dịch chi tiết</w:t>
+      </w:r>
+    </w:p>
+    <w:p>
+      <w:pPr>
+        <w:pStyle w:val="Heading4"/>
+      </w:pPr>
+      <w:r>
+        <w:t>2.2.2.2. Trải nghiệm người dùng</w:t>
+      </w:r>
+    </w:p>
+    <w:p>
+      <w:pPr>
+        <w:ind w:firstLine="284"/>
+        <w:rPr>
+          <w:lang w:val="vi-VN"/>
+        </w:rPr>
+      </w:pPr>
+      <w:r>
+        <w:rPr>
+          <w:lang w:val="vi-VN"/>
+        </w:rPr>
+        <w:t>Giao diện tổng thể mang phong cách hiện đại, sử dụng thiết kế dạng thẻ (Card-based UI) kết hợp với chủ đề tối (Dark mode). Thiết kế này không chỉ tạo ra sự nhất quán, sang trọng cho một ứng dụng tài chính mà còn giúp giảm mỏi mắt cho người dùng khi phải theo dõi các con số trong thời gian dài.</w:t>
+      </w:r>
+    </w:p>
+    <w:p>
+      <w:pPr>
+        <w:ind w:firstLine="284"/>
+        <w:rPr>
+          <w:lang w:val="vi-VN"/>
+        </w:rPr>
+      </w:pPr>
+      <w:r>
+        <w:rPr>
+          <w:lang w:val="vi-VN"/>
+        </w:rPr>
+        <w:t>Hệ thống sử dụng màu sắc và biểu tượng như một ngôn ngữ giao tiếp trực quan nhằm thông báo tình trạng tài chính tức thời mà không yêu cầu người dùng phải đọc quá nhiều chi tiết. Việc giảm tải nhận thức (cognitive load) này giúp người dùng dễ dàng đánh giá sức khỏe tài chính và điều chỉnh hành vi chi tiêu hợp lý.</w:t>
+      </w:r>
+    </w:p>
+    <w:p>
+      <w:pPr>
+        <w:numPr>
+          <w:ilvl w:val="0"/>
+          <w:numId w:val="16"/>
+        </w:numPr>
+        <w:ind w:hanging="294"/>
+        <w:rPr>
+          <w:lang w:val="vi-VN"/>
+        </w:rPr>
+      </w:pPr>
+      <w:r>
+        <w:rPr>
+          <w:lang w:val="vi-VN"/>
+        </w:rPr>
+        <w:t>Giao diện sử dụng tông màu nền tối (như mã màu #121513 và #1C2420) tạo độ tương phản cao, làm nổi bật các thành phần văn bản và dữ liệu có màu trắng hoặc sáng.</w:t>
+      </w:r>
+    </w:p>
+    <w:p>
+      <w:pPr>
+        <w:numPr>
+          <w:ilvl w:val="0"/>
+          <w:numId w:val="16"/>
+        </w:numPr>
+        <w:ind w:hanging="294"/>
+        <w:rPr>
+          <w:lang w:val="vi-VN"/>
+        </w:rPr>
+      </w:pPr>
+      <w:r>
+        <w:rPr>
+          <w:lang w:val="vi-VN"/>
+        </w:rPr>
+        <w:t>Phân loại dòng tiền rõ ràng thông qua màu sắc và hướng biểu tượng: Thu nhập sử dụng mũi tên hướng lên đi kèm màu xanh lá cây (#2ED573) , trong khi chi phí sử dụng mũi tên hướng xuống đi kèm màu đỏ (#FF4757).</w:t>
+      </w:r>
+    </w:p>
+    <w:p>
+      <w:pPr>
+        <w:numPr>
+          <w:ilvl w:val="0"/>
+          <w:numId w:val="16"/>
+        </w:numPr>
+        <w:ind w:hanging="294"/>
+        <w:rPr>
+          <w:lang w:val="vi-VN"/>
+        </w:rPr>
+      </w:pPr>
+      <w:r>
+        <w:rPr>
+          <w:lang w:val="vi-VN"/>
+        </w:rPr>
+        <w:lastRenderedPageBreak/>
+        <w:t>Thanh tiến trình ngân sách (ProgressBar) thay đổi màu sắc cảnh báo trực quan theo tỷ lệ tiêu dùng và cung cấp thông báo rõ ràng bằng chữ màu đỏ khi người dùng chi tiêu vượt hạn mức (ví dụ: "115% - Đã vượt hạn mức!").</w:t>
+      </w:r>
+    </w:p>
+    <w:p>
+      <w:pPr>
+        <w:numPr>
+          <w:ilvl w:val="0"/>
+          <w:numId w:val="16"/>
+        </w:numPr>
+        <w:ind w:hanging="294"/>
+        <w:rPr>
+          <w:lang w:val="vi-VN"/>
+        </w:rPr>
+      </w:pPr>
+      <w:r>
+        <w:rPr>
+          <w:lang w:val="vi-VN"/>
+        </w:rPr>
+        <w:t>Mỗi nguồn tiền/tài khoản đều được thiết kế để dễ dàng nhận diện thông qua việc gán màu nền (ColorHex) và biểu tượng (IconText) riêng biệt.</w:t>
+      </w:r>
+    </w:p>
+    <w:p>
+      <w:pPr>
+        <w:numPr>
+          <w:ilvl w:val="0"/>
+          <w:numId w:val="16"/>
+        </w:numPr>
+        <w:ind w:hanging="294"/>
+        <w:rPr>
+          <w:lang w:val="vi-VN"/>
+        </w:rPr>
+      </w:pPr>
+      <w:r>
+        <w:rPr>
+          <w:lang w:val="vi-VN"/>
+        </w:rPr>
+        <w:t>Sử dụng các giá trị dự phòng (FallbackValue như đ******** hoặc +12% so với tháng trước) để đảm bảo cấu trúc hình ảnh của giao diện luôn được duy trì ổn định ngay cả trong quá trình chờ tải dữ liệu</w:t>
       </w:r>
     </w:p>
     <w:p>
       <w:pPr>
         <w:pStyle w:val="Heading3"/>
-        <w:rPr>
-          <w:b w:val="0"/>
-          <w:bCs/>
-        </w:rPr>
-      </w:pPr>
-      <w:r>
-        <w:rPr>
-          <w:b w:val="0"/>
-          <w:bCs/>
-        </w:rPr>
-        <w:t>2.</w:t>
-      </w:r>
-      <w:r>
-        <w:rPr>
-          <w:b w:val="0"/>
-          <w:bCs/>
-        </w:rPr>
-        <w:t>1.5</w:t>
-      </w:r>
-      <w:r>
-        <w:rPr>
-          <w:b w:val="0"/>
-          <w:bCs/>
-        </w:rPr>
-        <w:t>. Quản lý danh mục</w:t>
-      </w:r>
-    </w:p>
-    <w:p>
-      <w:pPr>
-        <w:pStyle w:val="Heading2"/>
-      </w:pPr>
-      <w:r>
-        <w:t>2</w:t>
-      </w:r>
-      <w:r>
-        <w:t>.2. Phân tích yêu cầu phi chức năng</w:t>
+      </w:pPr>
+      <w:r>
+        <w:lastRenderedPageBreak/>
+        <w:t>2.2.3. Độ tin cậy và ràng buộc</w:t>
       </w:r>
     </w:p>
     <w:p>
       <w:pPr>
         <w:pStyle w:val="Heading3"/>
-        <w:rPr>
-          <w:b w:val="0"/>
-          <w:bCs/>
-        </w:rPr>
-      </w:pPr>
-      <w:r>
-        <w:rPr>
-          <w:b w:val="0"/>
-          <w:bCs/>
-        </w:rPr>
-        <w:t>2.2.1. Hiệu năng</w:t>
-      </w:r>
-    </w:p>
-    <w:p>
-      <w:pPr>
-        <w:pStyle w:val="Heading3"/>
-        <w:rPr>
-          <w:b w:val="0"/>
-          <w:bCs/>
-        </w:rPr>
-      </w:pPr>
-      <w:r>
-        <w:rPr>
-          <w:b w:val="0"/>
-          <w:bCs/>
-        </w:rPr>
-        <w:t>2.2.2. Khả dụng và trải nghiệm người dùng</w:t>
-      </w:r>
-    </w:p>
-    <w:p>
-      <w:pPr>
-        <w:pStyle w:val="Heading3"/>
-        <w:rPr>
-          <w:b w:val="0"/>
-          <w:bCs/>
-        </w:rPr>
-      </w:pPr>
-      <w:r>
-        <w:rPr>
-          <w:b w:val="0"/>
-          <w:bCs/>
-        </w:rPr>
-        <w:t>2.2.3. Độ tin cậy và ràng buộc</w:t>
-      </w:r>
-    </w:p>
-    <w:p>
-      <w:pPr>
-        <w:pStyle w:val="Heading3"/>
-        <w:rPr>
-          <w:b w:val="0"/>
-          <w:bCs/>
-        </w:rPr>
-      </w:pPr>
-      <w:r>
-        <w:rPr>
-          <w:b w:val="0"/>
-          <w:bCs/>
-        </w:rPr>
+      </w:pPr>
+      <w:r>
         <w:t>2.2.4. Khả năng mở rộng</w:t>
       </w:r>
     </w:p>
@@ -3249,6 +3913,861 @@
     </w:lvl>
   </w:abstractNum>
   <w:abstractNum w:abstractNumId="2" w15:restartNumberingAfterBreak="0">
+    <w:nsid w:val="1A3172FF"/>
+    <w:multiLevelType w:val="multilevel"/>
+    <w:tmpl w:val="C04804D2"/>
+    <w:lvl w:ilvl="0">
+      <w:start w:val="1"/>
+      <w:numFmt w:val="bullet"/>
+      <w:lvlText w:val=""/>
+      <w:lvlJc w:val="left"/>
+      <w:pPr>
+        <w:tabs>
+          <w:tab w:val="num" w:pos="720"/>
+        </w:tabs>
+        <w:ind w:left="720" w:hanging="360"/>
+      </w:pPr>
+      <w:rPr>
+        <w:rFonts w:ascii="Symbol" w:hAnsi="Symbol" w:hint="default"/>
+        <w:sz w:val="20"/>
+      </w:rPr>
+    </w:lvl>
+    <w:lvl w:ilvl="1">
+      <w:start w:val="1"/>
+      <w:numFmt w:val="bullet"/>
+      <w:lvlText w:val="o"/>
+      <w:lvlJc w:val="left"/>
+      <w:pPr>
+        <w:tabs>
+          <w:tab w:val="num" w:pos="1440"/>
+        </w:tabs>
+        <w:ind w:left="1440" w:hanging="360"/>
+      </w:pPr>
+      <w:rPr>
+        <w:rFonts w:ascii="Courier New" w:hAnsi="Courier New" w:hint="default"/>
+        <w:sz w:val="20"/>
+      </w:rPr>
+    </w:lvl>
+    <w:lvl w:ilvl="2" w:tentative="1">
+      <w:start w:val="1"/>
+      <w:numFmt w:val="bullet"/>
+      <w:lvlText w:val=""/>
+      <w:lvlJc w:val="left"/>
+      <w:pPr>
+        <w:tabs>
+          <w:tab w:val="num" w:pos="2160"/>
+        </w:tabs>
+        <w:ind w:left="2160" w:hanging="360"/>
+      </w:pPr>
+      <w:rPr>
+        <w:rFonts w:ascii="Wingdings" w:hAnsi="Wingdings" w:hint="default"/>
+        <w:sz w:val="20"/>
+      </w:rPr>
+    </w:lvl>
+    <w:lvl w:ilvl="3" w:tentative="1">
+      <w:start w:val="1"/>
+      <w:numFmt w:val="bullet"/>
+      <w:lvlText w:val=""/>
+      <w:lvlJc w:val="left"/>
+      <w:pPr>
+        <w:tabs>
+          <w:tab w:val="num" w:pos="2880"/>
+        </w:tabs>
+        <w:ind w:left="2880" w:hanging="360"/>
+      </w:pPr>
+      <w:rPr>
+        <w:rFonts w:ascii="Wingdings" w:hAnsi="Wingdings" w:hint="default"/>
+        <w:sz w:val="20"/>
+      </w:rPr>
+    </w:lvl>
+    <w:lvl w:ilvl="4" w:tentative="1">
+      <w:start w:val="1"/>
+      <w:numFmt w:val="bullet"/>
+      <w:lvlText w:val=""/>
+      <w:lvlJc w:val="left"/>
+      <w:pPr>
+        <w:tabs>
+          <w:tab w:val="num" w:pos="3600"/>
+        </w:tabs>
+        <w:ind w:left="3600" w:hanging="360"/>
+      </w:pPr>
+      <w:rPr>
+        <w:rFonts w:ascii="Wingdings" w:hAnsi="Wingdings" w:hint="default"/>
+        <w:sz w:val="20"/>
+      </w:rPr>
+    </w:lvl>
+    <w:lvl w:ilvl="5" w:tentative="1">
+      <w:start w:val="1"/>
+      <w:numFmt w:val="bullet"/>
+      <w:lvlText w:val=""/>
+      <w:lvlJc w:val="left"/>
+      <w:pPr>
+        <w:tabs>
+          <w:tab w:val="num" w:pos="4320"/>
+        </w:tabs>
+        <w:ind w:left="4320" w:hanging="360"/>
+      </w:pPr>
+      <w:rPr>
+        <w:rFonts w:ascii="Wingdings" w:hAnsi="Wingdings" w:hint="default"/>
+        <w:sz w:val="20"/>
+      </w:rPr>
+    </w:lvl>
+    <w:lvl w:ilvl="6" w:tentative="1">
+      <w:start w:val="1"/>
+      <w:numFmt w:val="bullet"/>
+      <w:lvlText w:val=""/>
+      <w:lvlJc w:val="left"/>
+      <w:pPr>
+        <w:tabs>
+          <w:tab w:val="num" w:pos="5040"/>
+        </w:tabs>
+        <w:ind w:left="5040" w:hanging="360"/>
+      </w:pPr>
+      <w:rPr>
+        <w:rFonts w:ascii="Wingdings" w:hAnsi="Wingdings" w:hint="default"/>
+        <w:sz w:val="20"/>
+      </w:rPr>
+    </w:lvl>
+    <w:lvl w:ilvl="7" w:tentative="1">
+      <w:start w:val="1"/>
+      <w:numFmt w:val="bullet"/>
+      <w:lvlText w:val=""/>
+      <w:lvlJc w:val="left"/>
+      <w:pPr>
+        <w:tabs>
+          <w:tab w:val="num" w:pos="5760"/>
+        </w:tabs>
+        <w:ind w:left="5760" w:hanging="360"/>
+      </w:pPr>
+      <w:rPr>
+        <w:rFonts w:ascii="Wingdings" w:hAnsi="Wingdings" w:hint="default"/>
+        <w:sz w:val="20"/>
+      </w:rPr>
+    </w:lvl>
+    <w:lvl w:ilvl="8" w:tentative="1">
+      <w:start w:val="1"/>
+      <w:numFmt w:val="bullet"/>
+      <w:lvlText w:val=""/>
+      <w:lvlJc w:val="left"/>
+      <w:pPr>
+        <w:tabs>
+          <w:tab w:val="num" w:pos="6480"/>
+        </w:tabs>
+        <w:ind w:left="6480" w:hanging="360"/>
+      </w:pPr>
+      <w:rPr>
+        <w:rFonts w:ascii="Wingdings" w:hAnsi="Wingdings" w:hint="default"/>
+        <w:sz w:val="20"/>
+      </w:rPr>
+    </w:lvl>
+  </w:abstractNum>
+  <w:abstractNum w:abstractNumId="3" w15:restartNumberingAfterBreak="0">
+    <w:nsid w:val="1E70791A"/>
+    <w:multiLevelType w:val="multilevel"/>
+    <w:tmpl w:val="78A829C2"/>
+    <w:lvl w:ilvl="0">
+      <w:start w:val="1"/>
+      <w:numFmt w:val="bullet"/>
+      <w:lvlText w:val=""/>
+      <w:lvlJc w:val="left"/>
+      <w:pPr>
+        <w:tabs>
+          <w:tab w:val="num" w:pos="720"/>
+        </w:tabs>
+        <w:ind w:left="720" w:hanging="360"/>
+      </w:pPr>
+      <w:rPr>
+        <w:rFonts w:ascii="Symbol" w:hAnsi="Symbol" w:hint="default"/>
+        <w:sz w:val="20"/>
+      </w:rPr>
+    </w:lvl>
+    <w:lvl w:ilvl="1">
+      <w:start w:val="1"/>
+      <w:numFmt w:val="bullet"/>
+      <w:lvlText w:val="o"/>
+      <w:lvlJc w:val="left"/>
+      <w:pPr>
+        <w:tabs>
+          <w:tab w:val="num" w:pos="1440"/>
+        </w:tabs>
+        <w:ind w:left="1440" w:hanging="360"/>
+      </w:pPr>
+      <w:rPr>
+        <w:rFonts w:ascii="Courier New" w:hAnsi="Courier New" w:hint="default"/>
+        <w:sz w:val="20"/>
+      </w:rPr>
+    </w:lvl>
+    <w:lvl w:ilvl="2" w:tentative="1">
+      <w:start w:val="1"/>
+      <w:numFmt w:val="bullet"/>
+      <w:lvlText w:val=""/>
+      <w:lvlJc w:val="left"/>
+      <w:pPr>
+        <w:tabs>
+          <w:tab w:val="num" w:pos="2160"/>
+        </w:tabs>
+        <w:ind w:left="2160" w:hanging="360"/>
+      </w:pPr>
+      <w:rPr>
+        <w:rFonts w:ascii="Wingdings" w:hAnsi="Wingdings" w:hint="default"/>
+        <w:sz w:val="20"/>
+      </w:rPr>
+    </w:lvl>
+    <w:lvl w:ilvl="3" w:tentative="1">
+      <w:start w:val="1"/>
+      <w:numFmt w:val="bullet"/>
+      <w:lvlText w:val=""/>
+      <w:lvlJc w:val="left"/>
+      <w:pPr>
+        <w:tabs>
+          <w:tab w:val="num" w:pos="2880"/>
+        </w:tabs>
+        <w:ind w:left="2880" w:hanging="360"/>
+      </w:pPr>
+      <w:rPr>
+        <w:rFonts w:ascii="Wingdings" w:hAnsi="Wingdings" w:hint="default"/>
+        <w:sz w:val="20"/>
+      </w:rPr>
+    </w:lvl>
+    <w:lvl w:ilvl="4" w:tentative="1">
+      <w:start w:val="1"/>
+      <w:numFmt w:val="bullet"/>
+      <w:lvlText w:val=""/>
+      <w:lvlJc w:val="left"/>
+      <w:pPr>
+        <w:tabs>
+          <w:tab w:val="num" w:pos="3600"/>
+        </w:tabs>
+        <w:ind w:left="3600" w:hanging="360"/>
+      </w:pPr>
+      <w:rPr>
+        <w:rFonts w:ascii="Wingdings" w:hAnsi="Wingdings" w:hint="default"/>
+        <w:sz w:val="20"/>
+      </w:rPr>
+    </w:lvl>
+    <w:lvl w:ilvl="5" w:tentative="1">
+      <w:start w:val="1"/>
+      <w:numFmt w:val="bullet"/>
+      <w:lvlText w:val=""/>
+      <w:lvlJc w:val="left"/>
+      <w:pPr>
+        <w:tabs>
+          <w:tab w:val="num" w:pos="4320"/>
+        </w:tabs>
+        <w:ind w:left="4320" w:hanging="360"/>
+      </w:pPr>
+      <w:rPr>
+        <w:rFonts w:ascii="Wingdings" w:hAnsi="Wingdings" w:hint="default"/>
+        <w:sz w:val="20"/>
+      </w:rPr>
+    </w:lvl>
+    <w:lvl w:ilvl="6" w:tentative="1">
+      <w:start w:val="1"/>
+      <w:numFmt w:val="bullet"/>
+      <w:lvlText w:val=""/>
+      <w:lvlJc w:val="left"/>
+      <w:pPr>
+        <w:tabs>
+          <w:tab w:val="num" w:pos="5040"/>
+        </w:tabs>
+        <w:ind w:left="5040" w:hanging="360"/>
+      </w:pPr>
+      <w:rPr>
+        <w:rFonts w:ascii="Wingdings" w:hAnsi="Wingdings" w:hint="default"/>
+        <w:sz w:val="20"/>
+      </w:rPr>
+    </w:lvl>
+    <w:lvl w:ilvl="7" w:tentative="1">
+      <w:start w:val="1"/>
+      <w:numFmt w:val="bullet"/>
+      <w:lvlText w:val=""/>
+      <w:lvlJc w:val="left"/>
+      <w:pPr>
+        <w:tabs>
+          <w:tab w:val="num" w:pos="5760"/>
+        </w:tabs>
+        <w:ind w:left="5760" w:hanging="360"/>
+      </w:pPr>
+      <w:rPr>
+        <w:rFonts w:ascii="Wingdings" w:hAnsi="Wingdings" w:hint="default"/>
+        <w:sz w:val="20"/>
+      </w:rPr>
+    </w:lvl>
+    <w:lvl w:ilvl="8" w:tentative="1">
+      <w:start w:val="1"/>
+      <w:numFmt w:val="bullet"/>
+      <w:lvlText w:val=""/>
+      <w:lvlJc w:val="left"/>
+      <w:pPr>
+        <w:tabs>
+          <w:tab w:val="num" w:pos="6480"/>
+        </w:tabs>
+        <w:ind w:left="6480" w:hanging="360"/>
+      </w:pPr>
+      <w:rPr>
+        <w:rFonts w:ascii="Wingdings" w:hAnsi="Wingdings" w:hint="default"/>
+        <w:sz w:val="20"/>
+      </w:rPr>
+    </w:lvl>
+  </w:abstractNum>
+  <w:abstractNum w:abstractNumId="4" w15:restartNumberingAfterBreak="0">
+    <w:nsid w:val="2C2D74B8"/>
+    <w:multiLevelType w:val="multilevel"/>
+    <w:tmpl w:val="6F3A821E"/>
+    <w:lvl w:ilvl="0">
+      <w:start w:val="1"/>
+      <w:numFmt w:val="bullet"/>
+      <w:lvlText w:val=""/>
+      <w:lvlJc w:val="left"/>
+      <w:pPr>
+        <w:tabs>
+          <w:tab w:val="num" w:pos="720"/>
+        </w:tabs>
+        <w:ind w:left="720" w:hanging="360"/>
+      </w:pPr>
+      <w:rPr>
+        <w:rFonts w:ascii="Symbol" w:hAnsi="Symbol" w:hint="default"/>
+        <w:sz w:val="20"/>
+      </w:rPr>
+    </w:lvl>
+    <w:lvl w:ilvl="1">
+      <w:start w:val="1"/>
+      <w:numFmt w:val="bullet"/>
+      <w:lvlText w:val=""/>
+      <w:lvlJc w:val="left"/>
+      <w:pPr>
+        <w:ind w:left="1440" w:hanging="360"/>
+      </w:pPr>
+      <w:rPr>
+        <w:rFonts w:ascii="Wingdings" w:hAnsi="Wingdings" w:hint="default"/>
+      </w:rPr>
+    </w:lvl>
+    <w:lvl w:ilvl="2" w:tentative="1">
+      <w:start w:val="1"/>
+      <w:numFmt w:val="bullet"/>
+      <w:lvlText w:val=""/>
+      <w:lvlJc w:val="left"/>
+      <w:pPr>
+        <w:tabs>
+          <w:tab w:val="num" w:pos="2160"/>
+        </w:tabs>
+        <w:ind w:left="2160" w:hanging="360"/>
+      </w:pPr>
+      <w:rPr>
+        <w:rFonts w:ascii="Wingdings" w:hAnsi="Wingdings" w:hint="default"/>
+        <w:sz w:val="20"/>
+      </w:rPr>
+    </w:lvl>
+    <w:lvl w:ilvl="3" w:tentative="1">
+      <w:start w:val="1"/>
+      <w:numFmt w:val="bullet"/>
+      <w:lvlText w:val=""/>
+      <w:lvlJc w:val="left"/>
+      <w:pPr>
+        <w:tabs>
+          <w:tab w:val="num" w:pos="2880"/>
+        </w:tabs>
+        <w:ind w:left="2880" w:hanging="360"/>
+      </w:pPr>
+      <w:rPr>
+        <w:rFonts w:ascii="Wingdings" w:hAnsi="Wingdings" w:hint="default"/>
+        <w:sz w:val="20"/>
+      </w:rPr>
+    </w:lvl>
+    <w:lvl w:ilvl="4" w:tentative="1">
+      <w:start w:val="1"/>
+      <w:numFmt w:val="bullet"/>
+      <w:lvlText w:val=""/>
+      <w:lvlJc w:val="left"/>
+      <w:pPr>
+        <w:tabs>
+          <w:tab w:val="num" w:pos="3600"/>
+        </w:tabs>
+        <w:ind w:left="3600" w:hanging="360"/>
+      </w:pPr>
+      <w:rPr>
+        <w:rFonts w:ascii="Wingdings" w:hAnsi="Wingdings" w:hint="default"/>
+        <w:sz w:val="20"/>
+      </w:rPr>
+    </w:lvl>
+    <w:lvl w:ilvl="5" w:tentative="1">
+      <w:start w:val="1"/>
+      <w:numFmt w:val="bullet"/>
+      <w:lvlText w:val=""/>
+      <w:lvlJc w:val="left"/>
+      <w:pPr>
+        <w:tabs>
+          <w:tab w:val="num" w:pos="4320"/>
+        </w:tabs>
+        <w:ind w:left="4320" w:hanging="360"/>
+      </w:pPr>
+      <w:rPr>
+        <w:rFonts w:ascii="Wingdings" w:hAnsi="Wingdings" w:hint="default"/>
+        <w:sz w:val="20"/>
+      </w:rPr>
+    </w:lvl>
+    <w:lvl w:ilvl="6" w:tentative="1">
+      <w:start w:val="1"/>
+      <w:numFmt w:val="bullet"/>
+      <w:lvlText w:val=""/>
+      <w:lvlJc w:val="left"/>
+      <w:pPr>
+        <w:tabs>
+          <w:tab w:val="num" w:pos="5040"/>
+        </w:tabs>
+        <w:ind w:left="5040" w:hanging="360"/>
+      </w:pPr>
+      <w:rPr>
+        <w:rFonts w:ascii="Wingdings" w:hAnsi="Wingdings" w:hint="default"/>
+        <w:sz w:val="20"/>
+      </w:rPr>
+    </w:lvl>
+    <w:lvl w:ilvl="7" w:tentative="1">
+      <w:start w:val="1"/>
+      <w:numFmt w:val="bullet"/>
+      <w:lvlText w:val=""/>
+      <w:lvlJc w:val="left"/>
+      <w:pPr>
+        <w:tabs>
+          <w:tab w:val="num" w:pos="5760"/>
+        </w:tabs>
+        <w:ind w:left="5760" w:hanging="360"/>
+      </w:pPr>
+      <w:rPr>
+        <w:rFonts w:ascii="Wingdings" w:hAnsi="Wingdings" w:hint="default"/>
+        <w:sz w:val="20"/>
+      </w:rPr>
+    </w:lvl>
+    <w:lvl w:ilvl="8" w:tentative="1">
+      <w:start w:val="1"/>
+      <w:numFmt w:val="bullet"/>
+      <w:lvlText w:val=""/>
+      <w:lvlJc w:val="left"/>
+      <w:pPr>
+        <w:tabs>
+          <w:tab w:val="num" w:pos="6480"/>
+        </w:tabs>
+        <w:ind w:left="6480" w:hanging="360"/>
+      </w:pPr>
+      <w:rPr>
+        <w:rFonts w:ascii="Wingdings" w:hAnsi="Wingdings" w:hint="default"/>
+        <w:sz w:val="20"/>
+      </w:rPr>
+    </w:lvl>
+  </w:abstractNum>
+  <w:abstractNum w:abstractNumId="5" w15:restartNumberingAfterBreak="0">
+    <w:nsid w:val="2D7171A7"/>
+    <w:multiLevelType w:val="multilevel"/>
+    <w:tmpl w:val="B3DA3BA2"/>
+    <w:lvl w:ilvl="0">
+      <w:start w:val="1"/>
+      <w:numFmt w:val="bullet"/>
+      <w:lvlText w:val=""/>
+      <w:lvlJc w:val="left"/>
+      <w:pPr>
+        <w:tabs>
+          <w:tab w:val="num" w:pos="720"/>
+        </w:tabs>
+        <w:ind w:left="720" w:hanging="360"/>
+      </w:pPr>
+      <w:rPr>
+        <w:rFonts w:ascii="Symbol" w:hAnsi="Symbol" w:hint="default"/>
+        <w:sz w:val="20"/>
+      </w:rPr>
+    </w:lvl>
+    <w:lvl w:ilvl="1" w:tentative="1">
+      <w:start w:val="1"/>
+      <w:numFmt w:val="bullet"/>
+      <w:lvlText w:val="o"/>
+      <w:lvlJc w:val="left"/>
+      <w:pPr>
+        <w:tabs>
+          <w:tab w:val="num" w:pos="1440"/>
+        </w:tabs>
+        <w:ind w:left="1440" w:hanging="360"/>
+      </w:pPr>
+      <w:rPr>
+        <w:rFonts w:ascii="Courier New" w:hAnsi="Courier New" w:hint="default"/>
+        <w:sz w:val="20"/>
+      </w:rPr>
+    </w:lvl>
+    <w:lvl w:ilvl="2" w:tentative="1">
+      <w:start w:val="1"/>
+      <w:numFmt w:val="bullet"/>
+      <w:lvlText w:val=""/>
+      <w:lvlJc w:val="left"/>
+      <w:pPr>
+        <w:tabs>
+          <w:tab w:val="num" w:pos="2160"/>
+        </w:tabs>
+        <w:ind w:left="2160" w:hanging="360"/>
+      </w:pPr>
+      <w:rPr>
+        <w:rFonts w:ascii="Wingdings" w:hAnsi="Wingdings" w:hint="default"/>
+        <w:sz w:val="20"/>
+      </w:rPr>
+    </w:lvl>
+    <w:lvl w:ilvl="3" w:tentative="1">
+      <w:start w:val="1"/>
+      <w:numFmt w:val="bullet"/>
+      <w:lvlText w:val=""/>
+      <w:lvlJc w:val="left"/>
+      <w:pPr>
+        <w:tabs>
+          <w:tab w:val="num" w:pos="2880"/>
+        </w:tabs>
+        <w:ind w:left="2880" w:hanging="360"/>
+      </w:pPr>
+      <w:rPr>
+        <w:rFonts w:ascii="Wingdings" w:hAnsi="Wingdings" w:hint="default"/>
+        <w:sz w:val="20"/>
+      </w:rPr>
+    </w:lvl>
+    <w:lvl w:ilvl="4" w:tentative="1">
+      <w:start w:val="1"/>
+      <w:numFmt w:val="bullet"/>
+      <w:lvlText w:val=""/>
+      <w:lvlJc w:val="left"/>
+      <w:pPr>
+        <w:tabs>
+          <w:tab w:val="num" w:pos="3600"/>
+        </w:tabs>
+        <w:ind w:left="3600" w:hanging="360"/>
+      </w:pPr>
+      <w:rPr>
+        <w:rFonts w:ascii="Wingdings" w:hAnsi="Wingdings" w:hint="default"/>
+        <w:sz w:val="20"/>
+      </w:rPr>
+    </w:lvl>
+    <w:lvl w:ilvl="5" w:tentative="1">
+      <w:start w:val="1"/>
+      <w:numFmt w:val="bullet"/>
+      <w:lvlText w:val=""/>
+      <w:lvlJc w:val="left"/>
+      <w:pPr>
+        <w:tabs>
+          <w:tab w:val="num" w:pos="4320"/>
+        </w:tabs>
+        <w:ind w:left="4320" w:hanging="360"/>
+      </w:pPr>
+      <w:rPr>
+        <w:rFonts w:ascii="Wingdings" w:hAnsi="Wingdings" w:hint="default"/>
+        <w:sz w:val="20"/>
+      </w:rPr>
+    </w:lvl>
+    <w:lvl w:ilvl="6" w:tentative="1">
+      <w:start w:val="1"/>
+      <w:numFmt w:val="bullet"/>
+      <w:lvlText w:val=""/>
+      <w:lvlJc w:val="left"/>
+      <w:pPr>
+        <w:tabs>
+          <w:tab w:val="num" w:pos="5040"/>
+        </w:tabs>
+        <w:ind w:left="5040" w:hanging="360"/>
+      </w:pPr>
+      <w:rPr>
+        <w:rFonts w:ascii="Wingdings" w:hAnsi="Wingdings" w:hint="default"/>
+        <w:sz w:val="20"/>
+      </w:rPr>
+    </w:lvl>
+    <w:lvl w:ilvl="7" w:tentative="1">
+      <w:start w:val="1"/>
+      <w:numFmt w:val="bullet"/>
+      <w:lvlText w:val=""/>
+      <w:lvlJc w:val="left"/>
+      <w:pPr>
+        <w:tabs>
+          <w:tab w:val="num" w:pos="5760"/>
+        </w:tabs>
+        <w:ind w:left="5760" w:hanging="360"/>
+      </w:pPr>
+      <w:rPr>
+        <w:rFonts w:ascii="Wingdings" w:hAnsi="Wingdings" w:hint="default"/>
+        <w:sz w:val="20"/>
+      </w:rPr>
+    </w:lvl>
+    <w:lvl w:ilvl="8" w:tentative="1">
+      <w:start w:val="1"/>
+      <w:numFmt w:val="bullet"/>
+      <w:lvlText w:val=""/>
+      <w:lvlJc w:val="left"/>
+      <w:pPr>
+        <w:tabs>
+          <w:tab w:val="num" w:pos="6480"/>
+        </w:tabs>
+        <w:ind w:left="6480" w:hanging="360"/>
+      </w:pPr>
+      <w:rPr>
+        <w:rFonts w:ascii="Wingdings" w:hAnsi="Wingdings" w:hint="default"/>
+        <w:sz w:val="20"/>
+      </w:rPr>
+    </w:lvl>
+  </w:abstractNum>
+  <w:abstractNum w:abstractNumId="6" w15:restartNumberingAfterBreak="0">
+    <w:nsid w:val="36882BF9"/>
+    <w:multiLevelType w:val="multilevel"/>
+    <w:tmpl w:val="566CD2C4"/>
+    <w:lvl w:ilvl="0">
+      <w:start w:val="1"/>
+      <w:numFmt w:val="bullet"/>
+      <w:lvlText w:val=""/>
+      <w:lvlJc w:val="left"/>
+      <w:pPr>
+        <w:tabs>
+          <w:tab w:val="num" w:pos="720"/>
+        </w:tabs>
+        <w:ind w:left="720" w:hanging="360"/>
+      </w:pPr>
+      <w:rPr>
+        <w:rFonts w:ascii="Symbol" w:hAnsi="Symbol" w:hint="default"/>
+        <w:sz w:val="20"/>
+      </w:rPr>
+    </w:lvl>
+    <w:lvl w:ilvl="1" w:tentative="1">
+      <w:start w:val="1"/>
+      <w:numFmt w:val="bullet"/>
+      <w:lvlText w:val="o"/>
+      <w:lvlJc w:val="left"/>
+      <w:pPr>
+        <w:tabs>
+          <w:tab w:val="num" w:pos="1440"/>
+        </w:tabs>
+        <w:ind w:left="1440" w:hanging="360"/>
+      </w:pPr>
+      <w:rPr>
+        <w:rFonts w:ascii="Courier New" w:hAnsi="Courier New" w:hint="default"/>
+        <w:sz w:val="20"/>
+      </w:rPr>
+    </w:lvl>
+    <w:lvl w:ilvl="2" w:tentative="1">
+      <w:start w:val="1"/>
+      <w:numFmt w:val="bullet"/>
+      <w:lvlText w:val=""/>
+      <w:lvlJc w:val="left"/>
+      <w:pPr>
+        <w:tabs>
+          <w:tab w:val="num" w:pos="2160"/>
+        </w:tabs>
+        <w:ind w:left="2160" w:hanging="360"/>
+      </w:pPr>
+      <w:rPr>
+        <w:rFonts w:ascii="Wingdings" w:hAnsi="Wingdings" w:hint="default"/>
+        <w:sz w:val="20"/>
+      </w:rPr>
+    </w:lvl>
+    <w:lvl w:ilvl="3" w:tentative="1">
+      <w:start w:val="1"/>
+      <w:numFmt w:val="bullet"/>
+      <w:lvlText w:val=""/>
+      <w:lvlJc w:val="left"/>
+      <w:pPr>
+        <w:tabs>
+          <w:tab w:val="num" w:pos="2880"/>
+        </w:tabs>
+        <w:ind w:left="2880" w:hanging="360"/>
+      </w:pPr>
+      <w:rPr>
+        <w:rFonts w:ascii="Wingdings" w:hAnsi="Wingdings" w:hint="default"/>
+        <w:sz w:val="20"/>
+      </w:rPr>
+    </w:lvl>
+    <w:lvl w:ilvl="4" w:tentative="1">
+      <w:start w:val="1"/>
+      <w:numFmt w:val="bullet"/>
+      <w:lvlText w:val=""/>
+      <w:lvlJc w:val="left"/>
+      <w:pPr>
+        <w:tabs>
+          <w:tab w:val="num" w:pos="3600"/>
+        </w:tabs>
+        <w:ind w:left="3600" w:hanging="360"/>
+      </w:pPr>
+      <w:rPr>
+        <w:rFonts w:ascii="Wingdings" w:hAnsi="Wingdings" w:hint="default"/>
+        <w:sz w:val="20"/>
+      </w:rPr>
+    </w:lvl>
+    <w:lvl w:ilvl="5" w:tentative="1">
+      <w:start w:val="1"/>
+      <w:numFmt w:val="bullet"/>
+      <w:lvlText w:val=""/>
+      <w:lvlJc w:val="left"/>
+      <w:pPr>
+        <w:tabs>
+          <w:tab w:val="num" w:pos="4320"/>
+        </w:tabs>
+        <w:ind w:left="4320" w:hanging="360"/>
+      </w:pPr>
+      <w:rPr>
+        <w:rFonts w:ascii="Wingdings" w:hAnsi="Wingdings" w:hint="default"/>
+        <w:sz w:val="20"/>
+      </w:rPr>
+    </w:lvl>
+    <w:lvl w:ilvl="6" w:tentative="1">
+      <w:start w:val="1"/>
+      <w:numFmt w:val="bullet"/>
+      <w:lvlText w:val=""/>
+      <w:lvlJc w:val="left"/>
+      <w:pPr>
+        <w:tabs>
+          <w:tab w:val="num" w:pos="5040"/>
+        </w:tabs>
+        <w:ind w:left="5040" w:hanging="360"/>
+      </w:pPr>
+      <w:rPr>
+        <w:rFonts w:ascii="Wingdings" w:hAnsi="Wingdings" w:hint="default"/>
+        <w:sz w:val="20"/>
+      </w:rPr>
+    </w:lvl>
+    <w:lvl w:ilvl="7" w:tentative="1">
+      <w:start w:val="1"/>
+      <w:numFmt w:val="bullet"/>
+      <w:lvlText w:val=""/>
+      <w:lvlJc w:val="left"/>
+      <w:pPr>
+        <w:tabs>
+          <w:tab w:val="num" w:pos="5760"/>
+        </w:tabs>
+        <w:ind w:left="5760" w:hanging="360"/>
+      </w:pPr>
+      <w:rPr>
+        <w:rFonts w:ascii="Wingdings" w:hAnsi="Wingdings" w:hint="default"/>
+        <w:sz w:val="20"/>
+      </w:rPr>
+    </w:lvl>
+    <w:lvl w:ilvl="8" w:tentative="1">
+      <w:start w:val="1"/>
+      <w:numFmt w:val="bullet"/>
+      <w:lvlText w:val=""/>
+      <w:lvlJc w:val="left"/>
+      <w:pPr>
+        <w:tabs>
+          <w:tab w:val="num" w:pos="6480"/>
+        </w:tabs>
+        <w:ind w:left="6480" w:hanging="360"/>
+      </w:pPr>
+      <w:rPr>
+        <w:rFonts w:ascii="Wingdings" w:hAnsi="Wingdings" w:hint="default"/>
+        <w:sz w:val="20"/>
+      </w:rPr>
+    </w:lvl>
+  </w:abstractNum>
+  <w:abstractNum w:abstractNumId="7" w15:restartNumberingAfterBreak="0">
+    <w:nsid w:val="424D54B6"/>
+    <w:multiLevelType w:val="hybridMultilevel"/>
+    <w:tmpl w:val="2DAEDAC0"/>
+    <w:lvl w:ilvl="0" w:tplc="F4983460">
+      <w:start w:val="1"/>
+      <w:numFmt w:val="bullet"/>
+      <w:lvlText w:val="●"/>
+      <w:lvlJc w:val="left"/>
+      <w:pPr>
+        <w:ind w:left="720" w:hanging="360"/>
+      </w:pPr>
+      <w:rPr>
+        <w:rFonts w:ascii="Times New Roman" w:hAnsi="Times New Roman" w:cs="Times New Roman" w:hint="default"/>
+        <w:sz w:val="26"/>
+      </w:rPr>
+    </w:lvl>
+    <w:lvl w:ilvl="1" w:tplc="042A0003">
+      <w:start w:val="1"/>
+      <w:numFmt w:val="bullet"/>
+      <w:lvlText w:val="o"/>
+      <w:lvlJc w:val="left"/>
+      <w:pPr>
+        <w:ind w:left="1440" w:hanging="360"/>
+      </w:pPr>
+      <w:rPr>
+        <w:rFonts w:ascii="Courier New" w:hAnsi="Courier New" w:cs="Courier New" w:hint="default"/>
+      </w:rPr>
+    </w:lvl>
+    <w:lvl w:ilvl="2" w:tplc="042A0005" w:tentative="1">
+      <w:start w:val="1"/>
+      <w:numFmt w:val="bullet"/>
+      <w:lvlText w:val=""/>
+      <w:lvlJc w:val="left"/>
+      <w:pPr>
+        <w:ind w:left="2160" w:hanging="360"/>
+      </w:pPr>
+      <w:rPr>
+        <w:rFonts w:ascii="Wingdings" w:hAnsi="Wingdings" w:hint="default"/>
+      </w:rPr>
+    </w:lvl>
+    <w:lvl w:ilvl="3" w:tplc="042A0001" w:tentative="1">
+      <w:start w:val="1"/>
+      <w:numFmt w:val="bullet"/>
+      <w:lvlText w:val=""/>
+      <w:lvlJc w:val="left"/>
+      <w:pPr>
+        <w:ind w:left="2880" w:hanging="360"/>
+      </w:pPr>
+      <w:rPr>
+        <w:rFonts w:ascii="Symbol" w:hAnsi="Symbol" w:hint="default"/>
+      </w:rPr>
+    </w:lvl>
+    <w:lvl w:ilvl="4" w:tplc="042A0003" w:tentative="1">
+      <w:start w:val="1"/>
+      <w:numFmt w:val="bullet"/>
+      <w:lvlText w:val="o"/>
+      <w:lvlJc w:val="left"/>
+      <w:pPr>
+        <w:ind w:left="3600" w:hanging="360"/>
+      </w:pPr>
+      <w:rPr>
+        <w:rFonts w:ascii="Courier New" w:hAnsi="Courier New" w:cs="Courier New" w:hint="default"/>
+      </w:rPr>
+    </w:lvl>
+    <w:lvl w:ilvl="5" w:tplc="042A0005" w:tentative="1">
+      <w:start w:val="1"/>
+      <w:numFmt w:val="bullet"/>
+      <w:lvlText w:val=""/>
+      <w:lvlJc w:val="left"/>
+      <w:pPr>
+        <w:ind w:left="4320" w:hanging="360"/>
+      </w:pPr>
+      <w:rPr>
+        <w:rFonts w:ascii="Wingdings" w:hAnsi="Wingdings" w:hint="default"/>
+      </w:rPr>
+    </w:lvl>
+    <w:lvl w:ilvl="6" w:tplc="042A0001" w:tentative="1">
+      <w:start w:val="1"/>
+      <w:numFmt w:val="bullet"/>
+      <w:lvlText w:val=""/>
+      <w:lvlJc w:val="left"/>
+      <w:pPr>
+        <w:ind w:left="5040" w:hanging="360"/>
+      </w:pPr>
+      <w:rPr>
+        <w:rFonts w:ascii="Symbol" w:hAnsi="Symbol" w:hint="default"/>
+      </w:rPr>
+    </w:lvl>
+    <w:lvl w:ilvl="7" w:tplc="042A0003" w:tentative="1">
+      <w:start w:val="1"/>
+      <w:numFmt w:val="bullet"/>
+      <w:lvlText w:val="o"/>
+      <w:lvlJc w:val="left"/>
+      <w:pPr>
+        <w:ind w:left="5760" w:hanging="360"/>
+      </w:pPr>
+      <w:rPr>
+        <w:rFonts w:ascii="Courier New" w:hAnsi="Courier New" w:cs="Courier New" w:hint="default"/>
+      </w:rPr>
+    </w:lvl>
+    <w:lvl w:ilvl="8" w:tplc="042A0005" w:tentative="1">
+      <w:start w:val="1"/>
+      <w:numFmt w:val="bullet"/>
+      <w:lvlText w:val=""/>
+      <w:lvlJc w:val="left"/>
+      <w:pPr>
+        <w:ind w:left="6480" w:hanging="360"/>
+      </w:pPr>
+      <w:rPr>
+        <w:rFonts w:ascii="Wingdings" w:hAnsi="Wingdings" w:hint="default"/>
+      </w:rPr>
+    </w:lvl>
+  </w:abstractNum>
+  <w:abstractNum w:abstractNumId="8" w15:restartNumberingAfterBreak="0">
     <w:nsid w:val="5354769E"/>
     <w:multiLevelType w:val="hybridMultilevel"/>
     <w:tmpl w:val="28D4C25E"/>
@@ -3361,7 +4880,270 @@
       </w:rPr>
     </w:lvl>
   </w:abstractNum>
-  <w:abstractNum w:abstractNumId="3" w15:restartNumberingAfterBreak="0">
+  <w:abstractNum w:abstractNumId="9" w15:restartNumberingAfterBreak="0">
+    <w:nsid w:val="53762CCB"/>
+    <w:multiLevelType w:val="hybridMultilevel"/>
+    <w:tmpl w:val="DE446A1A"/>
+    <w:lvl w:ilvl="0" w:tplc="F4983460">
+      <w:start w:val="1"/>
+      <w:numFmt w:val="bullet"/>
+      <w:lvlText w:val="●"/>
+      <w:lvlJc w:val="left"/>
+      <w:pPr>
+        <w:ind w:left="720" w:hanging="360"/>
+      </w:pPr>
+      <w:rPr>
+        <w:rFonts w:ascii="Times New Roman" w:hAnsi="Times New Roman" w:cs="Times New Roman" w:hint="default"/>
+        <w:sz w:val="26"/>
+      </w:rPr>
+    </w:lvl>
+    <w:lvl w:ilvl="1" w:tplc="042A0003" w:tentative="1">
+      <w:start w:val="1"/>
+      <w:numFmt w:val="bullet"/>
+      <w:lvlText w:val="o"/>
+      <w:lvlJc w:val="left"/>
+      <w:pPr>
+        <w:ind w:left="1440" w:hanging="360"/>
+      </w:pPr>
+      <w:rPr>
+        <w:rFonts w:ascii="Courier New" w:hAnsi="Courier New" w:cs="Courier New" w:hint="default"/>
+      </w:rPr>
+    </w:lvl>
+    <w:lvl w:ilvl="2" w:tplc="042A0005" w:tentative="1">
+      <w:start w:val="1"/>
+      <w:numFmt w:val="bullet"/>
+      <w:lvlText w:val=""/>
+      <w:lvlJc w:val="left"/>
+      <w:pPr>
+        <w:ind w:left="2160" w:hanging="360"/>
+      </w:pPr>
+      <w:rPr>
+        <w:rFonts w:ascii="Wingdings" w:hAnsi="Wingdings" w:hint="default"/>
+      </w:rPr>
+    </w:lvl>
+    <w:lvl w:ilvl="3" w:tplc="042A0001" w:tentative="1">
+      <w:start w:val="1"/>
+      <w:numFmt w:val="bullet"/>
+      <w:lvlText w:val=""/>
+      <w:lvlJc w:val="left"/>
+      <w:pPr>
+        <w:ind w:left="2880" w:hanging="360"/>
+      </w:pPr>
+      <w:rPr>
+        <w:rFonts w:ascii="Symbol" w:hAnsi="Symbol" w:hint="default"/>
+      </w:rPr>
+    </w:lvl>
+    <w:lvl w:ilvl="4" w:tplc="042A0003" w:tentative="1">
+      <w:start w:val="1"/>
+      <w:numFmt w:val="bullet"/>
+      <w:lvlText w:val="o"/>
+      <w:lvlJc w:val="left"/>
+      <w:pPr>
+        <w:ind w:left="3600" w:hanging="360"/>
+      </w:pPr>
+      <w:rPr>
+        <w:rFonts w:ascii="Courier New" w:hAnsi="Courier New" w:cs="Courier New" w:hint="default"/>
+      </w:rPr>
+    </w:lvl>
+    <w:lvl w:ilvl="5" w:tplc="042A0005" w:tentative="1">
+      <w:start w:val="1"/>
+      <w:numFmt w:val="bullet"/>
+      <w:lvlText w:val=""/>
+      <w:lvlJc w:val="left"/>
+      <w:pPr>
+        <w:ind w:left="4320" w:hanging="360"/>
+      </w:pPr>
+      <w:rPr>
+        <w:rFonts w:ascii="Wingdings" w:hAnsi="Wingdings" w:hint="default"/>
+      </w:rPr>
+    </w:lvl>
+    <w:lvl w:ilvl="6" w:tplc="042A0001" w:tentative="1">
+      <w:start w:val="1"/>
+      <w:numFmt w:val="bullet"/>
+      <w:lvlText w:val=""/>
+      <w:lvlJc w:val="left"/>
+      <w:pPr>
+        <w:ind w:left="5040" w:hanging="360"/>
+      </w:pPr>
+      <w:rPr>
+        <w:rFonts w:ascii="Symbol" w:hAnsi="Symbol" w:hint="default"/>
+      </w:rPr>
+    </w:lvl>
+    <w:lvl w:ilvl="7" w:tplc="042A0003" w:tentative="1">
+      <w:start w:val="1"/>
+      <w:numFmt w:val="bullet"/>
+      <w:lvlText w:val="o"/>
+      <w:lvlJc w:val="left"/>
+      <w:pPr>
+        <w:ind w:left="5760" w:hanging="360"/>
+      </w:pPr>
+      <w:rPr>
+        <w:rFonts w:ascii="Courier New" w:hAnsi="Courier New" w:cs="Courier New" w:hint="default"/>
+      </w:rPr>
+    </w:lvl>
+    <w:lvl w:ilvl="8" w:tplc="042A0005" w:tentative="1">
+      <w:start w:val="1"/>
+      <w:numFmt w:val="bullet"/>
+      <w:lvlText w:val=""/>
+      <w:lvlJc w:val="left"/>
+      <w:pPr>
+        <w:ind w:left="6480" w:hanging="360"/>
+      </w:pPr>
+      <w:rPr>
+        <w:rFonts w:ascii="Wingdings" w:hAnsi="Wingdings" w:hint="default"/>
+      </w:rPr>
+    </w:lvl>
+  </w:abstractNum>
+  <w:abstractNum w:abstractNumId="10" w15:restartNumberingAfterBreak="0">
+    <w:nsid w:val="53E00C2A"/>
+    <w:multiLevelType w:val="multilevel"/>
+    <w:tmpl w:val="AA4E0332"/>
+    <w:lvl w:ilvl="0">
+      <w:start w:val="1"/>
+      <w:numFmt w:val="bullet"/>
+      <w:lvlText w:val=""/>
+      <w:lvlJc w:val="left"/>
+      <w:pPr>
+        <w:tabs>
+          <w:tab w:val="num" w:pos="720"/>
+        </w:tabs>
+        <w:ind w:left="720" w:hanging="360"/>
+      </w:pPr>
+      <w:rPr>
+        <w:rFonts w:ascii="Symbol" w:hAnsi="Symbol" w:hint="default"/>
+        <w:sz w:val="20"/>
+      </w:rPr>
+    </w:lvl>
+    <w:lvl w:ilvl="1">
+      <w:start w:val="1"/>
+      <w:numFmt w:val="bullet"/>
+      <w:lvlText w:val="o"/>
+      <w:lvlJc w:val="left"/>
+      <w:pPr>
+        <w:tabs>
+          <w:tab w:val="num" w:pos="1440"/>
+        </w:tabs>
+        <w:ind w:left="1440" w:hanging="360"/>
+      </w:pPr>
+      <w:rPr>
+        <w:rFonts w:ascii="Courier New" w:hAnsi="Courier New" w:hint="default"/>
+        <w:sz w:val="20"/>
+      </w:rPr>
+    </w:lvl>
+    <w:lvl w:ilvl="2" w:tentative="1">
+      <w:start w:val="1"/>
+      <w:numFmt w:val="bullet"/>
+      <w:lvlText w:val=""/>
+      <w:lvlJc w:val="left"/>
+      <w:pPr>
+        <w:tabs>
+          <w:tab w:val="num" w:pos="2160"/>
+        </w:tabs>
+        <w:ind w:left="2160" w:hanging="360"/>
+      </w:pPr>
+      <w:rPr>
+        <w:rFonts w:ascii="Wingdings" w:hAnsi="Wingdings" w:hint="default"/>
+        <w:sz w:val="20"/>
+      </w:rPr>
+    </w:lvl>
+    <w:lvl w:ilvl="3" w:tentative="1">
+      <w:start w:val="1"/>
+      <w:numFmt w:val="bullet"/>
+      <w:lvlText w:val=""/>
+      <w:lvlJc w:val="left"/>
+      <w:pPr>
+        <w:tabs>
+          <w:tab w:val="num" w:pos="2880"/>
+        </w:tabs>
+        <w:ind w:left="2880" w:hanging="360"/>
+      </w:pPr>
+      <w:rPr>
+        <w:rFonts w:ascii="Wingdings" w:hAnsi="Wingdings" w:hint="default"/>
+        <w:sz w:val="20"/>
+      </w:rPr>
+    </w:lvl>
+    <w:lvl w:ilvl="4" w:tentative="1">
+      <w:start w:val="1"/>
+      <w:numFmt w:val="bullet"/>
+      <w:lvlText w:val=""/>
+      <w:lvlJc w:val="left"/>
+      <w:pPr>
+        <w:tabs>
+          <w:tab w:val="num" w:pos="3600"/>
+        </w:tabs>
+        <w:ind w:left="3600" w:hanging="360"/>
+      </w:pPr>
+      <w:rPr>
+        <w:rFonts w:ascii="Wingdings" w:hAnsi="Wingdings" w:hint="default"/>
+        <w:sz w:val="20"/>
+      </w:rPr>
+    </w:lvl>
+    <w:lvl w:ilvl="5" w:tentative="1">
+      <w:start w:val="1"/>
+      <w:numFmt w:val="bullet"/>
+      <w:lvlText w:val=""/>
+      <w:lvlJc w:val="left"/>
+      <w:pPr>
+        <w:tabs>
+          <w:tab w:val="num" w:pos="4320"/>
+        </w:tabs>
+        <w:ind w:left="4320" w:hanging="360"/>
+      </w:pPr>
+      <w:rPr>
+        <w:rFonts w:ascii="Wingdings" w:hAnsi="Wingdings" w:hint="default"/>
+        <w:sz w:val="20"/>
+      </w:rPr>
+    </w:lvl>
+    <w:lvl w:ilvl="6" w:tentative="1">
+      <w:start w:val="1"/>
+      <w:numFmt w:val="bullet"/>
+      <w:lvlText w:val=""/>
+      <w:lvlJc w:val="left"/>
+      <w:pPr>
+        <w:tabs>
+          <w:tab w:val="num" w:pos="5040"/>
+        </w:tabs>
+        <w:ind w:left="5040" w:hanging="360"/>
+      </w:pPr>
+      <w:rPr>
+        <w:rFonts w:ascii="Wingdings" w:hAnsi="Wingdings" w:hint="default"/>
+        <w:sz w:val="20"/>
+      </w:rPr>
+    </w:lvl>
+    <w:lvl w:ilvl="7" w:tentative="1">
+      <w:start w:val="1"/>
+      <w:numFmt w:val="bullet"/>
+      <w:lvlText w:val=""/>
+      <w:lvlJc w:val="left"/>
+      <w:pPr>
+        <w:tabs>
+          <w:tab w:val="num" w:pos="5760"/>
+        </w:tabs>
+        <w:ind w:left="5760" w:hanging="360"/>
+      </w:pPr>
+      <w:rPr>
+        <w:rFonts w:ascii="Wingdings" w:hAnsi="Wingdings" w:hint="default"/>
+        <w:sz w:val="20"/>
+      </w:rPr>
+    </w:lvl>
+    <w:lvl w:ilvl="8" w:tentative="1">
+      <w:start w:val="1"/>
+      <w:numFmt w:val="bullet"/>
+      <w:lvlText w:val=""/>
+      <w:lvlJc w:val="left"/>
+      <w:pPr>
+        <w:tabs>
+          <w:tab w:val="num" w:pos="6480"/>
+        </w:tabs>
+        <w:ind w:left="6480" w:hanging="360"/>
+      </w:pPr>
+      <w:rPr>
+        <w:rFonts w:ascii="Wingdings" w:hAnsi="Wingdings" w:hint="default"/>
+        <w:sz w:val="20"/>
+      </w:rPr>
+    </w:lvl>
+  </w:abstractNum>
+  <w:abstractNum w:abstractNumId="11" w15:restartNumberingAfterBreak="0">
     <w:nsid w:val="74900DDA"/>
     <w:multiLevelType w:val="hybridMultilevel"/>
     <w:tmpl w:val="453EBD3A"/>
@@ -3447,17 +5229,544 @@
       </w:pPr>
     </w:lvl>
   </w:abstractNum>
+  <w:abstractNum w:abstractNumId="12" w15:restartNumberingAfterBreak="0">
+    <w:nsid w:val="796314E2"/>
+    <w:multiLevelType w:val="hybridMultilevel"/>
+    <w:tmpl w:val="026E7F3E"/>
+    <w:lvl w:ilvl="0" w:tplc="042A0005">
+      <w:start w:val="1"/>
+      <w:numFmt w:val="bullet"/>
+      <w:lvlText w:val=""/>
+      <w:lvlJc w:val="left"/>
+      <w:pPr>
+        <w:ind w:left="720" w:hanging="360"/>
+      </w:pPr>
+      <w:rPr>
+        <w:rFonts w:ascii="Wingdings" w:hAnsi="Wingdings" w:hint="default"/>
+        <w:sz w:val="26"/>
+      </w:rPr>
+    </w:lvl>
+    <w:lvl w:ilvl="1" w:tplc="FFFFFFFF" w:tentative="1">
+      <w:start w:val="1"/>
+      <w:numFmt w:val="bullet"/>
+      <w:lvlText w:val="o"/>
+      <w:lvlJc w:val="left"/>
+      <w:pPr>
+        <w:ind w:left="1440" w:hanging="360"/>
+      </w:pPr>
+      <w:rPr>
+        <w:rFonts w:ascii="Courier New" w:hAnsi="Courier New" w:cs="Courier New" w:hint="default"/>
+      </w:rPr>
+    </w:lvl>
+    <w:lvl w:ilvl="2" w:tplc="FFFFFFFF" w:tentative="1">
+      <w:start w:val="1"/>
+      <w:numFmt w:val="bullet"/>
+      <w:lvlText w:val=""/>
+      <w:lvlJc w:val="left"/>
+      <w:pPr>
+        <w:ind w:left="2160" w:hanging="360"/>
+      </w:pPr>
+      <w:rPr>
+        <w:rFonts w:ascii="Wingdings" w:hAnsi="Wingdings" w:hint="default"/>
+      </w:rPr>
+    </w:lvl>
+    <w:lvl w:ilvl="3" w:tplc="FFFFFFFF" w:tentative="1">
+      <w:start w:val="1"/>
+      <w:numFmt w:val="bullet"/>
+      <w:lvlText w:val=""/>
+      <w:lvlJc w:val="left"/>
+      <w:pPr>
+        <w:ind w:left="2880" w:hanging="360"/>
+      </w:pPr>
+      <w:rPr>
+        <w:rFonts w:ascii="Symbol" w:hAnsi="Symbol" w:hint="default"/>
+      </w:rPr>
+    </w:lvl>
+    <w:lvl w:ilvl="4" w:tplc="FFFFFFFF" w:tentative="1">
+      <w:start w:val="1"/>
+      <w:numFmt w:val="bullet"/>
+      <w:lvlText w:val="o"/>
+      <w:lvlJc w:val="left"/>
+      <w:pPr>
+        <w:ind w:left="3600" w:hanging="360"/>
+      </w:pPr>
+      <w:rPr>
+        <w:rFonts w:ascii="Courier New" w:hAnsi="Courier New" w:cs="Courier New" w:hint="default"/>
+      </w:rPr>
+    </w:lvl>
+    <w:lvl w:ilvl="5" w:tplc="FFFFFFFF" w:tentative="1">
+      <w:start w:val="1"/>
+      <w:numFmt w:val="bullet"/>
+      <w:lvlText w:val=""/>
+      <w:lvlJc w:val="left"/>
+      <w:pPr>
+        <w:ind w:left="4320" w:hanging="360"/>
+      </w:pPr>
+      <w:rPr>
+        <w:rFonts w:ascii="Wingdings" w:hAnsi="Wingdings" w:hint="default"/>
+      </w:rPr>
+    </w:lvl>
+    <w:lvl w:ilvl="6" w:tplc="FFFFFFFF" w:tentative="1">
+      <w:start w:val="1"/>
+      <w:numFmt w:val="bullet"/>
+      <w:lvlText w:val=""/>
+      <w:lvlJc w:val="left"/>
+      <w:pPr>
+        <w:ind w:left="5040" w:hanging="360"/>
+      </w:pPr>
+      <w:rPr>
+        <w:rFonts w:ascii="Symbol" w:hAnsi="Symbol" w:hint="default"/>
+      </w:rPr>
+    </w:lvl>
+    <w:lvl w:ilvl="7" w:tplc="FFFFFFFF" w:tentative="1">
+      <w:start w:val="1"/>
+      <w:numFmt w:val="bullet"/>
+      <w:lvlText w:val="o"/>
+      <w:lvlJc w:val="left"/>
+      <w:pPr>
+        <w:ind w:left="5760" w:hanging="360"/>
+      </w:pPr>
+      <w:rPr>
+        <w:rFonts w:ascii="Courier New" w:hAnsi="Courier New" w:cs="Courier New" w:hint="default"/>
+      </w:rPr>
+    </w:lvl>
+    <w:lvl w:ilvl="8" w:tplc="FFFFFFFF" w:tentative="1">
+      <w:start w:val="1"/>
+      <w:numFmt w:val="bullet"/>
+      <w:lvlText w:val=""/>
+      <w:lvlJc w:val="left"/>
+      <w:pPr>
+        <w:ind w:left="6480" w:hanging="360"/>
+      </w:pPr>
+      <w:rPr>
+        <w:rFonts w:ascii="Wingdings" w:hAnsi="Wingdings" w:hint="default"/>
+      </w:rPr>
+    </w:lvl>
+  </w:abstractNum>
+  <w:abstractNum w:abstractNumId="13" w15:restartNumberingAfterBreak="0">
+    <w:nsid w:val="7E07247E"/>
+    <w:multiLevelType w:val="hybridMultilevel"/>
+    <w:tmpl w:val="1EDAEEB8"/>
+    <w:lvl w:ilvl="0" w:tplc="042A0005">
+      <w:start w:val="1"/>
+      <w:numFmt w:val="bullet"/>
+      <w:lvlText w:val=""/>
+      <w:lvlJc w:val="left"/>
+      <w:pPr>
+        <w:ind w:left="720" w:hanging="360"/>
+      </w:pPr>
+      <w:rPr>
+        <w:rFonts w:ascii="Wingdings" w:hAnsi="Wingdings" w:hint="default"/>
+        <w:sz w:val="26"/>
+      </w:rPr>
+    </w:lvl>
+    <w:lvl w:ilvl="1" w:tplc="FFFFFFFF" w:tentative="1">
+      <w:start w:val="1"/>
+      <w:numFmt w:val="bullet"/>
+      <w:lvlText w:val="o"/>
+      <w:lvlJc w:val="left"/>
+      <w:pPr>
+        <w:ind w:left="1440" w:hanging="360"/>
+      </w:pPr>
+      <w:rPr>
+        <w:rFonts w:ascii="Courier New" w:hAnsi="Courier New" w:cs="Courier New" w:hint="default"/>
+      </w:rPr>
+    </w:lvl>
+    <w:lvl w:ilvl="2" w:tplc="FFFFFFFF" w:tentative="1">
+      <w:start w:val="1"/>
+      <w:numFmt w:val="bullet"/>
+      <w:lvlText w:val=""/>
+      <w:lvlJc w:val="left"/>
+      <w:pPr>
+        <w:ind w:left="2160" w:hanging="360"/>
+      </w:pPr>
+      <w:rPr>
+        <w:rFonts w:ascii="Wingdings" w:hAnsi="Wingdings" w:hint="default"/>
+      </w:rPr>
+    </w:lvl>
+    <w:lvl w:ilvl="3" w:tplc="FFFFFFFF" w:tentative="1">
+      <w:start w:val="1"/>
+      <w:numFmt w:val="bullet"/>
+      <w:lvlText w:val=""/>
+      <w:lvlJc w:val="left"/>
+      <w:pPr>
+        <w:ind w:left="2880" w:hanging="360"/>
+      </w:pPr>
+      <w:rPr>
+        <w:rFonts w:ascii="Symbol" w:hAnsi="Symbol" w:hint="default"/>
+      </w:rPr>
+    </w:lvl>
+    <w:lvl w:ilvl="4" w:tplc="FFFFFFFF" w:tentative="1">
+      <w:start w:val="1"/>
+      <w:numFmt w:val="bullet"/>
+      <w:lvlText w:val="o"/>
+      <w:lvlJc w:val="left"/>
+      <w:pPr>
+        <w:ind w:left="3600" w:hanging="360"/>
+      </w:pPr>
+      <w:rPr>
+        <w:rFonts w:ascii="Courier New" w:hAnsi="Courier New" w:cs="Courier New" w:hint="default"/>
+      </w:rPr>
+    </w:lvl>
+    <w:lvl w:ilvl="5" w:tplc="FFFFFFFF" w:tentative="1">
+      <w:start w:val="1"/>
+      <w:numFmt w:val="bullet"/>
+      <w:lvlText w:val=""/>
+      <w:lvlJc w:val="left"/>
+      <w:pPr>
+        <w:ind w:left="4320" w:hanging="360"/>
+      </w:pPr>
+      <w:rPr>
+        <w:rFonts w:ascii="Wingdings" w:hAnsi="Wingdings" w:hint="default"/>
+      </w:rPr>
+    </w:lvl>
+    <w:lvl w:ilvl="6" w:tplc="FFFFFFFF" w:tentative="1">
+      <w:start w:val="1"/>
+      <w:numFmt w:val="bullet"/>
+      <w:lvlText w:val=""/>
+      <w:lvlJc w:val="left"/>
+      <w:pPr>
+        <w:ind w:left="5040" w:hanging="360"/>
+      </w:pPr>
+      <w:rPr>
+        <w:rFonts w:ascii="Symbol" w:hAnsi="Symbol" w:hint="default"/>
+      </w:rPr>
+    </w:lvl>
+    <w:lvl w:ilvl="7" w:tplc="FFFFFFFF" w:tentative="1">
+      <w:start w:val="1"/>
+      <w:numFmt w:val="bullet"/>
+      <w:lvlText w:val="o"/>
+      <w:lvlJc w:val="left"/>
+      <w:pPr>
+        <w:ind w:left="5760" w:hanging="360"/>
+      </w:pPr>
+      <w:rPr>
+        <w:rFonts w:ascii="Courier New" w:hAnsi="Courier New" w:cs="Courier New" w:hint="default"/>
+      </w:rPr>
+    </w:lvl>
+    <w:lvl w:ilvl="8" w:tplc="FFFFFFFF" w:tentative="1">
+      <w:start w:val="1"/>
+      <w:numFmt w:val="bullet"/>
+      <w:lvlText w:val=""/>
+      <w:lvlJc w:val="left"/>
+      <w:pPr>
+        <w:ind w:left="6480" w:hanging="360"/>
+      </w:pPr>
+      <w:rPr>
+        <w:rFonts w:ascii="Wingdings" w:hAnsi="Wingdings" w:hint="default"/>
+      </w:rPr>
+    </w:lvl>
+  </w:abstractNum>
+  <w:abstractNum w:abstractNumId="14" w15:restartNumberingAfterBreak="0">
+    <w:nsid w:val="7EB405F8"/>
+    <w:multiLevelType w:val="hybridMultilevel"/>
+    <w:tmpl w:val="244E4D28"/>
+    <w:lvl w:ilvl="0" w:tplc="042A0001">
+      <w:start w:val="1"/>
+      <w:numFmt w:val="bullet"/>
+      <w:lvlText w:val=""/>
+      <w:lvlJc w:val="left"/>
+      <w:pPr>
+        <w:ind w:left="720" w:hanging="360"/>
+      </w:pPr>
+      <w:rPr>
+        <w:rFonts w:ascii="Symbol" w:hAnsi="Symbol" w:hint="default"/>
+        <w:sz w:val="26"/>
+      </w:rPr>
+    </w:lvl>
+    <w:lvl w:ilvl="1" w:tplc="FFFFFFFF" w:tentative="1">
+      <w:start w:val="1"/>
+      <w:numFmt w:val="bullet"/>
+      <w:lvlText w:val="o"/>
+      <w:lvlJc w:val="left"/>
+      <w:pPr>
+        <w:ind w:left="1440" w:hanging="360"/>
+      </w:pPr>
+      <w:rPr>
+        <w:rFonts w:ascii="Courier New" w:hAnsi="Courier New" w:cs="Courier New" w:hint="default"/>
+      </w:rPr>
+    </w:lvl>
+    <w:lvl w:ilvl="2" w:tplc="FFFFFFFF" w:tentative="1">
+      <w:start w:val="1"/>
+      <w:numFmt w:val="bullet"/>
+      <w:lvlText w:val=""/>
+      <w:lvlJc w:val="left"/>
+      <w:pPr>
+        <w:ind w:left="2160" w:hanging="360"/>
+      </w:pPr>
+      <w:rPr>
+        <w:rFonts w:ascii="Wingdings" w:hAnsi="Wingdings" w:hint="default"/>
+      </w:rPr>
+    </w:lvl>
+    <w:lvl w:ilvl="3" w:tplc="FFFFFFFF" w:tentative="1">
+      <w:start w:val="1"/>
+      <w:numFmt w:val="bullet"/>
+      <w:lvlText w:val=""/>
+      <w:lvlJc w:val="left"/>
+      <w:pPr>
+        <w:ind w:left="2880" w:hanging="360"/>
+      </w:pPr>
+      <w:rPr>
+        <w:rFonts w:ascii="Symbol" w:hAnsi="Symbol" w:hint="default"/>
+      </w:rPr>
+    </w:lvl>
+    <w:lvl w:ilvl="4" w:tplc="FFFFFFFF" w:tentative="1">
+      <w:start w:val="1"/>
+      <w:numFmt w:val="bullet"/>
+      <w:lvlText w:val="o"/>
+      <w:lvlJc w:val="left"/>
+      <w:pPr>
+        <w:ind w:left="3600" w:hanging="360"/>
+      </w:pPr>
+      <w:rPr>
+        <w:rFonts w:ascii="Courier New" w:hAnsi="Courier New" w:cs="Courier New" w:hint="default"/>
+      </w:rPr>
+    </w:lvl>
+    <w:lvl w:ilvl="5" w:tplc="FFFFFFFF" w:tentative="1">
+      <w:start w:val="1"/>
+      <w:numFmt w:val="bullet"/>
+      <w:lvlText w:val=""/>
+      <w:lvlJc w:val="left"/>
+      <w:pPr>
+        <w:ind w:left="4320" w:hanging="360"/>
+      </w:pPr>
+      <w:rPr>
+        <w:rFonts w:ascii="Wingdings" w:hAnsi="Wingdings" w:hint="default"/>
+      </w:rPr>
+    </w:lvl>
+    <w:lvl w:ilvl="6" w:tplc="FFFFFFFF" w:tentative="1">
+      <w:start w:val="1"/>
+      <w:numFmt w:val="bullet"/>
+      <w:lvlText w:val=""/>
+      <w:lvlJc w:val="left"/>
+      <w:pPr>
+        <w:ind w:left="5040" w:hanging="360"/>
+      </w:pPr>
+      <w:rPr>
+        <w:rFonts w:ascii="Symbol" w:hAnsi="Symbol" w:hint="default"/>
+      </w:rPr>
+    </w:lvl>
+    <w:lvl w:ilvl="7" w:tplc="FFFFFFFF" w:tentative="1">
+      <w:start w:val="1"/>
+      <w:numFmt w:val="bullet"/>
+      <w:lvlText w:val="o"/>
+      <w:lvlJc w:val="left"/>
+      <w:pPr>
+        <w:ind w:left="5760" w:hanging="360"/>
+      </w:pPr>
+      <w:rPr>
+        <w:rFonts w:ascii="Courier New" w:hAnsi="Courier New" w:cs="Courier New" w:hint="default"/>
+      </w:rPr>
+    </w:lvl>
+    <w:lvl w:ilvl="8" w:tplc="FFFFFFFF" w:tentative="1">
+      <w:start w:val="1"/>
+      <w:numFmt w:val="bullet"/>
+      <w:lvlText w:val=""/>
+      <w:lvlJc w:val="left"/>
+      <w:pPr>
+        <w:ind w:left="6480" w:hanging="360"/>
+      </w:pPr>
+      <w:rPr>
+        <w:rFonts w:ascii="Wingdings" w:hAnsi="Wingdings" w:hint="default"/>
+      </w:rPr>
+    </w:lvl>
+  </w:abstractNum>
+  <w:abstractNum w:abstractNumId="15" w15:restartNumberingAfterBreak="0">
+    <w:nsid w:val="7FA002B9"/>
+    <w:multiLevelType w:val="multilevel"/>
+    <w:tmpl w:val="515EE1DE"/>
+    <w:lvl w:ilvl="0">
+      <w:start w:val="1"/>
+      <w:numFmt w:val="bullet"/>
+      <w:lvlText w:val=""/>
+      <w:lvlJc w:val="left"/>
+      <w:pPr>
+        <w:tabs>
+          <w:tab w:val="num" w:pos="720"/>
+        </w:tabs>
+        <w:ind w:left="720" w:hanging="360"/>
+      </w:pPr>
+      <w:rPr>
+        <w:rFonts w:ascii="Symbol" w:hAnsi="Symbol" w:hint="default"/>
+        <w:sz w:val="20"/>
+      </w:rPr>
+    </w:lvl>
+    <w:lvl w:ilvl="1">
+      <w:start w:val="1"/>
+      <w:numFmt w:val="bullet"/>
+      <w:lvlText w:val="o"/>
+      <w:lvlJc w:val="left"/>
+      <w:pPr>
+        <w:tabs>
+          <w:tab w:val="num" w:pos="1440"/>
+        </w:tabs>
+        <w:ind w:left="1440" w:hanging="360"/>
+      </w:pPr>
+      <w:rPr>
+        <w:rFonts w:ascii="Courier New" w:hAnsi="Courier New" w:hint="default"/>
+        <w:sz w:val="20"/>
+      </w:rPr>
+    </w:lvl>
+    <w:lvl w:ilvl="2" w:tentative="1">
+      <w:start w:val="1"/>
+      <w:numFmt w:val="bullet"/>
+      <w:lvlText w:val=""/>
+      <w:lvlJc w:val="left"/>
+      <w:pPr>
+        <w:tabs>
+          <w:tab w:val="num" w:pos="2160"/>
+        </w:tabs>
+        <w:ind w:left="2160" w:hanging="360"/>
+      </w:pPr>
+      <w:rPr>
+        <w:rFonts w:ascii="Wingdings" w:hAnsi="Wingdings" w:hint="default"/>
+        <w:sz w:val="20"/>
+      </w:rPr>
+    </w:lvl>
+    <w:lvl w:ilvl="3" w:tentative="1">
+      <w:start w:val="1"/>
+      <w:numFmt w:val="bullet"/>
+      <w:lvlText w:val=""/>
+      <w:lvlJc w:val="left"/>
+      <w:pPr>
+        <w:tabs>
+          <w:tab w:val="num" w:pos="2880"/>
+        </w:tabs>
+        <w:ind w:left="2880" w:hanging="360"/>
+      </w:pPr>
+      <w:rPr>
+        <w:rFonts w:ascii="Wingdings" w:hAnsi="Wingdings" w:hint="default"/>
+        <w:sz w:val="20"/>
+      </w:rPr>
+    </w:lvl>
+    <w:lvl w:ilvl="4" w:tentative="1">
+      <w:start w:val="1"/>
+      <w:numFmt w:val="bullet"/>
+      <w:lvlText w:val=""/>
+      <w:lvlJc w:val="left"/>
+      <w:pPr>
+        <w:tabs>
+          <w:tab w:val="num" w:pos="3600"/>
+        </w:tabs>
+        <w:ind w:left="3600" w:hanging="360"/>
+      </w:pPr>
+      <w:rPr>
+        <w:rFonts w:ascii="Wingdings" w:hAnsi="Wingdings" w:hint="default"/>
+        <w:sz w:val="20"/>
+      </w:rPr>
+    </w:lvl>
+    <w:lvl w:ilvl="5" w:tentative="1">
+      <w:start w:val="1"/>
+      <w:numFmt w:val="bullet"/>
+      <w:lvlText w:val=""/>
+      <w:lvlJc w:val="left"/>
+      <w:pPr>
+        <w:tabs>
+          <w:tab w:val="num" w:pos="4320"/>
+        </w:tabs>
+        <w:ind w:left="4320" w:hanging="360"/>
+      </w:pPr>
+      <w:rPr>
+        <w:rFonts w:ascii="Wingdings" w:hAnsi="Wingdings" w:hint="default"/>
+        <w:sz w:val="20"/>
+      </w:rPr>
+    </w:lvl>
+    <w:lvl w:ilvl="6" w:tentative="1">
+      <w:start w:val="1"/>
+      <w:numFmt w:val="bullet"/>
+      <w:lvlText w:val=""/>
+      <w:lvlJc w:val="left"/>
+      <w:pPr>
+        <w:tabs>
+          <w:tab w:val="num" w:pos="5040"/>
+        </w:tabs>
+        <w:ind w:left="5040" w:hanging="360"/>
+      </w:pPr>
+      <w:rPr>
+        <w:rFonts w:ascii="Wingdings" w:hAnsi="Wingdings" w:hint="default"/>
+        <w:sz w:val="20"/>
+      </w:rPr>
+    </w:lvl>
+    <w:lvl w:ilvl="7" w:tentative="1">
+      <w:start w:val="1"/>
+      <w:numFmt w:val="bullet"/>
+      <w:lvlText w:val=""/>
+      <w:lvlJc w:val="left"/>
+      <w:pPr>
+        <w:tabs>
+          <w:tab w:val="num" w:pos="5760"/>
+        </w:tabs>
+        <w:ind w:left="5760" w:hanging="360"/>
+      </w:pPr>
+      <w:rPr>
+        <w:rFonts w:ascii="Wingdings" w:hAnsi="Wingdings" w:hint="default"/>
+        <w:sz w:val="20"/>
+      </w:rPr>
+    </w:lvl>
+    <w:lvl w:ilvl="8" w:tentative="1">
+      <w:start w:val="1"/>
+      <w:numFmt w:val="bullet"/>
+      <w:lvlText w:val=""/>
+      <w:lvlJc w:val="left"/>
+      <w:pPr>
+        <w:tabs>
+          <w:tab w:val="num" w:pos="6480"/>
+        </w:tabs>
+        <w:ind w:left="6480" w:hanging="360"/>
+      </w:pPr>
+      <w:rPr>
+        <w:rFonts w:ascii="Wingdings" w:hAnsi="Wingdings" w:hint="default"/>
+        <w:sz w:val="20"/>
+      </w:rPr>
+    </w:lvl>
+  </w:abstractNum>
   <w:num w:numId="1" w16cid:durableId="1933321130">
-    <w:abstractNumId w:val="3"/>
+    <w:abstractNumId w:val="11"/>
   </w:num>
   <w:num w:numId="2" w16cid:durableId="1674337789">
     <w:abstractNumId w:val="0"/>
   </w:num>
   <w:num w:numId="3" w16cid:durableId="336153550">
-    <w:abstractNumId w:val="2"/>
+    <w:abstractNumId w:val="8"/>
   </w:num>
   <w:num w:numId="4" w16cid:durableId="1942294008">
     <w:abstractNumId w:val="1"/>
+  </w:num>
+  <w:num w:numId="5" w16cid:durableId="1584878620">
+    <w:abstractNumId w:val="4"/>
+  </w:num>
+  <w:num w:numId="6" w16cid:durableId="1084499910">
+    <w:abstractNumId w:val="3"/>
+  </w:num>
+  <w:num w:numId="7" w16cid:durableId="1652249041">
+    <w:abstractNumId w:val="15"/>
+  </w:num>
+  <w:num w:numId="8" w16cid:durableId="2023505597">
+    <w:abstractNumId w:val="10"/>
+  </w:num>
+  <w:num w:numId="9" w16cid:durableId="863441985">
+    <w:abstractNumId w:val="7"/>
+  </w:num>
+  <w:num w:numId="10" w16cid:durableId="591210238">
+    <w:abstractNumId w:val="13"/>
+  </w:num>
+  <w:num w:numId="11" w16cid:durableId="582689003">
+    <w:abstractNumId w:val="2"/>
+  </w:num>
+  <w:num w:numId="12" w16cid:durableId="383145544">
+    <w:abstractNumId w:val="9"/>
+  </w:num>
+  <w:num w:numId="13" w16cid:durableId="856194340">
+    <w:abstractNumId w:val="14"/>
+  </w:num>
+  <w:num w:numId="14" w16cid:durableId="1159422852">
+    <w:abstractNumId w:val="12"/>
+  </w:num>
+  <w:num w:numId="15" w16cid:durableId="397478872">
+    <w:abstractNumId w:val="5"/>
+  </w:num>
+  <w:num w:numId="16" w16cid:durableId="699402889">
+    <w:abstractNumId w:val="6"/>
   </w:num>
 </w:numbering>
 </file>
@@ -3934,7 +6243,7 @@
     <w:uiPriority w:val="9"/>
     <w:unhideWhenUsed/>
     <w:qFormat/>
-    <w:rsid w:val="00896224"/>
+    <w:rsid w:val="001D48F8"/>
     <w:pPr>
       <w:keepNext/>
       <w:keepLines/>
@@ -3953,22 +6262,22 @@
     <w:basedOn w:val="Normal"/>
     <w:next w:val="Normal"/>
     <w:link w:val="Heading4Char"/>
+    <w:autoRedefine/>
     <w:uiPriority w:val="9"/>
-    <w:semiHidden/>
     <w:unhideWhenUsed/>
     <w:qFormat/>
-    <w:rsid w:val="005E0398"/>
+    <w:rsid w:val="00A06EFB"/>
     <w:pPr>
       <w:keepNext/>
       <w:keepLines/>
       <w:spacing w:before="80" w:after="40"/>
+      <w:ind w:firstLine="284"/>
       <w:outlineLvl w:val="3"/>
     </w:pPr>
     <w:rPr>
       <w:rFonts w:eastAsiaTheme="majorEastAsia" w:cstheme="majorBidi"/>
-      <w:i/>
+      <w:b/>
       <w:iCs/>
-      <w:color w:val="0F4761" w:themeColor="accent1" w:themeShade="BF"/>
     </w:rPr>
   </w:style>
   <w:style w:type="paragraph" w:styleId="Heading5">
@@ -4083,7 +6392,6 @@
   <w:style w:type="character" w:default="1" w:styleId="DefaultParagraphFont">
     <w:name w:val="Default Paragraph Font"/>
     <w:uiPriority w:val="1"/>
-    <w:semiHidden/>
     <w:unhideWhenUsed/>
   </w:style>
   <w:style w:type="table" w:default="1" w:styleId="TableNormal">
@@ -4141,7 +6449,7 @@
     <w:basedOn w:val="DefaultParagraphFont"/>
     <w:link w:val="Heading3"/>
     <w:uiPriority w:val="9"/>
-    <w:rsid w:val="00896224"/>
+    <w:rsid w:val="001D48F8"/>
     <w:rPr>
       <w:rFonts w:ascii="Times New Roman" w:eastAsiaTheme="majorEastAsia" w:hAnsi="Times New Roman" w:cstheme="majorBidi"/>
       <w:b/>
@@ -4157,13 +6465,16 @@
     <w:basedOn w:val="DefaultParagraphFont"/>
     <w:link w:val="Heading4"/>
     <w:uiPriority w:val="9"/>
-    <w:semiHidden/>
-    <w:rsid w:val="005E0398"/>
+    <w:rsid w:val="00A06EFB"/>
     <w:rPr>
-      <w:rFonts w:eastAsiaTheme="majorEastAsia" w:cstheme="majorBidi"/>
-      <w:i/>
+      <w:rFonts w:ascii="Times New Roman" w:eastAsiaTheme="majorEastAsia" w:hAnsi="Times New Roman" w:cstheme="majorBidi"/>
+      <w:b/>
       <w:iCs/>
-      <w:color w:val="0F4761" w:themeColor="accent1" w:themeShade="BF"/>
+      <w:kern w:val="0"/>
+      <w:sz w:val="26"/>
+      <w:szCs w:val="22"/>
+      <w:lang w:val="en-US"/>
+      <w14:ligatures w14:val="none"/>
     </w:rPr>
   </w:style>
   <w:style w:type="character" w:customStyle="1" w:styleId="Heading5Char">
@@ -4574,6 +6885,76 @@
       <w:u w:val="single"/>
     </w:rPr>
   </w:style>
+  <w:style w:type="paragraph" w:styleId="NormalWeb">
+    <w:name w:val="Normal (Web)"/>
+    <w:basedOn w:val="Normal"/>
+    <w:uiPriority w:val="99"/>
+    <w:unhideWhenUsed/>
+    <w:rsid w:val="00C01286"/>
+    <w:pPr>
+      <w:spacing w:before="100" w:beforeAutospacing="1" w:after="100" w:afterAutospacing="1" w:line="240" w:lineRule="auto"/>
+      <w:jc w:val="left"/>
+    </w:pPr>
+    <w:rPr>
+      <w:rFonts w:eastAsia="Times New Roman" w:cs="Times New Roman"/>
+      <w:sz w:val="24"/>
+      <w:szCs w:val="24"/>
+      <w:lang w:val="vi-VN" w:eastAsia="vi-VN"/>
+    </w:rPr>
+  </w:style>
+  <w:style w:type="character" w:customStyle="1" w:styleId="citation-75">
+    <w:name w:val="citation-75"/>
+    <w:basedOn w:val="DefaultParagraphFont"/>
+    <w:rsid w:val="00C01286"/>
+  </w:style>
+  <w:style w:type="character" w:customStyle="1" w:styleId="citation-74">
+    <w:name w:val="citation-74"/>
+    <w:basedOn w:val="DefaultParagraphFont"/>
+    <w:rsid w:val="00C01286"/>
+  </w:style>
+  <w:style w:type="character" w:customStyle="1" w:styleId="citation-73">
+    <w:name w:val="citation-73"/>
+    <w:basedOn w:val="DefaultParagraphFont"/>
+    <w:rsid w:val="00C01286"/>
+  </w:style>
+  <w:style w:type="character" w:customStyle="1" w:styleId="citation-72">
+    <w:name w:val="citation-72"/>
+    <w:basedOn w:val="DefaultParagraphFont"/>
+    <w:rsid w:val="00C01286"/>
+  </w:style>
+  <w:style w:type="character" w:customStyle="1" w:styleId="citation-71">
+    <w:name w:val="citation-71"/>
+    <w:basedOn w:val="DefaultParagraphFont"/>
+    <w:rsid w:val="00C01286"/>
+  </w:style>
+  <w:style w:type="character" w:customStyle="1" w:styleId="citation-70">
+    <w:name w:val="citation-70"/>
+    <w:basedOn w:val="DefaultParagraphFont"/>
+    <w:rsid w:val="00C01286"/>
+  </w:style>
+  <w:style w:type="character" w:customStyle="1" w:styleId="citation-69">
+    <w:name w:val="citation-69"/>
+    <w:basedOn w:val="DefaultParagraphFont"/>
+    <w:rsid w:val="00C01286"/>
+  </w:style>
+  <w:style w:type="character" w:styleId="HTMLCode">
+    <w:name w:val="HTML Code"/>
+    <w:basedOn w:val="DefaultParagraphFont"/>
+    <w:uiPriority w:val="99"/>
+    <w:semiHidden/>
+    <w:unhideWhenUsed/>
+    <w:rsid w:val="00C01286"/>
+    <w:rPr>
+      <w:rFonts w:ascii="Courier New" w:eastAsia="Times New Roman" w:hAnsi="Courier New" w:cs="Courier New"/>
+      <w:sz w:val="20"/>
+      <w:szCs w:val="20"/>
+    </w:rPr>
+  </w:style>
+  <w:style w:type="character" w:customStyle="1" w:styleId="citation-68">
+    <w:name w:val="citation-68"/>
+    <w:basedOn w:val="DefaultParagraphFont"/>
+    <w:rsid w:val="00C01286"/>
+  </w:style>
 </w:styles>
 </file>
 

</xml_diff>

<commit_message>
[Refactor] UI/UX and the logic bebind it
</commit_message>
<xml_diff>
--- a/Nhom07_BaoCao.docx
+++ b/Nhom07_BaoCao.docx
@@ -2380,68 +2380,35 @@
     </w:p>
     <w:p>
       <w:pPr>
+        <w:pStyle w:val="Heading1"/>
+        <w:rPr>
+          <w:bCs/>
+          <w:lang w:val="en-US"/>
+        </w:rPr>
+      </w:pPr>
+      <w:r>
+        <w:lastRenderedPageBreak/>
+        <w:t xml:space="preserve">CHƯƠNG 2: </w:t>
+      </w:r>
+      <w:r>
+        <w:rPr>
+          <w:bCs/>
+        </w:rPr>
+        <w:t>PHÂN TÍCH VÀ THIẾT KẾ HỆ THỐNG</w:t>
+      </w:r>
+    </w:p>
+    <w:p>
+      <w:pPr>
         <w:pStyle w:val="Heading2"/>
       </w:pPr>
       <w:r>
-        <w:lastRenderedPageBreak/>
-        <w:t>1.3</w:t>
-      </w:r>
-      <w:r>
-        <w:t>.</w:t>
-      </w:r>
-      <w:r>
-        <w:t xml:space="preserve"> Phạm vi </w:t>
-      </w:r>
-      <w:r>
-        <w:t>nghiên cứu</w:t>
-      </w:r>
-    </w:p>
-    <w:p>
-      <w:pPr>
-        <w:ind w:firstLine="284"/>
-        <w:rPr>
-          <w:lang w:val="vi-VN"/>
-        </w:rPr>
-      </w:pPr>
-      <w:r>
-        <w:rPr>
-          <w:lang w:val="vi-VN"/>
-        </w:rPr>
-        <w:t>Phạm vi nghiên cứu của đề tài tập trung vào việc xây dựng một hệ thống quản lý tài chính cá nhân toàn diện trên nền tảng ứng dụng máy tính, cho phép người dùng kiểm soát chặt chẽ các tài khoản và nguồn tiền của mình. Hệ thống bao quát các chức năng cốt lõi như quản lý danh mục tài khoản với đầy đủ thông tin về tên, loại hình tài khoản và số dư hiện có. Song song đó, phạm vi nghiên cứu còn bao hàm việc thiết lập các danh mục chi tiêu và lập kế hoạch ngân sách để định hướng lộ trình tài chính cá nhân. Mọi hoạt động thu chi hằng ngày sẽ được ghi nhận chi tiết thông qua hệ thống quản lý giao dịch, giúp người dùng dễ dàng theo dõi và truy xuất lịch sử tài chính của bản thân một cách minh bạch.</w:t>
-      </w:r>
-    </w:p>
-    <w:p>
-      <w:pPr>
-        <w:ind w:firstLine="284"/>
-        <w:rPr>
-          <w:lang w:val="vi-VN"/>
-        </w:rPr>
-      </w:pPr>
-      <w:r>
-        <w:rPr>
-          <w:lang w:val="vi-VN"/>
-        </w:rPr>
-        <w:t>Bên cạnh các nghiệp vụ lưu trữ, đề tài còn chú trọng vào việc trực quan hóa dữ liệu thông qua bảng điều khiển trung tâm để cung cấp cái nhìn tổng thể về sức khỏe tài chính. Phạm vi nghiên cứu cụ thể hóa việc tổng hợp các chỉ số quan trọng như tổng chi tiêu trong tháng, tỷ lệ biến động so với kỳ trước, cùng sự phân tích chi tiết giữa dòng thu và dòng chi để xác định số dư ròng. Giao diện được tối ưu hóa với các tính năng hỗ trợ trải nghiệm như ẩn hiện số dư để đảm bảo tính riêng tư và danh sách giao dịch gần nhất để cập nhật trạng thái dòng tiền tức thời. Toàn bộ nghiên cứu chỉ giới hạn trong môi trường sử dụng của cá nhân đơn lẻ, tập trung vào tính tiện dụng và khả năng tương tác trực tiếp, không mở rộng sang các mô hình quản trị doanh nghiệp hay nghiệp vụ kế toán phức tạp.</w:t>
-      </w:r>
-    </w:p>
-    <w:p/>
-    <w:p>
-      <w:pPr>
-        <w:pStyle w:val="Heading1"/>
-        <w:rPr>
-          <w:lang w:val="en-US"/>
-        </w:rPr>
-      </w:pPr>
-      <w:r>
-        <w:t>CHƯƠNG 2: PHÂN TÍCH NGHIỆP VỤ</w:t>
-      </w:r>
-    </w:p>
-    <w:p>
-      <w:pPr>
-        <w:pStyle w:val="Heading2"/>
-      </w:pPr>
-      <w:r>
-        <w:t>2.1. Phân tích yêu cầu chức năng</w:t>
+        <w:t xml:space="preserve">2.1. </w:t>
+      </w:r>
+      <w:r>
+        <w:rPr>
+          <w:lang w:val="vi-VN"/>
+        </w:rPr>
+        <w:t>Phân tích yêu cầu hệ thống</w:t>
       </w:r>
     </w:p>
     <w:p>
@@ -2461,7 +2428,10 @@
         <w:t xml:space="preserve">. </w:t>
       </w:r>
       <w:r>
-        <w:t>Trang tổng quan</w:t>
+        <w:rPr>
+          <w:lang w:val="vi-VN"/>
+        </w:rPr>
+        <w:t>Yêu cầu chức năng</w:t>
       </w:r>
     </w:p>
     <w:p>
@@ -2523,7 +2493,6 @@
           <w:bCs/>
           <w:lang w:val="vi-VN"/>
         </w:rPr>
-        <w:lastRenderedPageBreak/>
         <w:t>Thống kê Dòng tiền:</w:t>
       </w:r>
       <w:r>
@@ -2726,6 +2695,9 @@
     <w:p>
       <w:pPr>
         <w:pStyle w:val="Heading3"/>
+        <w:rPr>
+          <w:lang w:val="vi-VN"/>
+        </w:rPr>
       </w:pPr>
       <w:r>
         <w:t>2</w:t>
@@ -2737,7 +2709,24 @@
         <w:t>1.2</w:t>
       </w:r>
       <w:r>
-        <w:t>. Quản lý giao dịch</w:t>
+        <w:t xml:space="preserve">. </w:t>
+      </w:r>
+      <w:r>
+        <w:rPr>
+          <w:lang w:val="vi-VN"/>
+        </w:rPr>
+        <w:t>Yêu cầu phi chức năng</w:t>
+      </w:r>
+    </w:p>
+    <w:p>
+      <w:pPr>
+        <w:pStyle w:val="Heading2"/>
+      </w:pPr>
+      <w:r>
+        <w:t>2.</w:t>
+      </w:r>
+      <w:r>
+        <w:t>2 Thiết kế Cơ sở dữ liệu</w:t>
       </w:r>
     </w:p>
     <w:p>
@@ -2745,43 +2734,320 @@
         <w:pStyle w:val="Heading3"/>
       </w:pPr>
       <w:r>
+        <w:t>2.2.1 Mô hình thực thể liên kết (ERD)</w:t>
+      </w:r>
+    </w:p>
+    <w:p>
+      <w:pPr>
+        <w:rPr>
+          <w:b/>
+          <w:bCs/>
+        </w:rPr>
+      </w:pPr>
+      <w:r>
+        <w:rPr>
+          <w:b/>
+          <w:bCs/>
+        </w:rPr>
+        <w:t xml:space="preserve">Mục tiêu: </w:t>
+      </w:r>
+      <w:r>
+        <w:t>Giúp người dùng thiết lập kế hoạch chi tiêu định kỳ và giám sát mức độ sử dụng ngân sách thông qua các chỉ số trực quan, từ đó đưa ra cảnh báo sớm khi chi tiêu vượt ngưỡng.</w:t>
+      </w:r>
+    </w:p>
+    <w:p>
+      <w:pPr>
+        <w:rPr>
+          <w:b/>
+          <w:bCs/>
+        </w:rPr>
+      </w:pPr>
+      <w:r>
+        <w:rPr>
+          <w:b/>
+          <w:bCs/>
+        </w:rPr>
+        <w:lastRenderedPageBreak/>
+        <w:t>Các yêu cầu chức năng chi tiết:</w:t>
+      </w:r>
+    </w:p>
+    <w:p>
+      <w:pPr>
+        <w:numPr>
+          <w:ilvl w:val="0"/>
+          <w:numId w:val="17"/>
+        </w:numPr>
+        <w:rPr>
+          <w:b/>
+          <w:bCs/>
+        </w:rPr>
+      </w:pPr>
+      <w:r>
+        <w:rPr>
+          <w:b/>
+          <w:bCs/>
+        </w:rPr>
+        <w:t>Thiết lập và tùy chỉnh hạn mức:</w:t>
+      </w:r>
+    </w:p>
+    <w:p>
+      <w:pPr>
+        <w:numPr>
+          <w:ilvl w:val="1"/>
+          <w:numId w:val="17"/>
+        </w:numPr>
+      </w:pPr>
+      <w:r>
+        <w:t>Hệ thống cho phép người dùng đặt ra một con số cụ thể (Limit) làm giới hạn chi tiêu cho từng nguồn tiền (Ví dụ: MB Bank, OCB).</w:t>
+      </w:r>
+    </w:p>
+    <w:p>
+      <w:pPr>
+        <w:numPr>
+          <w:ilvl w:val="1"/>
+          <w:numId w:val="17"/>
+        </w:numPr>
+      </w:pPr>
+      <w:r>
+        <w:t>Hỗ trợ cập nhật hoặc thay đổi hạn mức này bất cứ lúc nào trong kỳ báo cáo.</w:t>
+      </w:r>
+    </w:p>
+    <w:p>
+      <w:pPr>
+        <w:numPr>
+          <w:ilvl w:val="0"/>
+          <w:numId w:val="17"/>
+        </w:numPr>
+        <w:rPr>
+          <w:b/>
+          <w:bCs/>
+        </w:rPr>
+      </w:pPr>
+      <w:r>
+        <w:rPr>
+          <w:b/>
+          <w:bCs/>
+        </w:rPr>
+        <w:t>Tự động tổng hợp dữ liệu chi tiêu:</w:t>
+      </w:r>
+    </w:p>
+    <w:p>
+      <w:pPr>
+        <w:numPr>
+          <w:ilvl w:val="1"/>
+          <w:numId w:val="17"/>
+        </w:numPr>
+      </w:pPr>
+      <w:r>
+        <w:t>Hệ thống tự động quét và tính tổng các giao dịch chi ra (Expenses) thuộc về nguồn tiền tương ứng trong tháng hiện hành.</w:t>
+      </w:r>
+    </w:p>
+    <w:p>
+      <w:pPr>
+        <w:numPr>
+          <w:ilvl w:val="1"/>
+          <w:numId w:val="17"/>
+        </w:numPr>
+      </w:pPr>
+      <w:r>
+        <w:t>Dữ liệu phải đảm bảo tính thời gian thực (Real-time), cập nhật ngay khi có giao dịch mới phát sinh.</w:t>
+      </w:r>
+    </w:p>
+    <w:p>
+      <w:pPr>
+        <w:numPr>
+          <w:ilvl w:val="0"/>
+          <w:numId w:val="17"/>
+        </w:numPr>
+        <w:rPr>
+          <w:b/>
+          <w:bCs/>
+        </w:rPr>
+      </w:pPr>
+      <w:r>
+        <w:rPr>
+          <w:b/>
+          <w:bCs/>
+        </w:rPr>
+        <w:t>Tính toán và phân tích tỷ lệ:</w:t>
+      </w:r>
+    </w:p>
+    <w:p>
+      <w:pPr>
+        <w:numPr>
+          <w:ilvl w:val="1"/>
+          <w:numId w:val="17"/>
+        </w:numPr>
+      </w:pPr>
+      <w:r>
+        <w:t>Tính toán tỷ lệ phần trăm sử dụng dựa trên công thức: (Tổng chi tiêu / Hạn mức) * 100%.</w:t>
+      </w:r>
+    </w:p>
+    <w:p>
+      <w:pPr>
+        <w:numPr>
+          <w:ilvl w:val="1"/>
+          <w:numId w:val="17"/>
+        </w:numPr>
+      </w:pPr>
+      <w:r>
+        <w:t>Xác định số dư còn lại (Hạn mức - Đã dùng) hoặc số tiền đã vượt ngưỡng để thông báo cho người dùng.</w:t>
+      </w:r>
+    </w:p>
+    <w:p>
+      <w:pPr>
+        <w:numPr>
+          <w:ilvl w:val="0"/>
+          <w:numId w:val="17"/>
+        </w:numPr>
+        <w:rPr>
+          <w:b/>
+          <w:bCs/>
+        </w:rPr>
+      </w:pPr>
+      <w:r>
+        <w:rPr>
+          <w:b/>
+          <w:bCs/>
+        </w:rPr>
+        <w:t>Cơ chế cảnh báo trực quan (Visual Feedback):</w:t>
+      </w:r>
+    </w:p>
+    <w:p>
+      <w:pPr>
+        <w:numPr>
+          <w:ilvl w:val="1"/>
+          <w:numId w:val="17"/>
+        </w:numPr>
+      </w:pPr>
+      <w:r>
+        <w:t>Sử dụng thanh tiến trình (ProgressBar) để biểu diễn mức độ sử dụng ngân sách.</w:t>
+      </w:r>
+    </w:p>
+    <w:p>
+      <w:pPr>
+        <w:numPr>
+          <w:ilvl w:val="1"/>
+          <w:numId w:val="17"/>
+        </w:numPr>
+      </w:pPr>
+      <w:r>
+        <w:t>Logic đổi màu: Tự động chuyển màu Foreground của thanh tiến trình sang màu đỏ khi tỷ lệ sử dụng đạt hoặc vượt mức 100%.</w:t>
+      </w:r>
+    </w:p>
+    <w:p>
+      <w:pPr>
+        <w:numPr>
+          <w:ilvl w:val="1"/>
+          <w:numId w:val="17"/>
+        </w:numPr>
+      </w:pPr>
+      <w:r>
+        <w:t>Hiển thị thông báo trạng thái cụ thể (Ví dụ: "Còn lại: 1.500.000đ" hoặc "Vượt ngưỡng: 300.000đ").</w:t>
+      </w:r>
+    </w:p>
+    <w:p>
+      <w:pPr>
+        <w:numPr>
+          <w:ilvl w:val="0"/>
+          <w:numId w:val="17"/>
+        </w:numPr>
+        <w:rPr>
+          <w:b/>
+          <w:bCs/>
+        </w:rPr>
+      </w:pPr>
+      <w:r>
+        <w:rPr>
+          <w:b/>
+          <w:bCs/>
+        </w:rPr>
+        <w:t>Nhận diện và phân loại nguồn tiền:</w:t>
+      </w:r>
+    </w:p>
+    <w:p>
+      <w:pPr>
+        <w:numPr>
+          <w:ilvl w:val="1"/>
+          <w:numId w:val="17"/>
+        </w:numPr>
+      </w:pPr>
+      <w:r>
+        <w:t>Hiển thị thông tin ngân sách đi kèm với tên ngân hàng, loại tài khoản và biểu tượng nhận diện riêng biệt (Icon/Màu sắc thương hiệu).</w:t>
+      </w:r>
+    </w:p>
+    <w:p>
+      <w:pPr>
+        <w:numPr>
+          <w:ilvl w:val="1"/>
+          <w:numId w:val="17"/>
+        </w:numPr>
+      </w:pPr>
+      <w:r>
+        <w:t>Hỗ trợ danh sách cuộn (Scroll) để quản lý cùng lúc nhiều ngân sách khác nhau mà không làm loãng giao diện.</w:t>
+      </w:r>
+    </w:p>
+    <w:p>
+      <w:pPr>
+        <w:rPr>
+          <w:b/>
+          <w:bCs/>
+        </w:rPr>
+      </w:pPr>
+      <w:r>
+        <w:rPr>
+          <w:b/>
+          <w:bCs/>
+        </w:rPr>
+        <w:lastRenderedPageBreak/>
+        <w:t>Các ràng buộc nghiệp vụ:</w:t>
+      </w:r>
+    </w:p>
+    <w:p>
+      <w:pPr>
+        <w:numPr>
+          <w:ilvl w:val="0"/>
+          <w:numId w:val="18"/>
+        </w:numPr>
+      </w:pPr>
+      <w:r>
+        <w:t>Hạn mức ngân sách không được phép là số âm.</w:t>
+      </w:r>
+    </w:p>
+    <w:p>
+      <w:pPr>
+        <w:numPr>
+          <w:ilvl w:val="0"/>
+          <w:numId w:val="18"/>
+        </w:numPr>
+      </w:pPr>
+      <w:r>
+        <w:t>Chỉ tính toán dựa trên các giao dịch có loại là "Chi tiêu" (Expense), không bao gồm "Thu nhập" (Income) vào phần đối chiếu hạn mức.</w:t>
+      </w:r>
+    </w:p>
+    <w:p>
+      <w:pPr>
+        <w:pStyle w:val="Heading3"/>
+      </w:pPr>
+      <w:r>
         <w:t>2.</w:t>
       </w:r>
       <w:r>
-        <w:t>1.3</w:t>
-      </w:r>
-      <w:r>
-        <w:t>. Quản lý ngân sách</w:t>
-      </w:r>
-    </w:p>
-    <w:p>
-      <w:pPr>
-        <w:pStyle w:val="Heading3"/>
-      </w:pPr>
-      <w:r>
-        <w:t>2.</w:t>
-      </w:r>
-      <w:r>
-        <w:t>1.4</w:t>
-      </w:r>
-      <w:r>
-        <w:t>. Quản lý tài khoả</w:t>
-      </w:r>
-      <w:r>
-        <w:t>n</w:t>
-      </w:r>
-    </w:p>
-    <w:p>
-      <w:pPr>
-        <w:rPr>
-          <w:lang w:val="vi-VN"/>
-        </w:rPr>
-      </w:pPr>
-      <w:r>
-        <w:t>M</w:t>
-      </w:r>
-      <w:r>
-        <w:t>odule này cho phép người dùng quản lý các nơi lưu trữ tiền của mình (ví dụ: Ví tiền mặt, Thẻ ngân hàng).</w:t>
+        <w:t xml:space="preserve">2.2 </w:t>
+      </w:r>
+      <w:r>
+        <w:tab/>
+        <w:t>Thiết kế chi tiết các bảng</w:t>
+      </w:r>
+    </w:p>
+    <w:p>
+      <w:pPr>
+        <w:rPr>
+          <w:lang w:val="vi-VN"/>
+        </w:rPr>
+      </w:pPr>
+      <w:r>
+        <w:t>Module này cho phép người dùng quản lý các nơi lưu trữ tiền của mình (ví dụ: Ví tiền mặt, Thẻ ngân hàng).</w:t>
       </w:r>
     </w:p>
     <w:p>
@@ -3010,32 +3276,161 @@
     </w:p>
     <w:p>
       <w:pPr>
-        <w:jc w:val="center"/>
-      </w:pPr>
-    </w:p>
-    <w:p>
-      <w:pPr>
         <w:pStyle w:val="Heading3"/>
+        <w:rPr>
+          <w:rFonts w:asciiTheme="majorHAnsi" w:hAnsiTheme="majorHAnsi" w:cstheme="majorHAnsi"/>
+          <w:i/>
+          <w:iCs/>
+        </w:rPr>
+      </w:pPr>
+      <w:r>
+        <w:rPr>
+          <w:rStyle w:val="Emphasis"/>
+          <w:i w:val="0"/>
+          <w:iCs w:val="0"/>
+        </w:rPr>
+        <w:t>2</w:t>
+      </w:r>
+      <w:r>
+        <w:rPr>
+          <w:rStyle w:val="Emphasis"/>
+          <w:i w:val="0"/>
+          <w:iCs w:val="0"/>
+        </w:rPr>
+        <w:t>.2.3. Thiết kế Stored Procedure &amp; Function</w:t>
+      </w:r>
+    </w:p>
+    <w:p>
+      <w:pPr>
+        <w:pStyle w:val="Heading2"/>
+      </w:pPr>
+      <w:r>
+        <w:t>2</w:t>
+      </w:r>
+      <w:r>
+        <w:t>.</w:t>
+      </w:r>
+      <w:r>
+        <w:t>3</w:t>
+      </w:r>
+      <w:r>
+        <w:t xml:space="preserve">. </w:t>
+      </w:r>
+      <w:r>
+        <w:t>Thiết kế giao diện người dùng</w:t>
+      </w:r>
+    </w:p>
+    <w:p>
+      <w:pPr>
+        <w:pStyle w:val="Heading3"/>
       </w:pPr>
       <w:r>
         <w:t>2.</w:t>
       </w:r>
       <w:r>
-        <w:t>1.5</w:t>
-      </w:r>
-      <w:r>
-        <w:t>. Quản lý danh mục</w:t>
-      </w:r>
-    </w:p>
-    <w:p>
-      <w:pPr>
-        <w:pStyle w:val="Heading2"/>
-      </w:pPr>
-      <w:r>
-        <w:t>2</w:t>
-      </w:r>
-      <w:r>
-        <w:t>.2. Phân tích yêu cầu phi chức năng</w:t>
+        <w:t>3</w:t>
+      </w:r>
+      <w:r>
+        <w:t xml:space="preserve">.1. </w:t>
+      </w:r>
+      <w:r>
+        <w:t>Bố cục tổng thể</w:t>
+      </w:r>
+    </w:p>
+    <w:p>
+      <w:r>
+        <w:t>Yêu cầu về hiệu năng đảm bảo ứng dụng vận hành ổn định và mang lại trải nghiệm mượt mà cho người dùng trong suốt quá trình sử dụng:</w:t>
+      </w:r>
+    </w:p>
+    <w:p>
+      <w:pPr>
+        <w:numPr>
+          <w:ilvl w:val="0"/>
+          <w:numId w:val="19"/>
+        </w:numPr>
+      </w:pPr>
+      <w:r>
+        <w:rPr>
+          <w:b/>
+          <w:bCs/>
+        </w:rPr>
+        <w:lastRenderedPageBreak/>
+        <w:t>Tốc độ phản hồi:</w:t>
+      </w:r>
+      <w:r>
+        <w:t xml:space="preserve"> Hệ thống cần phản hồi ngay lập tức các thao tác của người dùng như chuyển đổi giữa các chức năng, đóng/mở các hộp thoại hoặc các nút tương tác (như nút ẩn/hiện số dư).</w:t>
+      </w:r>
+    </w:p>
+    <w:p>
+      <w:pPr>
+        <w:numPr>
+          <w:ilvl w:val="0"/>
+          <w:numId w:val="19"/>
+        </w:numPr>
+      </w:pPr>
+      <w:r>
+        <w:rPr>
+          <w:b/>
+          <w:bCs/>
+        </w:rPr>
+        <w:t>Xử lý dữ liệu:</w:t>
+      </w:r>
+      <w:r>
+        <w:t xml:space="preserve"> Các phép tính toán tổng hợp số dư, tỷ lệ phần trăm ngân sách và truy vấn lịch sử giao dịch phải được thực hiện nhanh chóng, không gây ra tình trạng đứng máy (treo giao diện).</w:t>
+      </w:r>
+    </w:p>
+    <w:p>
+      <w:pPr>
+        <w:numPr>
+          <w:ilvl w:val="0"/>
+          <w:numId w:val="19"/>
+        </w:numPr>
+      </w:pPr>
+      <w:r>
+        <w:rPr>
+          <w:b/>
+          <w:bCs/>
+        </w:rPr>
+        <w:t>Sử dụng tài nguyên:</w:t>
+      </w:r>
+      <w:r>
+        <w:t xml:space="preserve"> Ứng dụng được tối ưu hóa để khởi động nhanh và chiếm dụng tài nguyên hệ thống (CPU, RAM) ở mức thấp, đảm bảo không gây ảnh hưởng đến các tác vụ khác trên máy tính của người dùng.</w:t>
+      </w:r>
+    </w:p>
+    <w:p>
+      <w:pPr>
+        <w:numPr>
+          <w:ilvl w:val="0"/>
+          <w:numId w:val="19"/>
+        </w:numPr>
+      </w:pPr>
+      <w:r>
+        <w:rPr>
+          <w:b/>
+          <w:bCs/>
+        </w:rPr>
+        <w:t>Sự mượt mà của giao diện:</w:t>
+      </w:r>
+      <w:r>
+        <w:t xml:space="preserve"> Các hiệu ứng chuyển cảnh, thanh tiến trình và thao tác cuộn danh sách tài khoản phải trơn tru, tạo cảm giác linh hoạt và hiện đại cho một ứng dụng quản lý tài chính.</w:t>
+      </w:r>
+    </w:p>
+    <w:p>
+      <w:pPr>
+        <w:numPr>
+          <w:ilvl w:val="0"/>
+          <w:numId w:val="19"/>
+        </w:numPr>
+      </w:pPr>
+      <w:r>
+        <w:rPr>
+          <w:b/>
+          <w:bCs/>
+        </w:rPr>
+        <w:t>Độ ổn định:</w:t>
+      </w:r>
+      <w:r>
+        <w:t xml:space="preserve"> Hệ thống hoạt động liên tục và ổn định ngay cả khi số lượng dữ liệu giao dịch tăng dần theo thời gian, đảm bảo tính nhất quán trong việc hiển thị các báo cáo tài chính.</w:t>
       </w:r>
     </w:p>
     <w:p>
@@ -3043,15 +3438,16 @@
         <w:pStyle w:val="Heading3"/>
       </w:pPr>
       <w:r>
-        <w:t>2.2.1. Hiệu năng</w:t>
-      </w:r>
-    </w:p>
-    <w:p>
-      <w:pPr>
-        <w:pStyle w:val="Heading3"/>
-      </w:pPr>
-      <w:r>
-        <w:t>2.2.2. Khả dụng và trải nghiệm người dùng</w:t>
+        <w:t>2.</w:t>
+      </w:r>
+      <w:r>
+        <w:t>3.2</w:t>
+      </w:r>
+      <w:r>
+        <w:t xml:space="preserve">. </w:t>
+      </w:r>
+      <w:r>
+        <w:t>Cơ chế điều hướng</w:t>
       </w:r>
     </w:p>
     <w:p>
@@ -3087,14 +3483,7 @@
         <w:rPr>
           <w:lang w:val="vi-VN"/>
         </w:rPr>
-        <w:t xml:space="preserve">Tính riêng tư và khả năng truy cập thông tin nhanh chóng được đặt lên hàng đầu. Người dùng có quyền kiểm soát linh hoạt việc hiển thị các dữ liệu nhạy cảm về số dư, </w:t>
-      </w:r>
-      <w:r>
-        <w:rPr>
-          <w:lang w:val="vi-VN"/>
-        </w:rPr>
-        <w:lastRenderedPageBreak/>
-        <w:t>đồng thời hệ thống luôn cung cấp các tín hiệu nhận biết rõ ràng tại những vùng có thể tương tác trên màn hình.</w:t>
+        <w:t>Tính riêng tư và khả năng truy cập thông tin nhanh chóng được đặt lên hàng đầu. Người dùng có quyền kiểm soát linh hoạt việc hiển thị các dữ liệu nhạy cảm về số dư, đồng thời hệ thống luôn cung cấp các tín hiệu nhận biết rõ ràng tại những vùng có thể tương tác trên màn hình.</w:t>
       </w:r>
     </w:p>
     <w:p>
@@ -3161,6 +3550,7 @@
         <w:rPr>
           <w:lang w:val="vi-VN"/>
         </w:rPr>
+        <w:lastRenderedPageBreak/>
         <w:t>Sử dụng con trỏ chuột hình bàn tay (Cursor="Hand") trên các nút bấm và các thẻ danh mục tài khoản để báo hiệu rõ ràng khả năng nhấp chuột và tương tác lệnh.</w:t>
       </w:r>
     </w:p>
@@ -3219,7 +3609,7 @@
         <w:rPr>
           <w:lang w:val="vi-VN"/>
         </w:rPr>
-        <w:t>Giao diện tổng thể mang phong cách hiện đại, sử dụng thiết kế dạng thẻ (Card-based UI) kết hợp với chủ đề tối (Dark mode). Thiết kế này không chỉ tạo ra sự nhất quán, sang trọng cho một ứng dụng tài chính mà còn giúp giảm mỏi mắt cho người dùng khi phải theo dõi các con số trong thời gian dài.</w:t>
+        <w:t>Giao diện tổng thể mang phong cách hiện đại, sử dụng thiết kế dạng thẻ (Card-based UI) kết hợp với chủ đề tối. Thiết kế này không chỉ tạo ra sự nhất quán, sang trọng cho một ứng dụng tài chính mà còn giúp giảm mỏi mắt cho người dùng khi phải theo dõi các con số trong thời gian dài.</w:t>
       </w:r>
     </w:p>
     <w:p>
@@ -3251,7 +3641,7 @@
         <w:rPr>
           <w:lang w:val="vi-VN"/>
         </w:rPr>
-        <w:t>Giao diện sử dụng tông màu nền tối (như mã màu #121513 và #1C2420) tạo độ tương phản cao, làm nổi bật các thành phần văn bản và dữ liệu có màu trắng hoặc sáng.</w:t>
+        <w:t>Giao diện sử dụng tông màu nền tối tạo độ tương phản cao, làm nổi bật các thành phần văn bản và dữ liệu có màu trắng hoặc sáng.</w:t>
       </w:r>
     </w:p>
     <w:p>
@@ -3269,7 +3659,16 @@
         <w:rPr>
           <w:lang w:val="vi-VN"/>
         </w:rPr>
-        <w:t>Phân loại dòng tiền rõ ràng thông qua màu sắc và hướng biểu tượng: Thu nhập sử dụng mũi tên hướng lên đi kèm màu xanh lá cây (#2ED573) , trong khi chi phí sử dụng mũi tên hướng xuống đi kèm màu đỏ (#FF4757).</w:t>
+        <w:t>Phân loại dòng tiền rõ ràng thông qua màu sắc và hướng biểu tượng: Thu nhập sử dụng mũi tên hướng lên đi kèm màu xanh lá câ</w:t>
+      </w:r>
+      <w:r>
+        <w:t>y</w:t>
+      </w:r>
+      <w:r>
+        <w:rPr>
+          <w:lang w:val="vi-VN"/>
+        </w:rPr>
+        <w:t>, trong khi chi phí sử dụng mũi tên hướng xuống đi kèm màu đỏ.</w:t>
       </w:r>
     </w:p>
     <w:p>
@@ -3287,8 +3686,10 @@
         <w:rPr>
           <w:lang w:val="vi-VN"/>
         </w:rPr>
-        <w:lastRenderedPageBreak/>
-        <w:t>Thanh tiến trình ngân sách (ProgressBar) thay đổi màu sắc cảnh báo trực quan theo tỷ lệ tiêu dùng và cung cấp thông báo rõ ràng bằng chữ màu đỏ khi người dùng chi tiêu vượt hạn mức (ví dụ: "115% - Đã vượt hạn mức!").</w:t>
+        <w:t xml:space="preserve">Thanh tiến trình ngân sách (ProgressBar) thay đổi màu sắc cảnh báo trực quan theo tỷ lệ tiêu dùng và cung cấp thông báo rõ ràng bằng chữ màu đỏ khi người dùng chi tiêu vượt hạn mức </w:t>
+      </w:r>
+      <w:r>
+        <w:t>.</w:t>
       </w:r>
     </w:p>
     <w:p>
@@ -3306,7 +3707,7 @@
         <w:rPr>
           <w:lang w:val="vi-VN"/>
         </w:rPr>
-        <w:t>Mỗi nguồn tiền/tài khoản đều được thiết kế để dễ dàng nhận diện thông qua việc gán màu nền (ColorHex) và biểu tượng (IconText) riêng biệt.</w:t>
+        <w:t>Mỗi nguồn tiền/tài khoản đều được thiết kế để dễ dàng nhận diện thông qua việc gán màu nền và biểu tượng riêng biệt.</w:t>
       </w:r>
     </w:p>
     <w:p>
@@ -3324,7 +3725,16 @@
         <w:rPr>
           <w:lang w:val="vi-VN"/>
         </w:rPr>
-        <w:t>Sử dụng các giá trị dự phòng (FallbackValue như đ******** hoặc +12% so với tháng trước) để đảm bảo cấu trúc hình ảnh của giao diện luôn được duy trì ổn định ngay cả trong quá trình chờ tải dữ liệu</w:t>
+        <w:t>Sử dụng các giá trị dự</w:t>
+      </w:r>
+      <w:r>
+        <w:t xml:space="preserve"> phòng</w:t>
+      </w:r>
+      <w:r>
+        <w:rPr>
+          <w:lang w:val="vi-VN"/>
+        </w:rPr>
+        <w:t xml:space="preserve"> để đảm bảo cấu trúc hình ảnh của giao diện luôn được duy trì ổn định ngay cả trong quá trình chờ tải dữ liệu</w:t>
       </w:r>
     </w:p>
     <w:p>
@@ -3345,23 +3755,358 @@
       </w:r>
     </w:p>
     <w:p>
+      <w:r>
+        <w:t>Hệ thống được thiết kế để đảm bảo có thể nâng cấp và phát triển thêm các tiện ích mới trong tương lai mà không làm ảnh hưởng đến cấu trúc hiện tại:</w:t>
+      </w:r>
+    </w:p>
+    <w:p>
+      <w:pPr>
+        <w:numPr>
+          <w:ilvl w:val="0"/>
+          <w:numId w:val="20"/>
+        </w:numPr>
+      </w:pPr>
+      <w:r>
+        <w:rPr>
+          <w:b/>
+          <w:bCs/>
+        </w:rPr>
+        <w:t>Về dữ liệu:</w:t>
+      </w:r>
+      <w:r>
+        <w:t xml:space="preserve"> Ứng dụng có khả năng quản lý tốt số lượng lớn các giao dịch và tài khoản ngân hàng tích lũy theo thời gian mà vẫn duy trì được sự ổn định.</w:t>
+      </w:r>
+    </w:p>
+    <w:p>
+      <w:pPr>
+        <w:numPr>
+          <w:ilvl w:val="0"/>
+          <w:numId w:val="20"/>
+        </w:numPr>
+      </w:pPr>
+      <w:r>
+        <w:rPr>
+          <w:b/>
+          <w:bCs/>
+        </w:rPr>
+        <w:t>Về tính năng:</w:t>
+      </w:r>
+      <w:r>
+        <w:t xml:space="preserve"> Cấu trúc mã nguồn được chia thành các khối chức năng riêng biệt, giúp việc thêm mới các module (như xuất báo cáo Excel, biểu đồ thống kê chuyên sâu) trở nên thuận tiện và nhanh chóng.</w:t>
+      </w:r>
+    </w:p>
+    <w:p>
+      <w:pPr>
+        <w:numPr>
+          <w:ilvl w:val="0"/>
+          <w:numId w:val="20"/>
+        </w:numPr>
+      </w:pPr>
+      <w:r>
+        <w:rPr>
+          <w:b/>
+          <w:bCs/>
+        </w:rPr>
+        <w:t>Về giao diện:</w:t>
+      </w:r>
+      <w:r>
+        <w:t xml:space="preserve"> Thiết kế linh hoạt cho phép dễ dàng điều chỉnh bố cục, thêm các chủ đề màu sắc hoặc thay đổi ngôn ngữ hiển thị tùy theo nhu cầu của người dùng.</w:t>
+      </w:r>
+    </w:p>
+    <w:p>
+      <w:pPr>
+        <w:numPr>
+          <w:ilvl w:val="0"/>
+          <w:numId w:val="20"/>
+        </w:numPr>
+      </w:pPr>
+      <w:r>
+        <w:rPr>
+          <w:b/>
+          <w:bCs/>
+        </w:rPr>
+        <w:t>Về công nghệ:</w:t>
+      </w:r>
+      <w:r>
+        <w:t xml:space="preserve"> Ứng dụng sẵn sàng để tích hợp thêm các dịch vụ trực tuyến hoặc kết nối với các hệ thống quản lý dữ liệu khác thông qua các chuẩn kết nối phổ biến.</w:t>
+      </w:r>
+    </w:p>
+    <w:p>
       <w:pPr>
         <w:pStyle w:val="Heading1"/>
         <w:rPr>
+          <w:bCs/>
           <w:lang w:val="en-US"/>
         </w:rPr>
       </w:pPr>
       <w:r>
-        <w:t>CHƯƠNG 3: XÂY D</w:t>
-      </w:r>
-      <w:r>
+        <w:t xml:space="preserve">CHƯƠNG 3: </w:t>
+      </w:r>
+      <w:r>
+        <w:rPr>
+          <w:bCs/>
+        </w:rPr>
+        <w:t>QUẢN TRỊ DỰ ÁN VÀ LÀM VIỆC NHÓM</w:t>
+      </w:r>
+    </w:p>
+    <w:p>
+      <w:pPr>
+        <w:pStyle w:val="Heading2"/>
+      </w:pPr>
+      <w:r>
+        <w:t>3.1</w:t>
+      </w:r>
+      <w:r>
+        <w:t>.</w:t>
+      </w:r>
+      <w:r>
+        <w:t xml:space="preserve"> </w:t>
+      </w:r>
+      <w:r>
+        <w:t>Chức năng nền tảng</w:t>
+      </w:r>
+    </w:p>
+    <w:p>
+      <w:pPr>
+        <w:pStyle w:val="Heading3"/>
+      </w:pPr>
+      <w:r>
+        <w:t>3.1.1</w:t>
+      </w:r>
+      <w:r>
+        <w:rPr>
+          <w:i/>
+          <w:iCs/>
+          <w:lang w:val="vi-VN"/>
+        </w:rPr>
+        <w:t xml:space="preserve"> </w:t>
+      </w:r>
+      <w:r>
+        <w:rPr>
+          <w:lang w:val="vi-VN"/>
+        </w:rPr>
+        <w:t>Quản trị danh mục và Kiểm tra ràng buộc</w:t>
+      </w:r>
+    </w:p>
+    <w:p>
+      <w:pPr>
+        <w:pStyle w:val="Heading3"/>
+        <w:rPr>
+          <w:lang w:val="vi-VN"/>
+        </w:rPr>
+      </w:pPr>
+      <w:r>
+        <w:t>3.1.2</w:t>
+      </w:r>
+      <w:r>
+        <w:rPr>
+          <w:lang w:val="vi-VN"/>
+        </w:rPr>
+        <w:t>. Công cụ lọc và tìm kiếm</w:t>
+      </w:r>
+    </w:p>
+    <w:p>
+      <w:pPr>
+        <w:pStyle w:val="Heading2"/>
+      </w:pPr>
+      <w:r>
+        <w:t>3.</w:t>
+      </w:r>
+      <w:r>
+        <w:t>2</w:t>
+      </w:r>
+      <w:r>
+        <w:t>.</w:t>
+      </w:r>
+      <w:r>
+        <w:t xml:space="preserve"> </w:t>
+      </w:r>
+      <w:r>
+        <w:rPr>
+          <w:bCs/>
+          <w:lang w:val="vi-VN"/>
+        </w:rPr>
+        <w:t>Hệ thống Phân quyền và Bảo mật (RBAC)</w:t>
+      </w:r>
+    </w:p>
+    <w:p>
+      <w:pPr>
+        <w:pStyle w:val="Heading3"/>
+      </w:pPr>
+      <w:r>
+        <w:t>3.</w:t>
+      </w:r>
+      <w:r>
+        <w:t>2.1</w:t>
+      </w:r>
+      <w:r>
+        <w:t>.</w:t>
+      </w:r>
+      <w:r>
+        <w:t xml:space="preserve"> </w:t>
+      </w:r>
+      <w:r>
+        <w:rPr>
+          <w:lang w:val="vi-VN"/>
+        </w:rPr>
+        <w:t>Giao diện nhập liệu Master-Detail</w:t>
+      </w:r>
+    </w:p>
+    <w:p>
+      <w:pPr>
+        <w:pStyle w:val="Heading3"/>
+      </w:pPr>
+      <w:r>
+        <w:t>3.</w:t>
+      </w:r>
+      <w:r>
+        <w:t>2.2</w:t>
+      </w:r>
+      <w:r>
+        <w:t>.</w:t>
+      </w:r>
+      <w:r>
+        <w:t xml:space="preserve"> </w:t>
+      </w:r>
+      <w:r>
+        <w:rPr>
+          <w:lang w:val="vi-VN"/>
+        </w:rPr>
+        <w:t>Kỹ thuật Database Transaction</w:t>
+      </w:r>
+    </w:p>
+    <w:p>
+      <w:pPr>
+        <w:pStyle w:val="Heading3"/>
+      </w:pPr>
+      <w:r>
+        <w:t>3.</w:t>
+      </w:r>
+      <w:r>
+        <w:t>2.3</w:t>
+      </w:r>
+      <w:r>
+        <w:t>.</w:t>
+      </w:r>
+      <w:r>
+        <w:t xml:space="preserve"> </w:t>
+      </w:r>
+      <w:r>
+        <w:rPr>
+          <w:lang w:val="vi-VN"/>
+        </w:rPr>
+        <w:t>Kiểm soát rủi ro</w:t>
+      </w:r>
+    </w:p>
+    <w:p>
+      <w:pPr>
+        <w:pStyle w:val="Heading2"/>
+        <w:rPr>
+          <w:lang w:val="vi-VN"/>
+        </w:rPr>
+      </w:pPr>
+      <w:r>
+        <w:t xml:space="preserve">3.3. </w:t>
+      </w:r>
+      <w:r>
+        <w:rPr>
+          <w:lang w:val="vi-VN"/>
+        </w:rPr>
+        <w:t>Thống kê và Báo cáo RDLC</w:t>
+      </w:r>
+    </w:p>
+    <w:p>
+      <w:pPr>
+        <w:pStyle w:val="Heading3"/>
+        <w:rPr>
+          <w:lang w:val="vi-VN"/>
+        </w:rPr>
+      </w:pPr>
+      <w:r>
+        <w:t>3.3.1</w:t>
+      </w:r>
+      <w:r>
+        <w:rPr>
+          <w:lang w:val="vi-VN"/>
+        </w:rPr>
+        <w:t>. Bảng điều khiển (Dashboard): Chụp ảnh biểu đồ LiveCharts.</w:t>
+      </w:r>
+    </w:p>
+    <w:p>
+      <w:pPr>
+        <w:pStyle w:val="Heading3"/>
+        <w:rPr>
+          <w:lang w:val="vi-VN"/>
+        </w:rPr>
+      </w:pPr>
+      <w:r>
+        <w:t>3.3.2</w:t>
+      </w:r>
+      <w:r>
+        <w:rPr>
+          <w:lang w:val="vi-VN"/>
+        </w:rPr>
+        <w:t>. Xuất in Phiếu Thu/Chi (RDLC): Chụp ảnh file PDF/mẫu in phiếu. Giải thích thuật toán đổi số tiền thành chữ.</w:t>
+      </w:r>
+    </w:p>
+    <w:p>
+      <w:pPr>
+        <w:pStyle w:val="Heading3"/>
+        <w:rPr>
+          <w:lang w:val="vi-VN"/>
+        </w:rPr>
+      </w:pPr>
+      <w:r>
+        <w:t>3.3.3</w:t>
+      </w:r>
+      <w:r>
+        <w:rPr>
+          <w:lang w:val="vi-VN"/>
+        </w:rPr>
+        <w:t>. Sổ quỹ tiền mặt:</w:t>
+      </w:r>
+    </w:p>
+    <w:p/>
+    <w:p>
+      <w:pPr>
+        <w:pStyle w:val="Heading1"/>
         <w:rPr>
           <w:lang w:val="en-US"/>
         </w:rPr>
-        <w:t>Ự</w:t>
-      </w:r>
-      <w:r>
-        <w:t>NG VÀ THIẾT KẾ</w:t>
+      </w:pPr>
+      <w:r>
+        <w:lastRenderedPageBreak/>
+        <w:t>CHƯƠNG</w:t>
+      </w:r>
+      <w:r>
+        <w:rPr>
+          <w:lang w:val="en-US"/>
+        </w:rPr>
+        <w:t xml:space="preserve"> </w:t>
+      </w:r>
+      <w:r>
+        <w:rPr>
+          <w:lang w:val="en-US"/>
+        </w:rPr>
+        <w:t>4</w:t>
+      </w:r>
+      <w:r>
+        <w:t>:</w:t>
+      </w:r>
+      <w:r>
+        <w:rPr>
+          <w:lang w:val="en-US"/>
+        </w:rPr>
+        <w:t xml:space="preserve"> </w:t>
+      </w:r>
+      <w:r>
+        <w:rPr>
+          <w:lang w:val="en-US"/>
+        </w:rPr>
+        <w:t xml:space="preserve">THỰC NGHIỆM VÀ </w:t>
+      </w:r>
+      <w:r>
+        <w:t>ĐÁNH GIÁ</w:t>
       </w:r>
     </w:p>
     <w:p>
@@ -3369,10 +4114,7 @@
         <w:pStyle w:val="Heading2"/>
       </w:pPr>
       <w:r>
-        <w:t xml:space="preserve">3.1 </w:t>
-      </w:r>
-      <w:r>
-        <w:t xml:space="preserve">Mô hình kiến trúc ứng dụng </w:t>
+        <w:t>5.1. Phân rã cấu trúc công việc (WBS)</w:t>
       </w:r>
     </w:p>
     <w:p>
@@ -3380,16 +4122,30 @@
         <w:pStyle w:val="Heading2"/>
       </w:pPr>
       <w:r>
-        <w:t>3.</w:t>
-      </w:r>
-      <w:r>
-        <w:t>2</w:t>
-      </w:r>
-      <w:r>
-        <w:t xml:space="preserve"> </w:t>
-      </w:r>
-      <w:r>
-        <w:t>Cơ sở dữ liệu</w:t>
+        <w:t>5.2. Quản lý mã nguồn với Git</w:t>
+      </w:r>
+    </w:p>
+    <w:p>
+      <w:pPr>
+        <w:pStyle w:val="Heading1"/>
+        <w:rPr>
+          <w:lang w:val="en-US"/>
+        </w:rPr>
+      </w:pPr>
+      <w:r>
+        <w:rPr>
+          <w:lang w:val="en-US"/>
+        </w:rPr>
+        <w:t xml:space="preserve">CHƯƠNG 5: </w:t>
+      </w:r>
+      <w:r>
+        <w:t>KẾT LUẬN</w:t>
+      </w:r>
+      <w:r>
+        <w:rPr>
+          <w:lang w:val="en-US"/>
+        </w:rPr>
+        <w:t xml:space="preserve"> VÀ ĐỊNH HƯỚNG PHÁT TRIỂN</w:t>
       </w:r>
     </w:p>
     <w:p>
@@ -3397,7 +4153,10 @@
         <w:pStyle w:val="Heading2"/>
       </w:pPr>
       <w:r>
-        <w:t>3.3 Thiết kế giao diện</w:t>
+        <w:t>5</w:t>
+      </w:r>
+      <w:r>
+        <w:t xml:space="preserve">.1. Kết quả đạt được: </w:t>
       </w:r>
     </w:p>
     <w:p>
@@ -3405,48 +4164,10 @@
         <w:pStyle w:val="Heading2"/>
       </w:pPr>
       <w:r>
-        <w:t>3.4. Kết nối cơ sở dữ liệu</w:t>
-      </w:r>
-    </w:p>
-    <w:p>
-      <w:pPr>
-        <w:pStyle w:val="Heading1"/>
-        <w:rPr>
-          <w:lang w:val="en-US"/>
-        </w:rPr>
-      </w:pPr>
-      <w:r>
-        <w:t>CHƯƠNG</w:t>
-      </w:r>
-      <w:r>
-        <w:rPr>
-          <w:lang w:val="en-US"/>
-        </w:rPr>
-        <w:t xml:space="preserve"> </w:t>
-      </w:r>
-      <w:r>
-        <w:rPr>
-          <w:lang w:val="en-US"/>
-        </w:rPr>
-        <w:t>4</w:t>
-      </w:r>
-      <w:r>
-        <w:t>:</w:t>
-      </w:r>
-      <w:r>
-        <w:rPr>
-          <w:lang w:val="en-US"/>
-        </w:rPr>
-        <w:t xml:space="preserve"> </w:t>
-      </w:r>
-      <w:r>
-        <w:rPr>
-          <w:lang w:val="en-US"/>
-        </w:rPr>
-        <w:t xml:space="preserve">THỰC NGHIỆM VÀ </w:t>
-      </w:r>
-      <w:r>
-        <w:t>ĐÁNH GIÁ</w:t>
+        <w:t>5</w:t>
+      </w:r>
+      <w:r>
+        <w:t xml:space="preserve">.2. Hạn chế </w:t>
       </w:r>
     </w:p>
     <w:p>
@@ -3454,78 +4175,10 @@
         <w:pStyle w:val="Heading2"/>
       </w:pPr>
       <w:r>
-        <w:t>4.1 Luồng hoạt động</w:t>
-      </w:r>
-    </w:p>
-    <w:p>
-      <w:pPr>
-        <w:pStyle w:val="Heading2"/>
-      </w:pPr>
-      <w:r>
-        <w:t>4.2 Giao diện Tổng Quan</w:t>
-      </w:r>
-    </w:p>
-    <w:p>
-      <w:pPr>
-        <w:pStyle w:val="Heading2"/>
-      </w:pPr>
-      <w:r>
-        <w:t>4.3. Giao diện Ngân Sách</w:t>
-      </w:r>
-    </w:p>
-    <w:p>
-      <w:pPr>
-        <w:pStyle w:val="Heading2"/>
-      </w:pPr>
-      <w:r>
-        <w:t>4.3. Giao diện Giao dịch</w:t>
-      </w:r>
-    </w:p>
-    <w:p>
-      <w:pPr>
-        <w:pStyle w:val="Heading2"/>
-      </w:pPr>
-      <w:r>
-        <w:t>4.4. Giao diện Danh Mục</w:t>
-      </w:r>
-    </w:p>
-    <w:p>
-      <w:pPr>
-        <w:pStyle w:val="Heading1"/>
-        <w:rPr>
-          <w:lang w:val="en-US"/>
-        </w:rPr>
-      </w:pPr>
-      <w:r>
-        <w:rPr>
-          <w:lang w:val="en-US"/>
-        </w:rPr>
-        <w:t xml:space="preserve">CHƯƠNG 5: </w:t>
-      </w:r>
-      <w:r>
-        <w:t>KẾT LUẬN</w:t>
-      </w:r>
-      <w:r>
-        <w:rPr>
-          <w:lang w:val="en-US"/>
-        </w:rPr>
-        <w:t xml:space="preserve"> VÀ ĐỊNH HƯỚNG PHÁT TRIỂN</w:t>
-      </w:r>
-    </w:p>
-    <w:p>
-      <w:pPr>
-        <w:pStyle w:val="Heading2"/>
-      </w:pPr>
-      <w:r>
-        <w:t>5.1. Kết luận</w:t>
-      </w:r>
-    </w:p>
-    <w:p>
-      <w:pPr>
-        <w:pStyle w:val="Heading2"/>
-      </w:pPr>
-      <w:r>
-        <w:t>5.2. Định hướng phát triển</w:t>
+        <w:t>5</w:t>
+      </w:r>
+      <w:r>
+        <w:t>.3. Định hướng phát triển</w:t>
       </w:r>
     </w:p>
     <w:p>
@@ -3764,6 +4417,304 @@
     </w:lvl>
   </w:abstractNum>
   <w:abstractNum w:abstractNumId="1" w15:restartNumberingAfterBreak="0">
+    <w:nsid w:val="04014CEC"/>
+    <w:multiLevelType w:val="multilevel"/>
+    <w:tmpl w:val="A420FAAE"/>
+    <w:lvl w:ilvl="0">
+      <w:start w:val="1"/>
+      <w:numFmt w:val="bullet"/>
+      <w:lvlText w:val=""/>
+      <w:lvlJc w:val="left"/>
+      <w:pPr>
+        <w:tabs>
+          <w:tab w:val="num" w:pos="720"/>
+        </w:tabs>
+        <w:ind w:left="720" w:hanging="360"/>
+      </w:pPr>
+      <w:rPr>
+        <w:rFonts w:ascii="Symbol" w:hAnsi="Symbol" w:hint="default"/>
+        <w:sz w:val="20"/>
+      </w:rPr>
+    </w:lvl>
+    <w:lvl w:ilvl="1" w:tentative="1">
+      <w:start w:val="1"/>
+      <w:numFmt w:val="bullet"/>
+      <w:lvlText w:val="o"/>
+      <w:lvlJc w:val="left"/>
+      <w:pPr>
+        <w:tabs>
+          <w:tab w:val="num" w:pos="1440"/>
+        </w:tabs>
+        <w:ind w:left="1440" w:hanging="360"/>
+      </w:pPr>
+      <w:rPr>
+        <w:rFonts w:ascii="Courier New" w:hAnsi="Courier New" w:hint="default"/>
+        <w:sz w:val="20"/>
+      </w:rPr>
+    </w:lvl>
+    <w:lvl w:ilvl="2" w:tentative="1">
+      <w:start w:val="1"/>
+      <w:numFmt w:val="bullet"/>
+      <w:lvlText w:val=""/>
+      <w:lvlJc w:val="left"/>
+      <w:pPr>
+        <w:tabs>
+          <w:tab w:val="num" w:pos="2160"/>
+        </w:tabs>
+        <w:ind w:left="2160" w:hanging="360"/>
+      </w:pPr>
+      <w:rPr>
+        <w:rFonts w:ascii="Wingdings" w:hAnsi="Wingdings" w:hint="default"/>
+        <w:sz w:val="20"/>
+      </w:rPr>
+    </w:lvl>
+    <w:lvl w:ilvl="3" w:tentative="1">
+      <w:start w:val="1"/>
+      <w:numFmt w:val="bullet"/>
+      <w:lvlText w:val=""/>
+      <w:lvlJc w:val="left"/>
+      <w:pPr>
+        <w:tabs>
+          <w:tab w:val="num" w:pos="2880"/>
+        </w:tabs>
+        <w:ind w:left="2880" w:hanging="360"/>
+      </w:pPr>
+      <w:rPr>
+        <w:rFonts w:ascii="Wingdings" w:hAnsi="Wingdings" w:hint="default"/>
+        <w:sz w:val="20"/>
+      </w:rPr>
+    </w:lvl>
+    <w:lvl w:ilvl="4" w:tentative="1">
+      <w:start w:val="1"/>
+      <w:numFmt w:val="bullet"/>
+      <w:lvlText w:val=""/>
+      <w:lvlJc w:val="left"/>
+      <w:pPr>
+        <w:tabs>
+          <w:tab w:val="num" w:pos="3600"/>
+        </w:tabs>
+        <w:ind w:left="3600" w:hanging="360"/>
+      </w:pPr>
+      <w:rPr>
+        <w:rFonts w:ascii="Wingdings" w:hAnsi="Wingdings" w:hint="default"/>
+        <w:sz w:val="20"/>
+      </w:rPr>
+    </w:lvl>
+    <w:lvl w:ilvl="5" w:tentative="1">
+      <w:start w:val="1"/>
+      <w:numFmt w:val="bullet"/>
+      <w:lvlText w:val=""/>
+      <w:lvlJc w:val="left"/>
+      <w:pPr>
+        <w:tabs>
+          <w:tab w:val="num" w:pos="4320"/>
+        </w:tabs>
+        <w:ind w:left="4320" w:hanging="360"/>
+      </w:pPr>
+      <w:rPr>
+        <w:rFonts w:ascii="Wingdings" w:hAnsi="Wingdings" w:hint="default"/>
+        <w:sz w:val="20"/>
+      </w:rPr>
+    </w:lvl>
+    <w:lvl w:ilvl="6" w:tentative="1">
+      <w:start w:val="1"/>
+      <w:numFmt w:val="bullet"/>
+      <w:lvlText w:val=""/>
+      <w:lvlJc w:val="left"/>
+      <w:pPr>
+        <w:tabs>
+          <w:tab w:val="num" w:pos="5040"/>
+        </w:tabs>
+        <w:ind w:left="5040" w:hanging="360"/>
+      </w:pPr>
+      <w:rPr>
+        <w:rFonts w:ascii="Wingdings" w:hAnsi="Wingdings" w:hint="default"/>
+        <w:sz w:val="20"/>
+      </w:rPr>
+    </w:lvl>
+    <w:lvl w:ilvl="7" w:tentative="1">
+      <w:start w:val="1"/>
+      <w:numFmt w:val="bullet"/>
+      <w:lvlText w:val=""/>
+      <w:lvlJc w:val="left"/>
+      <w:pPr>
+        <w:tabs>
+          <w:tab w:val="num" w:pos="5760"/>
+        </w:tabs>
+        <w:ind w:left="5760" w:hanging="360"/>
+      </w:pPr>
+      <w:rPr>
+        <w:rFonts w:ascii="Wingdings" w:hAnsi="Wingdings" w:hint="default"/>
+        <w:sz w:val="20"/>
+      </w:rPr>
+    </w:lvl>
+    <w:lvl w:ilvl="8" w:tentative="1">
+      <w:start w:val="1"/>
+      <w:numFmt w:val="bullet"/>
+      <w:lvlText w:val=""/>
+      <w:lvlJc w:val="left"/>
+      <w:pPr>
+        <w:tabs>
+          <w:tab w:val="num" w:pos="6480"/>
+        </w:tabs>
+        <w:ind w:left="6480" w:hanging="360"/>
+      </w:pPr>
+      <w:rPr>
+        <w:rFonts w:ascii="Wingdings" w:hAnsi="Wingdings" w:hint="default"/>
+        <w:sz w:val="20"/>
+      </w:rPr>
+    </w:lvl>
+  </w:abstractNum>
+  <w:abstractNum w:abstractNumId="2" w15:restartNumberingAfterBreak="0">
+    <w:nsid w:val="104132EC"/>
+    <w:multiLevelType w:val="multilevel"/>
+    <w:tmpl w:val="A4F6079C"/>
+    <w:lvl w:ilvl="0">
+      <w:start w:val="1"/>
+      <w:numFmt w:val="bullet"/>
+      <w:lvlText w:val=""/>
+      <w:lvlJc w:val="left"/>
+      <w:pPr>
+        <w:tabs>
+          <w:tab w:val="num" w:pos="720"/>
+        </w:tabs>
+        <w:ind w:left="720" w:hanging="360"/>
+      </w:pPr>
+      <w:rPr>
+        <w:rFonts w:ascii="Symbol" w:hAnsi="Symbol" w:hint="default"/>
+        <w:sz w:val="20"/>
+      </w:rPr>
+    </w:lvl>
+    <w:lvl w:ilvl="1">
+      <w:start w:val="1"/>
+      <w:numFmt w:val="bullet"/>
+      <w:lvlText w:val="o"/>
+      <w:lvlJc w:val="left"/>
+      <w:pPr>
+        <w:tabs>
+          <w:tab w:val="num" w:pos="1440"/>
+        </w:tabs>
+        <w:ind w:left="1440" w:hanging="360"/>
+      </w:pPr>
+      <w:rPr>
+        <w:rFonts w:ascii="Courier New" w:hAnsi="Courier New" w:hint="default"/>
+        <w:sz w:val="20"/>
+      </w:rPr>
+    </w:lvl>
+    <w:lvl w:ilvl="2" w:tentative="1">
+      <w:start w:val="1"/>
+      <w:numFmt w:val="bullet"/>
+      <w:lvlText w:val=""/>
+      <w:lvlJc w:val="left"/>
+      <w:pPr>
+        <w:tabs>
+          <w:tab w:val="num" w:pos="2160"/>
+        </w:tabs>
+        <w:ind w:left="2160" w:hanging="360"/>
+      </w:pPr>
+      <w:rPr>
+        <w:rFonts w:ascii="Wingdings" w:hAnsi="Wingdings" w:hint="default"/>
+        <w:sz w:val="20"/>
+      </w:rPr>
+    </w:lvl>
+    <w:lvl w:ilvl="3" w:tentative="1">
+      <w:start w:val="1"/>
+      <w:numFmt w:val="bullet"/>
+      <w:lvlText w:val=""/>
+      <w:lvlJc w:val="left"/>
+      <w:pPr>
+        <w:tabs>
+          <w:tab w:val="num" w:pos="2880"/>
+        </w:tabs>
+        <w:ind w:left="2880" w:hanging="360"/>
+      </w:pPr>
+      <w:rPr>
+        <w:rFonts w:ascii="Wingdings" w:hAnsi="Wingdings" w:hint="default"/>
+        <w:sz w:val="20"/>
+      </w:rPr>
+    </w:lvl>
+    <w:lvl w:ilvl="4" w:tentative="1">
+      <w:start w:val="1"/>
+      <w:numFmt w:val="bullet"/>
+      <w:lvlText w:val=""/>
+      <w:lvlJc w:val="left"/>
+      <w:pPr>
+        <w:tabs>
+          <w:tab w:val="num" w:pos="3600"/>
+        </w:tabs>
+        <w:ind w:left="3600" w:hanging="360"/>
+      </w:pPr>
+      <w:rPr>
+        <w:rFonts w:ascii="Wingdings" w:hAnsi="Wingdings" w:hint="default"/>
+        <w:sz w:val="20"/>
+      </w:rPr>
+    </w:lvl>
+    <w:lvl w:ilvl="5" w:tentative="1">
+      <w:start w:val="1"/>
+      <w:numFmt w:val="bullet"/>
+      <w:lvlText w:val=""/>
+      <w:lvlJc w:val="left"/>
+      <w:pPr>
+        <w:tabs>
+          <w:tab w:val="num" w:pos="4320"/>
+        </w:tabs>
+        <w:ind w:left="4320" w:hanging="360"/>
+      </w:pPr>
+      <w:rPr>
+        <w:rFonts w:ascii="Wingdings" w:hAnsi="Wingdings" w:hint="default"/>
+        <w:sz w:val="20"/>
+      </w:rPr>
+    </w:lvl>
+    <w:lvl w:ilvl="6" w:tentative="1">
+      <w:start w:val="1"/>
+      <w:numFmt w:val="bullet"/>
+      <w:lvlText w:val=""/>
+      <w:lvlJc w:val="left"/>
+      <w:pPr>
+        <w:tabs>
+          <w:tab w:val="num" w:pos="5040"/>
+        </w:tabs>
+        <w:ind w:left="5040" w:hanging="360"/>
+      </w:pPr>
+      <w:rPr>
+        <w:rFonts w:ascii="Wingdings" w:hAnsi="Wingdings" w:hint="default"/>
+        <w:sz w:val="20"/>
+      </w:rPr>
+    </w:lvl>
+    <w:lvl w:ilvl="7" w:tentative="1">
+      <w:start w:val="1"/>
+      <w:numFmt w:val="bullet"/>
+      <w:lvlText w:val=""/>
+      <w:lvlJc w:val="left"/>
+      <w:pPr>
+        <w:tabs>
+          <w:tab w:val="num" w:pos="5760"/>
+        </w:tabs>
+        <w:ind w:left="5760" w:hanging="360"/>
+      </w:pPr>
+      <w:rPr>
+        <w:rFonts w:ascii="Wingdings" w:hAnsi="Wingdings" w:hint="default"/>
+        <w:sz w:val="20"/>
+      </w:rPr>
+    </w:lvl>
+    <w:lvl w:ilvl="8" w:tentative="1">
+      <w:start w:val="1"/>
+      <w:numFmt w:val="bullet"/>
+      <w:lvlText w:val=""/>
+      <w:lvlJc w:val="left"/>
+      <w:pPr>
+        <w:tabs>
+          <w:tab w:val="num" w:pos="6480"/>
+        </w:tabs>
+        <w:ind w:left="6480" w:hanging="360"/>
+      </w:pPr>
+      <w:rPr>
+        <w:rFonts w:ascii="Wingdings" w:hAnsi="Wingdings" w:hint="default"/>
+        <w:sz w:val="20"/>
+      </w:rPr>
+    </w:lvl>
+  </w:abstractNum>
+  <w:abstractNum w:abstractNumId="3" w15:restartNumberingAfterBreak="0">
     <w:nsid w:val="13C93ADE"/>
     <w:multiLevelType w:val="multilevel"/>
     <w:tmpl w:val="24622DB6"/>
@@ -3912,7 +4863,7 @@
       </w:rPr>
     </w:lvl>
   </w:abstractNum>
-  <w:abstractNum w:abstractNumId="2" w15:restartNumberingAfterBreak="0">
+  <w:abstractNum w:abstractNumId="4" w15:restartNumberingAfterBreak="0">
     <w:nsid w:val="1A3172FF"/>
     <w:multiLevelType w:val="multilevel"/>
     <w:tmpl w:val="C04804D2"/>
@@ -4061,7 +5012,7 @@
       </w:rPr>
     </w:lvl>
   </w:abstractNum>
-  <w:abstractNum w:abstractNumId="3" w15:restartNumberingAfterBreak="0">
+  <w:abstractNum w:abstractNumId="5" w15:restartNumberingAfterBreak="0">
     <w:nsid w:val="1E70791A"/>
     <w:multiLevelType w:val="multilevel"/>
     <w:tmpl w:val="78A829C2"/>
@@ -4210,7 +5161,7 @@
       </w:rPr>
     </w:lvl>
   </w:abstractNum>
-  <w:abstractNum w:abstractNumId="4" w15:restartNumberingAfterBreak="0">
+  <w:abstractNum w:abstractNumId="6" w15:restartNumberingAfterBreak="0">
     <w:nsid w:val="2C2D74B8"/>
     <w:multiLevelType w:val="multilevel"/>
     <w:tmpl w:val="6F3A821E"/>
@@ -4355,7 +5306,7 @@
       </w:rPr>
     </w:lvl>
   </w:abstractNum>
-  <w:abstractNum w:abstractNumId="5" w15:restartNumberingAfterBreak="0">
+  <w:abstractNum w:abstractNumId="7" w15:restartNumberingAfterBreak="0">
     <w:nsid w:val="2D7171A7"/>
     <w:multiLevelType w:val="multilevel"/>
     <w:tmpl w:val="B3DA3BA2"/>
@@ -4504,7 +5455,156 @@
       </w:rPr>
     </w:lvl>
   </w:abstractNum>
-  <w:abstractNum w:abstractNumId="6" w15:restartNumberingAfterBreak="0">
+  <w:abstractNum w:abstractNumId="8" w15:restartNumberingAfterBreak="0">
+    <w:nsid w:val="33532ADD"/>
+    <w:multiLevelType w:val="multilevel"/>
+    <w:tmpl w:val="2138A694"/>
+    <w:lvl w:ilvl="0">
+      <w:start w:val="1"/>
+      <w:numFmt w:val="bullet"/>
+      <w:lvlText w:val=""/>
+      <w:lvlJc w:val="left"/>
+      <w:pPr>
+        <w:tabs>
+          <w:tab w:val="num" w:pos="720"/>
+        </w:tabs>
+        <w:ind w:left="720" w:hanging="360"/>
+      </w:pPr>
+      <w:rPr>
+        <w:rFonts w:ascii="Symbol" w:hAnsi="Symbol" w:hint="default"/>
+        <w:sz w:val="20"/>
+      </w:rPr>
+    </w:lvl>
+    <w:lvl w:ilvl="1" w:tentative="1">
+      <w:start w:val="1"/>
+      <w:numFmt w:val="bullet"/>
+      <w:lvlText w:val="o"/>
+      <w:lvlJc w:val="left"/>
+      <w:pPr>
+        <w:tabs>
+          <w:tab w:val="num" w:pos="1440"/>
+        </w:tabs>
+        <w:ind w:left="1440" w:hanging="360"/>
+      </w:pPr>
+      <w:rPr>
+        <w:rFonts w:ascii="Courier New" w:hAnsi="Courier New" w:hint="default"/>
+        <w:sz w:val="20"/>
+      </w:rPr>
+    </w:lvl>
+    <w:lvl w:ilvl="2" w:tentative="1">
+      <w:start w:val="1"/>
+      <w:numFmt w:val="bullet"/>
+      <w:lvlText w:val=""/>
+      <w:lvlJc w:val="left"/>
+      <w:pPr>
+        <w:tabs>
+          <w:tab w:val="num" w:pos="2160"/>
+        </w:tabs>
+        <w:ind w:left="2160" w:hanging="360"/>
+      </w:pPr>
+      <w:rPr>
+        <w:rFonts w:ascii="Wingdings" w:hAnsi="Wingdings" w:hint="default"/>
+        <w:sz w:val="20"/>
+      </w:rPr>
+    </w:lvl>
+    <w:lvl w:ilvl="3" w:tentative="1">
+      <w:start w:val="1"/>
+      <w:numFmt w:val="bullet"/>
+      <w:lvlText w:val=""/>
+      <w:lvlJc w:val="left"/>
+      <w:pPr>
+        <w:tabs>
+          <w:tab w:val="num" w:pos="2880"/>
+        </w:tabs>
+        <w:ind w:left="2880" w:hanging="360"/>
+      </w:pPr>
+      <w:rPr>
+        <w:rFonts w:ascii="Wingdings" w:hAnsi="Wingdings" w:hint="default"/>
+        <w:sz w:val="20"/>
+      </w:rPr>
+    </w:lvl>
+    <w:lvl w:ilvl="4" w:tentative="1">
+      <w:start w:val="1"/>
+      <w:numFmt w:val="bullet"/>
+      <w:lvlText w:val=""/>
+      <w:lvlJc w:val="left"/>
+      <w:pPr>
+        <w:tabs>
+          <w:tab w:val="num" w:pos="3600"/>
+        </w:tabs>
+        <w:ind w:left="3600" w:hanging="360"/>
+      </w:pPr>
+      <w:rPr>
+        <w:rFonts w:ascii="Wingdings" w:hAnsi="Wingdings" w:hint="default"/>
+        <w:sz w:val="20"/>
+      </w:rPr>
+    </w:lvl>
+    <w:lvl w:ilvl="5" w:tentative="1">
+      <w:start w:val="1"/>
+      <w:numFmt w:val="bullet"/>
+      <w:lvlText w:val=""/>
+      <w:lvlJc w:val="left"/>
+      <w:pPr>
+        <w:tabs>
+          <w:tab w:val="num" w:pos="4320"/>
+        </w:tabs>
+        <w:ind w:left="4320" w:hanging="360"/>
+      </w:pPr>
+      <w:rPr>
+        <w:rFonts w:ascii="Wingdings" w:hAnsi="Wingdings" w:hint="default"/>
+        <w:sz w:val="20"/>
+      </w:rPr>
+    </w:lvl>
+    <w:lvl w:ilvl="6" w:tentative="1">
+      <w:start w:val="1"/>
+      <w:numFmt w:val="bullet"/>
+      <w:lvlText w:val=""/>
+      <w:lvlJc w:val="left"/>
+      <w:pPr>
+        <w:tabs>
+          <w:tab w:val="num" w:pos="5040"/>
+        </w:tabs>
+        <w:ind w:left="5040" w:hanging="360"/>
+      </w:pPr>
+      <w:rPr>
+        <w:rFonts w:ascii="Wingdings" w:hAnsi="Wingdings" w:hint="default"/>
+        <w:sz w:val="20"/>
+      </w:rPr>
+    </w:lvl>
+    <w:lvl w:ilvl="7" w:tentative="1">
+      <w:start w:val="1"/>
+      <w:numFmt w:val="bullet"/>
+      <w:lvlText w:val=""/>
+      <w:lvlJc w:val="left"/>
+      <w:pPr>
+        <w:tabs>
+          <w:tab w:val="num" w:pos="5760"/>
+        </w:tabs>
+        <w:ind w:left="5760" w:hanging="360"/>
+      </w:pPr>
+      <w:rPr>
+        <w:rFonts w:ascii="Wingdings" w:hAnsi="Wingdings" w:hint="default"/>
+        <w:sz w:val="20"/>
+      </w:rPr>
+    </w:lvl>
+    <w:lvl w:ilvl="8" w:tentative="1">
+      <w:start w:val="1"/>
+      <w:numFmt w:val="bullet"/>
+      <w:lvlText w:val=""/>
+      <w:lvlJc w:val="left"/>
+      <w:pPr>
+        <w:tabs>
+          <w:tab w:val="num" w:pos="6480"/>
+        </w:tabs>
+        <w:ind w:left="6480" w:hanging="360"/>
+      </w:pPr>
+      <w:rPr>
+        <w:rFonts w:ascii="Wingdings" w:hAnsi="Wingdings" w:hint="default"/>
+        <w:sz w:val="20"/>
+      </w:rPr>
+    </w:lvl>
+  </w:abstractNum>
+  <w:abstractNum w:abstractNumId="9" w15:restartNumberingAfterBreak="0">
     <w:nsid w:val="36882BF9"/>
     <w:multiLevelType w:val="multilevel"/>
     <w:tmpl w:val="566CD2C4"/>
@@ -4653,7 +5753,7 @@
       </w:rPr>
     </w:lvl>
   </w:abstractNum>
-  <w:abstractNum w:abstractNumId="7" w15:restartNumberingAfterBreak="0">
+  <w:abstractNum w:abstractNumId="10" w15:restartNumberingAfterBreak="0">
     <w:nsid w:val="424D54B6"/>
     <w:multiLevelType w:val="hybridMultilevel"/>
     <w:tmpl w:val="2DAEDAC0"/>
@@ -4767,7 +5867,156 @@
       </w:rPr>
     </w:lvl>
   </w:abstractNum>
-  <w:abstractNum w:abstractNumId="8" w15:restartNumberingAfterBreak="0">
+  <w:abstractNum w:abstractNumId="11" w15:restartNumberingAfterBreak="0">
+    <w:nsid w:val="4F9976C1"/>
+    <w:multiLevelType w:val="multilevel"/>
+    <w:tmpl w:val="4052FAE8"/>
+    <w:lvl w:ilvl="0">
+      <w:start w:val="1"/>
+      <w:numFmt w:val="bullet"/>
+      <w:lvlText w:val=""/>
+      <w:lvlJc w:val="left"/>
+      <w:pPr>
+        <w:tabs>
+          <w:tab w:val="num" w:pos="720"/>
+        </w:tabs>
+        <w:ind w:left="720" w:hanging="360"/>
+      </w:pPr>
+      <w:rPr>
+        <w:rFonts w:ascii="Symbol" w:hAnsi="Symbol" w:hint="default"/>
+        <w:sz w:val="20"/>
+      </w:rPr>
+    </w:lvl>
+    <w:lvl w:ilvl="1" w:tentative="1">
+      <w:start w:val="1"/>
+      <w:numFmt w:val="bullet"/>
+      <w:lvlText w:val="o"/>
+      <w:lvlJc w:val="left"/>
+      <w:pPr>
+        <w:tabs>
+          <w:tab w:val="num" w:pos="1440"/>
+        </w:tabs>
+        <w:ind w:left="1440" w:hanging="360"/>
+      </w:pPr>
+      <w:rPr>
+        <w:rFonts w:ascii="Courier New" w:hAnsi="Courier New" w:hint="default"/>
+        <w:sz w:val="20"/>
+      </w:rPr>
+    </w:lvl>
+    <w:lvl w:ilvl="2" w:tentative="1">
+      <w:start w:val="1"/>
+      <w:numFmt w:val="bullet"/>
+      <w:lvlText w:val=""/>
+      <w:lvlJc w:val="left"/>
+      <w:pPr>
+        <w:tabs>
+          <w:tab w:val="num" w:pos="2160"/>
+        </w:tabs>
+        <w:ind w:left="2160" w:hanging="360"/>
+      </w:pPr>
+      <w:rPr>
+        <w:rFonts w:ascii="Wingdings" w:hAnsi="Wingdings" w:hint="default"/>
+        <w:sz w:val="20"/>
+      </w:rPr>
+    </w:lvl>
+    <w:lvl w:ilvl="3" w:tentative="1">
+      <w:start w:val="1"/>
+      <w:numFmt w:val="bullet"/>
+      <w:lvlText w:val=""/>
+      <w:lvlJc w:val="left"/>
+      <w:pPr>
+        <w:tabs>
+          <w:tab w:val="num" w:pos="2880"/>
+        </w:tabs>
+        <w:ind w:left="2880" w:hanging="360"/>
+      </w:pPr>
+      <w:rPr>
+        <w:rFonts w:ascii="Wingdings" w:hAnsi="Wingdings" w:hint="default"/>
+        <w:sz w:val="20"/>
+      </w:rPr>
+    </w:lvl>
+    <w:lvl w:ilvl="4" w:tentative="1">
+      <w:start w:val="1"/>
+      <w:numFmt w:val="bullet"/>
+      <w:lvlText w:val=""/>
+      <w:lvlJc w:val="left"/>
+      <w:pPr>
+        <w:tabs>
+          <w:tab w:val="num" w:pos="3600"/>
+        </w:tabs>
+        <w:ind w:left="3600" w:hanging="360"/>
+      </w:pPr>
+      <w:rPr>
+        <w:rFonts w:ascii="Wingdings" w:hAnsi="Wingdings" w:hint="default"/>
+        <w:sz w:val="20"/>
+      </w:rPr>
+    </w:lvl>
+    <w:lvl w:ilvl="5" w:tentative="1">
+      <w:start w:val="1"/>
+      <w:numFmt w:val="bullet"/>
+      <w:lvlText w:val=""/>
+      <w:lvlJc w:val="left"/>
+      <w:pPr>
+        <w:tabs>
+          <w:tab w:val="num" w:pos="4320"/>
+        </w:tabs>
+        <w:ind w:left="4320" w:hanging="360"/>
+      </w:pPr>
+      <w:rPr>
+        <w:rFonts w:ascii="Wingdings" w:hAnsi="Wingdings" w:hint="default"/>
+        <w:sz w:val="20"/>
+      </w:rPr>
+    </w:lvl>
+    <w:lvl w:ilvl="6" w:tentative="1">
+      <w:start w:val="1"/>
+      <w:numFmt w:val="bullet"/>
+      <w:lvlText w:val=""/>
+      <w:lvlJc w:val="left"/>
+      <w:pPr>
+        <w:tabs>
+          <w:tab w:val="num" w:pos="5040"/>
+        </w:tabs>
+        <w:ind w:left="5040" w:hanging="360"/>
+      </w:pPr>
+      <w:rPr>
+        <w:rFonts w:ascii="Wingdings" w:hAnsi="Wingdings" w:hint="default"/>
+        <w:sz w:val="20"/>
+      </w:rPr>
+    </w:lvl>
+    <w:lvl w:ilvl="7" w:tentative="1">
+      <w:start w:val="1"/>
+      <w:numFmt w:val="bullet"/>
+      <w:lvlText w:val=""/>
+      <w:lvlJc w:val="left"/>
+      <w:pPr>
+        <w:tabs>
+          <w:tab w:val="num" w:pos="5760"/>
+        </w:tabs>
+        <w:ind w:left="5760" w:hanging="360"/>
+      </w:pPr>
+      <w:rPr>
+        <w:rFonts w:ascii="Wingdings" w:hAnsi="Wingdings" w:hint="default"/>
+        <w:sz w:val="20"/>
+      </w:rPr>
+    </w:lvl>
+    <w:lvl w:ilvl="8" w:tentative="1">
+      <w:start w:val="1"/>
+      <w:numFmt w:val="bullet"/>
+      <w:lvlText w:val=""/>
+      <w:lvlJc w:val="left"/>
+      <w:pPr>
+        <w:tabs>
+          <w:tab w:val="num" w:pos="6480"/>
+        </w:tabs>
+        <w:ind w:left="6480" w:hanging="360"/>
+      </w:pPr>
+      <w:rPr>
+        <w:rFonts w:ascii="Wingdings" w:hAnsi="Wingdings" w:hint="default"/>
+        <w:sz w:val="20"/>
+      </w:rPr>
+    </w:lvl>
+  </w:abstractNum>
+  <w:abstractNum w:abstractNumId="12" w15:restartNumberingAfterBreak="0">
     <w:nsid w:val="5354769E"/>
     <w:multiLevelType w:val="hybridMultilevel"/>
     <w:tmpl w:val="28D4C25E"/>
@@ -4880,7 +6129,7 @@
       </w:rPr>
     </w:lvl>
   </w:abstractNum>
-  <w:abstractNum w:abstractNumId="9" w15:restartNumberingAfterBreak="0">
+  <w:abstractNum w:abstractNumId="13" w15:restartNumberingAfterBreak="0">
     <w:nsid w:val="53762CCB"/>
     <w:multiLevelType w:val="hybridMultilevel"/>
     <w:tmpl w:val="DE446A1A"/>
@@ -4994,7 +6243,7 @@
       </w:rPr>
     </w:lvl>
   </w:abstractNum>
-  <w:abstractNum w:abstractNumId="10" w15:restartNumberingAfterBreak="0">
+  <w:abstractNum w:abstractNumId="14" w15:restartNumberingAfterBreak="0">
     <w:nsid w:val="53E00C2A"/>
     <w:multiLevelType w:val="multilevel"/>
     <w:tmpl w:val="AA4E0332"/>
@@ -5143,7 +6392,7 @@
       </w:rPr>
     </w:lvl>
   </w:abstractNum>
-  <w:abstractNum w:abstractNumId="11" w15:restartNumberingAfterBreak="0">
+  <w:abstractNum w:abstractNumId="15" w15:restartNumberingAfterBreak="0">
     <w:nsid w:val="74900DDA"/>
     <w:multiLevelType w:val="hybridMultilevel"/>
     <w:tmpl w:val="453EBD3A"/>
@@ -5229,7 +6478,7 @@
       </w:pPr>
     </w:lvl>
   </w:abstractNum>
-  <w:abstractNum w:abstractNumId="12" w15:restartNumberingAfterBreak="0">
+  <w:abstractNum w:abstractNumId="16" w15:restartNumberingAfterBreak="0">
     <w:nsid w:val="796314E2"/>
     <w:multiLevelType w:val="hybridMultilevel"/>
     <w:tmpl w:val="026E7F3E"/>
@@ -5343,7 +6592,7 @@
       </w:rPr>
     </w:lvl>
   </w:abstractNum>
-  <w:abstractNum w:abstractNumId="13" w15:restartNumberingAfterBreak="0">
+  <w:abstractNum w:abstractNumId="17" w15:restartNumberingAfterBreak="0">
     <w:nsid w:val="7E07247E"/>
     <w:multiLevelType w:val="hybridMultilevel"/>
     <w:tmpl w:val="1EDAEEB8"/>
@@ -5457,7 +6706,7 @@
       </w:rPr>
     </w:lvl>
   </w:abstractNum>
-  <w:abstractNum w:abstractNumId="14" w15:restartNumberingAfterBreak="0">
+  <w:abstractNum w:abstractNumId="18" w15:restartNumberingAfterBreak="0">
     <w:nsid w:val="7EB405F8"/>
     <w:multiLevelType w:val="hybridMultilevel"/>
     <w:tmpl w:val="244E4D28"/>
@@ -5571,7 +6820,7 @@
       </w:rPr>
     </w:lvl>
   </w:abstractNum>
-  <w:abstractNum w:abstractNumId="15" w15:restartNumberingAfterBreak="0">
+  <w:abstractNum w:abstractNumId="19" w15:restartNumberingAfterBreak="0">
     <w:nsid w:val="7FA002B9"/>
     <w:multiLevelType w:val="multilevel"/>
     <w:tmpl w:val="515EE1DE"/>
@@ -5721,52 +6970,64 @@
     </w:lvl>
   </w:abstractNum>
   <w:num w:numId="1" w16cid:durableId="1933321130">
-    <w:abstractNumId w:val="11"/>
+    <w:abstractNumId w:val="15"/>
   </w:num>
   <w:num w:numId="2" w16cid:durableId="1674337789">
     <w:abstractNumId w:val="0"/>
   </w:num>
   <w:num w:numId="3" w16cid:durableId="336153550">
-    <w:abstractNumId w:val="8"/>
+    <w:abstractNumId w:val="12"/>
   </w:num>
   <w:num w:numId="4" w16cid:durableId="1942294008">
+    <w:abstractNumId w:val="3"/>
+  </w:num>
+  <w:num w:numId="5" w16cid:durableId="1584878620">
+    <w:abstractNumId w:val="6"/>
+  </w:num>
+  <w:num w:numId="6" w16cid:durableId="1084499910">
+    <w:abstractNumId w:val="5"/>
+  </w:num>
+  <w:num w:numId="7" w16cid:durableId="1652249041">
+    <w:abstractNumId w:val="19"/>
+  </w:num>
+  <w:num w:numId="8" w16cid:durableId="2023505597">
+    <w:abstractNumId w:val="14"/>
+  </w:num>
+  <w:num w:numId="9" w16cid:durableId="863441985">
+    <w:abstractNumId w:val="10"/>
+  </w:num>
+  <w:num w:numId="10" w16cid:durableId="591210238">
+    <w:abstractNumId w:val="17"/>
+  </w:num>
+  <w:num w:numId="11" w16cid:durableId="582689003">
+    <w:abstractNumId w:val="4"/>
+  </w:num>
+  <w:num w:numId="12" w16cid:durableId="383145544">
+    <w:abstractNumId w:val="13"/>
+  </w:num>
+  <w:num w:numId="13" w16cid:durableId="856194340">
+    <w:abstractNumId w:val="18"/>
+  </w:num>
+  <w:num w:numId="14" w16cid:durableId="1159422852">
+    <w:abstractNumId w:val="16"/>
+  </w:num>
+  <w:num w:numId="15" w16cid:durableId="397478872">
+    <w:abstractNumId w:val="7"/>
+  </w:num>
+  <w:num w:numId="16" w16cid:durableId="699402889">
+    <w:abstractNumId w:val="9"/>
+  </w:num>
+  <w:num w:numId="17" w16cid:durableId="876817610">
+    <w:abstractNumId w:val="2"/>
+  </w:num>
+  <w:num w:numId="18" w16cid:durableId="1373462324">
     <w:abstractNumId w:val="1"/>
   </w:num>
-  <w:num w:numId="5" w16cid:durableId="1584878620">
-    <w:abstractNumId w:val="4"/>
+  <w:num w:numId="19" w16cid:durableId="823812994">
+    <w:abstractNumId w:val="11"/>
   </w:num>
-  <w:num w:numId="6" w16cid:durableId="1084499910">
-    <w:abstractNumId w:val="3"/>
-  </w:num>
-  <w:num w:numId="7" w16cid:durableId="1652249041">
-    <w:abstractNumId w:val="15"/>
-  </w:num>
-  <w:num w:numId="8" w16cid:durableId="2023505597">
-    <w:abstractNumId w:val="10"/>
-  </w:num>
-  <w:num w:numId="9" w16cid:durableId="863441985">
-    <w:abstractNumId w:val="7"/>
-  </w:num>
-  <w:num w:numId="10" w16cid:durableId="591210238">
-    <w:abstractNumId w:val="13"/>
-  </w:num>
-  <w:num w:numId="11" w16cid:durableId="582689003">
-    <w:abstractNumId w:val="2"/>
-  </w:num>
-  <w:num w:numId="12" w16cid:durableId="383145544">
-    <w:abstractNumId w:val="9"/>
-  </w:num>
-  <w:num w:numId="13" w16cid:durableId="856194340">
-    <w:abstractNumId w:val="14"/>
-  </w:num>
-  <w:num w:numId="14" w16cid:durableId="1159422852">
-    <w:abstractNumId w:val="12"/>
-  </w:num>
-  <w:num w:numId="15" w16cid:durableId="397478872">
-    <w:abstractNumId w:val="5"/>
-  </w:num>
-  <w:num w:numId="16" w16cid:durableId="699402889">
-    <w:abstractNumId w:val="6"/>
+  <w:num w:numId="20" w16cid:durableId="2056346465">
+    <w:abstractNumId w:val="8"/>
   </w:num>
 </w:numbering>
 </file>
@@ -6220,7 +7481,7 @@
     <w:uiPriority w:val="9"/>
     <w:unhideWhenUsed/>
     <w:qFormat/>
-    <w:rsid w:val="00296F78"/>
+    <w:rsid w:val="00FA356A"/>
     <w:pPr>
       <w:keepNext/>
       <w:keepLines/>
@@ -6243,7 +7504,7 @@
     <w:uiPriority w:val="9"/>
     <w:unhideWhenUsed/>
     <w:qFormat/>
-    <w:rsid w:val="001D48F8"/>
+    <w:rsid w:val="00FA356A"/>
     <w:pPr>
       <w:keepNext/>
       <w:keepLines/>
@@ -6433,7 +7694,7 @@
     <w:basedOn w:val="DefaultParagraphFont"/>
     <w:link w:val="Heading2"/>
     <w:uiPriority w:val="9"/>
-    <w:rsid w:val="00296F78"/>
+    <w:rsid w:val="00FA356A"/>
     <w:rPr>
       <w:rFonts w:asciiTheme="majorHAnsi" w:eastAsiaTheme="majorEastAsia" w:hAnsiTheme="majorHAnsi" w:cstheme="majorBidi"/>
       <w:b/>
@@ -6449,7 +7710,7 @@
     <w:basedOn w:val="DefaultParagraphFont"/>
     <w:link w:val="Heading3"/>
     <w:uiPriority w:val="9"/>
-    <w:rsid w:val="001D48F8"/>
+    <w:rsid w:val="00FA356A"/>
     <w:rPr>
       <w:rFonts w:ascii="Times New Roman" w:eastAsiaTheme="majorEastAsia" w:hAnsi="Times New Roman" w:cstheme="majorBidi"/>
       <w:b/>
@@ -6955,6 +8216,17 @@
     <w:basedOn w:val="DefaultParagraphFont"/>
     <w:rsid w:val="00C01286"/>
   </w:style>
+  <w:style w:type="character" w:styleId="Emphasis">
+    <w:name w:val="Emphasis"/>
+    <w:basedOn w:val="DefaultParagraphFont"/>
+    <w:uiPriority w:val="20"/>
+    <w:qFormat/>
+    <w:rsid w:val="00FA356A"/>
+    <w:rPr>
+      <w:i/>
+      <w:iCs/>
+    </w:rPr>
+  </w:style>
 </w:styles>
 </file>
 

</xml_diff>